<commit_message>
Updating the documentation and minor fix on the outputs.
</commit_message>
<xml_diff>
--- a/inst/extdata/ReadMe_Batch.docx
+++ b/inst/extdata/ReadMe_Batch.docx
@@ -36,7 +36,7 @@
     <w:p>
       <w:r>
         <w:pict w14:anchorId="70581217">
-          <v:rect id="_x0000_i1037" style="width:0;height:1.5pt" o:hralign="center" o:hrstd="t" o:hr="t" fillcolor="#a0a0a0" stroked="f"/>
+          <v:rect id="_x0000_i1025" style="width:0;height:1.5pt" o:hralign="center" o:hrstd="t" o:hr="t" fillcolor="#a0a0a0" stroked="f"/>
         </w:pict>
       </w:r>
     </w:p>
@@ -100,7 +100,6 @@
           <w:numId w:val="5"/>
         </w:numPr>
       </w:pPr>
-      <w:proofErr w:type="spellStart"/>
       <w:r>
         <w:rPr>
           <w:b/>
@@ -108,7 +107,6 @@
         </w:rPr>
         <w:t>TADAShinyAnalyze_prog.rda</w:t>
       </w:r>
-      <w:proofErr w:type="spellEnd"/>
       <w:r>
         <w:br/>
         <w:t>R Data file that stores the datasets and session information.</w:t>
@@ -117,7 +115,7 @@
     <w:p>
       <w:r>
         <w:pict w14:anchorId="7DBAEC85">
-          <v:rect id="_x0000_i1038" style="width:0;height:1.5pt" o:hralign="center" o:hrstd="t" o:hr="t" fillcolor="#a0a0a0" stroked="f"/>
+          <v:rect id="_x0000_i1026" style="width:0;height:1.5pt" o:hralign="center" o:hrstd="t" o:hr="t" fillcolor="#a0a0a0" stroked="f"/>
         </w:pict>
       </w:r>
     </w:p>
@@ -205,49 +203,7 @@
         <w:t>Join the criteria table</w:t>
       </w:r>
       <w:r>
-        <w:t xml:space="preserve"> to the water quality dataset using the parameter name (</w:t>
-      </w:r>
-      <w:proofErr w:type="spellStart"/>
-      <w:r>
-        <w:t>TADA.CharacteristicName</w:t>
-      </w:r>
-      <w:proofErr w:type="spellEnd"/>
-      <w:r>
-        <w:t>) and unit (</w:t>
-      </w:r>
-      <w:proofErr w:type="spellStart"/>
-      <w:proofErr w:type="gramStart"/>
-      <w:r>
-        <w:t>TADA.ResultMeasure.MeasureUnitCode</w:t>
-      </w:r>
-      <w:proofErr w:type="spellEnd"/>
-      <w:proofErr w:type="gramEnd"/>
-      <w:r>
-        <w:t xml:space="preserve"> in the water quality dataset and </w:t>
-      </w:r>
-      <w:proofErr w:type="spellStart"/>
-      <w:r>
-        <w:t>MagnitudeUnit</w:t>
-      </w:r>
-      <w:proofErr w:type="spellEnd"/>
-      <w:r>
-        <w:t xml:space="preserve"> in the criteria table) as the primary join keys. Optionally, assessment use (</w:t>
-      </w:r>
-      <w:proofErr w:type="spellStart"/>
-      <w:r>
-        <w:t>ATTAINS.UseName</w:t>
-      </w:r>
-      <w:proofErr w:type="spellEnd"/>
-      <w:r>
-        <w:t>) and fraction (</w:t>
-      </w:r>
-      <w:proofErr w:type="spellStart"/>
-      <w:r>
-        <w:t>TADA.ResultSampleFractionText</w:t>
-      </w:r>
-      <w:proofErr w:type="spellEnd"/>
-      <w:r>
-        <w:t>) can be included as additional join keys.</w:t>
+        <w:t xml:space="preserve"> to the water quality dataset using the parameter name (TADA.CharacteristicName) and unit (TADA.ResultMeasure.MeasureUnitCode in the water quality dataset and MagnitudeUnit in the criteria table) as the primary join keys. Optionally, assessment use (ATTAINS.UseName) and fraction (TADA.ResultSampleFractionText) can be included as additional join keys.</w:t>
       </w:r>
     </w:p>
     <w:p>
@@ -393,21 +349,8 @@
           <w:numId w:val="6"/>
         </w:numPr>
       </w:pPr>
-      <w:proofErr w:type="spellStart"/>
       <w:r>
-        <w:t>DurationValue</w:t>
-      </w:r>
-      <w:proofErr w:type="spellEnd"/>
-      <w:r>
-        <w:t xml:space="preserve"> and </w:t>
-      </w:r>
-      <w:proofErr w:type="spellStart"/>
-      <w:r>
-        <w:t>DurationUnit</w:t>
-      </w:r>
-      <w:proofErr w:type="spellEnd"/>
-      <w:r>
-        <w:t xml:space="preserve"> define the rolling window (e.g., 1-day, 7-day, 30-day).</w:t>
+        <w:t>DurationValue and DurationUnit define the rolling window (e.g., 1-day, 7-day, 30-day).</w:t>
       </w:r>
     </w:p>
     <w:p>
@@ -417,21 +360,8 @@
           <w:numId w:val="6"/>
         </w:numPr>
       </w:pPr>
-      <w:proofErr w:type="spellStart"/>
       <w:r>
-        <w:t>DurationMethod</w:t>
-      </w:r>
-      <w:proofErr w:type="spellEnd"/>
-      <w:r>
-        <w:t xml:space="preserve"> specifies which summary </w:t>
-      </w:r>
-      <w:proofErr w:type="gramStart"/>
-      <w:r>
-        <w:t>statistic</w:t>
-      </w:r>
-      <w:proofErr w:type="gramEnd"/>
-      <w:r>
-        <w:t xml:space="preserve"> to apply:</w:t>
+        <w:t>DurationMethod specifies which summary statistic to apply:</w:t>
       </w:r>
     </w:p>
     <w:p>
@@ -453,23 +383,7 @@
         </w:numPr>
       </w:pPr>
       <w:r>
-        <w:t xml:space="preserve">Rolling arithmetic </w:t>
-      </w:r>
-      <w:proofErr w:type="gramStart"/>
-      <w:r>
-        <w:t>mean</w:t>
-      </w:r>
-      <w:proofErr w:type="gramEnd"/>
-      <w:r>
-        <w:t xml:space="preserve"> (</w:t>
-      </w:r>
-      <w:proofErr w:type="gramStart"/>
-      <w:r>
-        <w:t>similar to</w:t>
-      </w:r>
-      <w:proofErr w:type="gramEnd"/>
-      <w:r>
-        <w:t xml:space="preserve"> arithmetic mean)</w:t>
+        <w:t>Rolling arithmetic mean (similar to arithmetic mean)</w:t>
       </w:r>
     </w:p>
     <w:p>
@@ -480,13 +394,8 @@
         </w:numPr>
       </w:pPr>
       <w:r>
-        <w:t xml:space="preserve">Geometric </w:t>
+        <w:t>Geometric mean</w:t>
       </w:r>
-      <w:proofErr w:type="gramStart"/>
-      <w:r>
-        <w:t>mean</w:t>
-      </w:r>
-      <w:proofErr w:type="gramEnd"/>
     </w:p>
     <w:p>
       <w:pPr>
@@ -555,23 +464,7 @@
         <w:t>Conduct frequency assessment</w:t>
       </w:r>
       <w:r>
-        <w:t xml:space="preserve"> based on the frequency information (</w:t>
-      </w:r>
-      <w:proofErr w:type="spellStart"/>
-      <w:r>
-        <w:t>FreqValue</w:t>
-      </w:r>
-      <w:proofErr w:type="spellEnd"/>
-      <w:r>
-        <w:t xml:space="preserve"> and </w:t>
-      </w:r>
-      <w:proofErr w:type="spellStart"/>
-      <w:r>
-        <w:t>FreqMethod</w:t>
-      </w:r>
-      <w:proofErr w:type="spellEnd"/>
-      <w:r>
-        <w:t>).</w:t>
+        <w:t xml:space="preserve"> based on the frequency information (FreqValue and FreqMethod).</w:t>
       </w:r>
     </w:p>
     <w:p>
@@ -664,7 +557,3305 @@
         <w:t xml:space="preserve"> Integrate the duration and frequency assessment summaries with the original excursion summary.</w:t>
       </w:r>
     </w:p>
-    <w:p/>
+    <w:p>
+      <w:pPr>
+        <w:rPr>
+          <w:b/>
+          <w:bCs/>
+        </w:rPr>
+      </w:pPr>
+      <w:r>
+        <w:rPr>
+          <w:b/>
+          <w:bCs/>
+        </w:rPr>
+        <w:t>Column Descriptions</w:t>
+      </w:r>
+    </w:p>
+    <w:p>
+      <w:pPr>
+        <w:pStyle w:val="a9"/>
+        <w:numPr>
+          <w:ilvl w:val="0"/>
+          <w:numId w:val="8"/>
+        </w:numPr>
+        <w:rPr>
+          <w:b/>
+          <w:bCs/>
+        </w:rPr>
+      </w:pPr>
+      <w:r>
+        <w:rPr>
+          <w:b/>
+          <w:bCs/>
+        </w:rPr>
+        <w:t>TADAShinyAnalyze_batch_analysis_result.csv</w:t>
+      </w:r>
+    </w:p>
+    <w:tbl>
+      <w:tblPr>
+        <w:tblStyle w:val="ae"/>
+        <w:tblW w:w="0" w:type="auto"/>
+        <w:tblLook w:val="04A0" w:firstRow="1" w:lastRow="0" w:firstColumn="1" w:lastColumn="0" w:noHBand="0" w:noVBand="1"/>
+      </w:tblPr>
+      <w:tblGrid>
+        <w:gridCol w:w="3605"/>
+        <w:gridCol w:w="4691"/>
+      </w:tblGrid>
+      <w:tr>
+        <w:trPr>
+          <w:trHeight w:val="315"/>
+        </w:trPr>
+        <w:tc>
+          <w:tcPr>
+            <w:tcW w:w="3544" w:type="dxa"/>
+            <w:noWrap/>
+            <w:hideMark/>
+          </w:tcPr>
+          <w:p>
+            <w:pPr>
+              <w:rPr>
+                <w:b/>
+                <w:bCs/>
+                <w:sz w:val="20"/>
+                <w:szCs w:val="20"/>
+              </w:rPr>
+            </w:pPr>
+            <w:r>
+              <w:rPr>
+                <w:b/>
+                <w:bCs/>
+                <w:sz w:val="20"/>
+                <w:szCs w:val="20"/>
+              </w:rPr>
+              <w:t>Column</w:t>
+            </w:r>
+          </w:p>
+        </w:tc>
+        <w:tc>
+          <w:tcPr>
+            <w:tcW w:w="4752" w:type="dxa"/>
+            <w:noWrap/>
+            <w:hideMark/>
+          </w:tcPr>
+          <w:p>
+            <w:pPr>
+              <w:rPr>
+                <w:b/>
+                <w:bCs/>
+                <w:sz w:val="20"/>
+                <w:szCs w:val="20"/>
+              </w:rPr>
+            </w:pPr>
+            <w:r>
+              <w:rPr>
+                <w:b/>
+                <w:bCs/>
+                <w:sz w:val="20"/>
+                <w:szCs w:val="20"/>
+              </w:rPr>
+              <w:t>Description</w:t>
+            </w:r>
+          </w:p>
+        </w:tc>
+      </w:tr>
+      <w:tr>
+        <w:trPr>
+          <w:trHeight w:val="315"/>
+        </w:trPr>
+        <w:tc>
+          <w:tcPr>
+            <w:tcW w:w="3544" w:type="dxa"/>
+            <w:noWrap/>
+            <w:hideMark/>
+          </w:tcPr>
+          <w:p>
+            <w:pPr>
+              <w:rPr>
+                <w:sz w:val="20"/>
+                <w:szCs w:val="20"/>
+              </w:rPr>
+            </w:pPr>
+            <w:r>
+              <w:rPr>
+                <w:sz w:val="20"/>
+                <w:szCs w:val="20"/>
+              </w:rPr>
+              <w:t>TADA.MonitoringLocationIdentifier</w:t>
+            </w:r>
+          </w:p>
+        </w:tc>
+        <w:tc>
+          <w:tcPr>
+            <w:tcW w:w="4752" w:type="dxa"/>
+            <w:noWrap/>
+            <w:hideMark/>
+          </w:tcPr>
+          <w:p>
+            <w:pPr>
+              <w:rPr>
+                <w:sz w:val="20"/>
+                <w:szCs w:val="20"/>
+              </w:rPr>
+            </w:pPr>
+            <w:r>
+              <w:rPr>
+                <w:sz w:val="20"/>
+                <w:szCs w:val="20"/>
+              </w:rPr>
+              <w:t>TADA-standardized version of MonitoringLocationIdentifier. A designator used to describe the unique name, number, or code assigned to identify the monitoring location.</w:t>
+            </w:r>
+          </w:p>
+        </w:tc>
+      </w:tr>
+      <w:tr>
+        <w:trPr>
+          <w:trHeight w:val="315"/>
+        </w:trPr>
+        <w:tc>
+          <w:tcPr>
+            <w:tcW w:w="3544" w:type="dxa"/>
+            <w:noWrap/>
+            <w:hideMark/>
+          </w:tcPr>
+          <w:p>
+            <w:pPr>
+              <w:rPr>
+                <w:sz w:val="20"/>
+                <w:szCs w:val="20"/>
+              </w:rPr>
+            </w:pPr>
+            <w:r>
+              <w:rPr>
+                <w:sz w:val="20"/>
+                <w:szCs w:val="20"/>
+              </w:rPr>
+              <w:t>JoinToAU.AssessmentUnitIdentifier</w:t>
+            </w:r>
+          </w:p>
+        </w:tc>
+        <w:tc>
+          <w:tcPr>
+            <w:tcW w:w="4752" w:type="dxa"/>
+            <w:noWrap/>
+            <w:hideMark/>
+          </w:tcPr>
+          <w:p>
+            <w:pPr>
+              <w:rPr>
+                <w:sz w:val="20"/>
+                <w:szCs w:val="20"/>
+              </w:rPr>
+            </w:pPr>
+            <w:r>
+              <w:rPr>
+                <w:sz w:val="20"/>
+                <w:szCs w:val="20"/>
+              </w:rPr>
+              <w:t>The assessment unit identifier</w:t>
+            </w:r>
+          </w:p>
+        </w:tc>
+      </w:tr>
+      <w:tr>
+        <w:trPr>
+          <w:trHeight w:val="315"/>
+        </w:trPr>
+        <w:tc>
+          <w:tcPr>
+            <w:tcW w:w="3544" w:type="dxa"/>
+            <w:noWrap/>
+            <w:hideMark/>
+          </w:tcPr>
+          <w:p>
+            <w:pPr>
+              <w:rPr>
+                <w:sz w:val="20"/>
+                <w:szCs w:val="20"/>
+              </w:rPr>
+            </w:pPr>
+            <w:r>
+              <w:rPr>
+                <w:sz w:val="20"/>
+                <w:szCs w:val="20"/>
+              </w:rPr>
+              <w:t>ATTAINS.OrganizationIdentifier</w:t>
+            </w:r>
+          </w:p>
+        </w:tc>
+        <w:tc>
+          <w:tcPr>
+            <w:tcW w:w="4752" w:type="dxa"/>
+            <w:noWrap/>
+            <w:hideMark/>
+          </w:tcPr>
+          <w:p>
+            <w:pPr>
+              <w:rPr>
+                <w:sz w:val="20"/>
+                <w:szCs w:val="20"/>
+              </w:rPr>
+            </w:pPr>
+            <w:r>
+              <w:rPr>
+                <w:sz w:val="20"/>
+                <w:szCs w:val="20"/>
+              </w:rPr>
+              <w:t>The ATTAINS organization identifier</w:t>
+            </w:r>
+          </w:p>
+        </w:tc>
+      </w:tr>
+      <w:tr>
+        <w:trPr>
+          <w:trHeight w:val="315"/>
+        </w:trPr>
+        <w:tc>
+          <w:tcPr>
+            <w:tcW w:w="3544" w:type="dxa"/>
+            <w:noWrap/>
+            <w:hideMark/>
+          </w:tcPr>
+          <w:p>
+            <w:pPr>
+              <w:rPr>
+                <w:sz w:val="20"/>
+                <w:szCs w:val="20"/>
+              </w:rPr>
+            </w:pPr>
+            <w:r>
+              <w:rPr>
+                <w:sz w:val="20"/>
+                <w:szCs w:val="20"/>
+              </w:rPr>
+              <w:t>ATTAINS.ParameterName</w:t>
+            </w:r>
+          </w:p>
+        </w:tc>
+        <w:tc>
+          <w:tcPr>
+            <w:tcW w:w="4752" w:type="dxa"/>
+            <w:noWrap/>
+            <w:hideMark/>
+          </w:tcPr>
+          <w:p>
+            <w:pPr>
+              <w:rPr>
+                <w:sz w:val="20"/>
+                <w:szCs w:val="20"/>
+              </w:rPr>
+            </w:pPr>
+            <w:r>
+              <w:rPr>
+                <w:sz w:val="20"/>
+                <w:szCs w:val="20"/>
+              </w:rPr>
+              <w:t>The ATTAINS parameter name</w:t>
+            </w:r>
+          </w:p>
+        </w:tc>
+      </w:tr>
+      <w:tr>
+        <w:trPr>
+          <w:trHeight w:val="315"/>
+        </w:trPr>
+        <w:tc>
+          <w:tcPr>
+            <w:tcW w:w="3544" w:type="dxa"/>
+            <w:noWrap/>
+            <w:hideMark/>
+          </w:tcPr>
+          <w:p>
+            <w:pPr>
+              <w:rPr>
+                <w:sz w:val="20"/>
+                <w:szCs w:val="20"/>
+              </w:rPr>
+            </w:pPr>
+            <w:r>
+              <w:rPr>
+                <w:sz w:val="20"/>
+                <w:szCs w:val="20"/>
+              </w:rPr>
+              <w:lastRenderedPageBreak/>
+              <w:t>ATTAINS.UseName</w:t>
+            </w:r>
+          </w:p>
+        </w:tc>
+        <w:tc>
+          <w:tcPr>
+            <w:tcW w:w="4752" w:type="dxa"/>
+            <w:noWrap/>
+            <w:hideMark/>
+          </w:tcPr>
+          <w:p>
+            <w:pPr>
+              <w:rPr>
+                <w:sz w:val="20"/>
+                <w:szCs w:val="20"/>
+              </w:rPr>
+            </w:pPr>
+            <w:r>
+              <w:rPr>
+                <w:sz w:val="20"/>
+                <w:szCs w:val="20"/>
+              </w:rPr>
+              <w:t>The ATTAINS use name of an assessment unit</w:t>
+            </w:r>
+          </w:p>
+        </w:tc>
+      </w:tr>
+      <w:tr>
+        <w:trPr>
+          <w:trHeight w:val="315"/>
+        </w:trPr>
+        <w:tc>
+          <w:tcPr>
+            <w:tcW w:w="3544" w:type="dxa"/>
+            <w:noWrap/>
+            <w:hideMark/>
+          </w:tcPr>
+          <w:p>
+            <w:pPr>
+              <w:rPr>
+                <w:sz w:val="20"/>
+                <w:szCs w:val="20"/>
+              </w:rPr>
+            </w:pPr>
+            <w:r>
+              <w:rPr>
+                <w:sz w:val="20"/>
+                <w:szCs w:val="20"/>
+              </w:rPr>
+              <w:t>AcuteChronic</w:t>
+            </w:r>
+          </w:p>
+        </w:tc>
+        <w:tc>
+          <w:tcPr>
+            <w:tcW w:w="4752" w:type="dxa"/>
+            <w:noWrap/>
+            <w:hideMark/>
+          </w:tcPr>
+          <w:p>
+            <w:pPr>
+              <w:rPr>
+                <w:sz w:val="20"/>
+                <w:szCs w:val="20"/>
+              </w:rPr>
+            </w:pPr>
+            <w:r>
+              <w:rPr>
+                <w:sz w:val="20"/>
+                <w:szCs w:val="20"/>
+              </w:rPr>
+              <w:t>Acute or chronic criteria category</w:t>
+            </w:r>
+          </w:p>
+        </w:tc>
+      </w:tr>
+      <w:tr>
+        <w:trPr>
+          <w:trHeight w:val="315"/>
+        </w:trPr>
+        <w:tc>
+          <w:tcPr>
+            <w:tcW w:w="3544" w:type="dxa"/>
+            <w:noWrap/>
+            <w:hideMark/>
+          </w:tcPr>
+          <w:p>
+            <w:pPr>
+              <w:rPr>
+                <w:sz w:val="20"/>
+                <w:szCs w:val="20"/>
+              </w:rPr>
+            </w:pPr>
+            <w:r>
+              <w:rPr>
+                <w:sz w:val="20"/>
+                <w:szCs w:val="20"/>
+              </w:rPr>
+              <w:t>UniqueSpatialCriteria</w:t>
+            </w:r>
+          </w:p>
+        </w:tc>
+        <w:tc>
+          <w:tcPr>
+            <w:tcW w:w="4752" w:type="dxa"/>
+            <w:noWrap/>
+            <w:hideMark/>
+          </w:tcPr>
+          <w:p>
+            <w:pPr>
+              <w:rPr>
+                <w:sz w:val="20"/>
+                <w:szCs w:val="20"/>
+              </w:rPr>
+            </w:pPr>
+            <w:r>
+              <w:rPr>
+                <w:sz w:val="20"/>
+                <w:szCs w:val="20"/>
+              </w:rPr>
+              <w:t>The unique spatial criteria information</w:t>
+            </w:r>
+          </w:p>
+        </w:tc>
+      </w:tr>
+      <w:tr>
+        <w:trPr>
+          <w:trHeight w:val="315"/>
+        </w:trPr>
+        <w:tc>
+          <w:tcPr>
+            <w:tcW w:w="3544" w:type="dxa"/>
+            <w:noWrap/>
+            <w:hideMark/>
+          </w:tcPr>
+          <w:p>
+            <w:pPr>
+              <w:rPr>
+                <w:sz w:val="20"/>
+                <w:szCs w:val="20"/>
+              </w:rPr>
+            </w:pPr>
+            <w:r>
+              <w:rPr>
+                <w:sz w:val="20"/>
+                <w:szCs w:val="20"/>
+              </w:rPr>
+              <w:t>Season</w:t>
+            </w:r>
+          </w:p>
+        </w:tc>
+        <w:tc>
+          <w:tcPr>
+            <w:tcW w:w="4752" w:type="dxa"/>
+            <w:noWrap/>
+            <w:hideMark/>
+          </w:tcPr>
+          <w:p>
+            <w:pPr>
+              <w:rPr>
+                <w:sz w:val="20"/>
+                <w:szCs w:val="20"/>
+              </w:rPr>
+            </w:pPr>
+            <w:r>
+              <w:rPr>
+                <w:sz w:val="20"/>
+                <w:szCs w:val="20"/>
+              </w:rPr>
+              <w:t>The season criteria information</w:t>
+            </w:r>
+          </w:p>
+        </w:tc>
+      </w:tr>
+      <w:tr>
+        <w:trPr>
+          <w:trHeight w:val="315"/>
+        </w:trPr>
+        <w:tc>
+          <w:tcPr>
+            <w:tcW w:w="3544" w:type="dxa"/>
+            <w:noWrap/>
+            <w:hideMark/>
+          </w:tcPr>
+          <w:p>
+            <w:pPr>
+              <w:rPr>
+                <w:sz w:val="20"/>
+                <w:szCs w:val="20"/>
+              </w:rPr>
+            </w:pPr>
+            <w:r>
+              <w:rPr>
+                <w:sz w:val="20"/>
+                <w:szCs w:val="20"/>
+              </w:rPr>
+              <w:t>EquationBased</w:t>
+            </w:r>
+          </w:p>
+        </w:tc>
+        <w:tc>
+          <w:tcPr>
+            <w:tcW w:w="4752" w:type="dxa"/>
+            <w:noWrap/>
+            <w:hideMark/>
+          </w:tcPr>
+          <w:p>
+            <w:pPr>
+              <w:rPr>
+                <w:sz w:val="20"/>
+                <w:szCs w:val="20"/>
+              </w:rPr>
+            </w:pPr>
+            <w:r>
+              <w:rPr>
+                <w:sz w:val="20"/>
+                <w:szCs w:val="20"/>
+              </w:rPr>
+              <w:t>Whether the criteria is based on an equation with covariates or is a fixed magnitude</w:t>
+            </w:r>
+          </w:p>
+        </w:tc>
+      </w:tr>
+      <w:tr>
+        <w:trPr>
+          <w:trHeight w:val="315"/>
+        </w:trPr>
+        <w:tc>
+          <w:tcPr>
+            <w:tcW w:w="3544" w:type="dxa"/>
+            <w:noWrap/>
+            <w:hideMark/>
+          </w:tcPr>
+          <w:p>
+            <w:pPr>
+              <w:rPr>
+                <w:sz w:val="20"/>
+                <w:szCs w:val="20"/>
+              </w:rPr>
+            </w:pPr>
+            <w:r>
+              <w:rPr>
+                <w:sz w:val="20"/>
+                <w:szCs w:val="20"/>
+              </w:rPr>
+              <w:t>EquationType</w:t>
+            </w:r>
+          </w:p>
+        </w:tc>
+        <w:tc>
+          <w:tcPr>
+            <w:tcW w:w="4752" w:type="dxa"/>
+            <w:noWrap/>
+            <w:hideMark/>
+          </w:tcPr>
+          <w:p>
+            <w:pPr>
+              <w:rPr>
+                <w:sz w:val="20"/>
+                <w:szCs w:val="20"/>
+              </w:rPr>
+            </w:pPr>
+            <w:r>
+              <w:rPr>
+                <w:sz w:val="20"/>
+                <w:szCs w:val="20"/>
+              </w:rPr>
+              <w:t xml:space="preserve">The type of the equation if the criteria is equation-based </w:t>
+            </w:r>
+          </w:p>
+        </w:tc>
+      </w:tr>
+      <w:tr>
+        <w:trPr>
+          <w:trHeight w:val="315"/>
+        </w:trPr>
+        <w:tc>
+          <w:tcPr>
+            <w:tcW w:w="3544" w:type="dxa"/>
+            <w:noWrap/>
+            <w:hideMark/>
+          </w:tcPr>
+          <w:p>
+            <w:pPr>
+              <w:rPr>
+                <w:sz w:val="20"/>
+                <w:szCs w:val="20"/>
+              </w:rPr>
+            </w:pPr>
+            <w:r>
+              <w:rPr>
+                <w:sz w:val="20"/>
+                <w:szCs w:val="20"/>
+              </w:rPr>
+              <w:t>TADA.CharacteristicName</w:t>
+            </w:r>
+          </w:p>
+        </w:tc>
+        <w:tc>
+          <w:tcPr>
+            <w:tcW w:w="4752" w:type="dxa"/>
+            <w:noWrap/>
+            <w:hideMark/>
+          </w:tcPr>
+          <w:p>
+            <w:pPr>
+              <w:rPr>
+                <w:sz w:val="20"/>
+                <w:szCs w:val="20"/>
+              </w:rPr>
+            </w:pPr>
+            <w:r>
+              <w:rPr>
+                <w:sz w:val="20"/>
+                <w:szCs w:val="20"/>
+              </w:rPr>
+              <w:t>The object, property, or substance which is evaluated or enumerated by either a direct field measurement, a direct field observation, or by laboratory analysis of material collected in the field.  TADA-standardized variables are presented in uppercase and are the result of harmonization between USGS and WQX values, which may vary by case.</w:t>
+            </w:r>
+          </w:p>
+        </w:tc>
+      </w:tr>
+      <w:tr>
+        <w:trPr>
+          <w:trHeight w:val="315"/>
+        </w:trPr>
+        <w:tc>
+          <w:tcPr>
+            <w:tcW w:w="3544" w:type="dxa"/>
+            <w:noWrap/>
+            <w:hideMark/>
+          </w:tcPr>
+          <w:p>
+            <w:pPr>
+              <w:rPr>
+                <w:sz w:val="20"/>
+                <w:szCs w:val="20"/>
+              </w:rPr>
+            </w:pPr>
+            <w:r>
+              <w:rPr>
+                <w:sz w:val="20"/>
+                <w:szCs w:val="20"/>
+              </w:rPr>
+              <w:t>TADA.ResultSampleFractionText</w:t>
+            </w:r>
+          </w:p>
+        </w:tc>
+        <w:tc>
+          <w:tcPr>
+            <w:tcW w:w="4752" w:type="dxa"/>
+            <w:noWrap/>
+            <w:hideMark/>
+          </w:tcPr>
+          <w:p>
+            <w:pPr>
+              <w:rPr>
+                <w:sz w:val="20"/>
+                <w:szCs w:val="20"/>
+              </w:rPr>
+            </w:pPr>
+            <w:r>
+              <w:rPr>
+                <w:sz w:val="20"/>
+                <w:szCs w:val="20"/>
+              </w:rPr>
+              <w:t>The text name of the portion of the sample associated with results obtained from a physically-partitioned sample (e.g., dissolved).  TADA-standardized variables are presented in uppercase and are the result of harmonization between USGS and WQX values, which may vary by case.</w:t>
+            </w:r>
+          </w:p>
+        </w:tc>
+      </w:tr>
+      <w:tr>
+        <w:trPr>
+          <w:trHeight w:val="315"/>
+        </w:trPr>
+        <w:tc>
+          <w:tcPr>
+            <w:tcW w:w="3544" w:type="dxa"/>
+            <w:noWrap/>
+            <w:hideMark/>
+          </w:tcPr>
+          <w:p>
+            <w:pPr>
+              <w:rPr>
+                <w:sz w:val="20"/>
+                <w:szCs w:val="20"/>
+              </w:rPr>
+            </w:pPr>
+            <w:r>
+              <w:rPr>
+                <w:sz w:val="20"/>
+                <w:szCs w:val="20"/>
+              </w:rPr>
+              <w:t>TADA.MethodSpeciationName</w:t>
+            </w:r>
+          </w:p>
+        </w:tc>
+        <w:tc>
+          <w:tcPr>
+            <w:tcW w:w="4752" w:type="dxa"/>
+            <w:noWrap/>
+            <w:hideMark/>
+          </w:tcPr>
+          <w:p>
+            <w:pPr>
+              <w:rPr>
+                <w:sz w:val="20"/>
+                <w:szCs w:val="20"/>
+              </w:rPr>
+            </w:pPr>
+            <w:r>
+              <w:rPr>
+                <w:sz w:val="20"/>
+                <w:szCs w:val="20"/>
+              </w:rPr>
+              <w:t>Identifies the chemical speciation in which the measured result is expressed. TADA-standardized variables are presented in uppercase and are the result of harmonization between USGS and WQX values, which may vary by case.</w:t>
+            </w:r>
+          </w:p>
+        </w:tc>
+      </w:tr>
+      <w:tr>
+        <w:trPr>
+          <w:trHeight w:val="315"/>
+        </w:trPr>
+        <w:tc>
+          <w:tcPr>
+            <w:tcW w:w="3544" w:type="dxa"/>
+            <w:noWrap/>
+            <w:hideMark/>
+          </w:tcPr>
+          <w:p>
+            <w:pPr>
+              <w:rPr>
+                <w:sz w:val="20"/>
+                <w:szCs w:val="20"/>
+              </w:rPr>
+            </w:pPr>
+            <w:r>
+              <w:rPr>
+                <w:sz w:val="20"/>
+                <w:szCs w:val="20"/>
+              </w:rPr>
+              <w:t>TADA.ResultMeasure.MeasureUnitCode</w:t>
+            </w:r>
+          </w:p>
+        </w:tc>
+        <w:tc>
+          <w:tcPr>
+            <w:tcW w:w="4752" w:type="dxa"/>
+            <w:noWrap/>
+            <w:hideMark/>
+          </w:tcPr>
+          <w:p>
+            <w:pPr>
+              <w:rPr>
+                <w:sz w:val="20"/>
+                <w:szCs w:val="20"/>
+              </w:rPr>
+            </w:pPr>
+            <w:r>
+              <w:rPr>
+                <w:sz w:val="20"/>
+                <w:szCs w:val="20"/>
+              </w:rPr>
+              <w:t>TADA-standardized version of ResultMeasure.MeasureUnitCode. The code describing the units of the reportable measure of the result for the chemical, microbiological or other characteristic being analyzed.</w:t>
+            </w:r>
+          </w:p>
+        </w:tc>
+      </w:tr>
+      <w:tr>
+        <w:trPr>
+          <w:trHeight w:val="315"/>
+        </w:trPr>
+        <w:tc>
+          <w:tcPr>
+            <w:tcW w:w="3544" w:type="dxa"/>
+            <w:noWrap/>
+            <w:hideMark/>
+          </w:tcPr>
+          <w:p>
+            <w:pPr>
+              <w:rPr>
+                <w:sz w:val="20"/>
+                <w:szCs w:val="20"/>
+              </w:rPr>
+            </w:pPr>
+            <w:r>
+              <w:rPr>
+                <w:sz w:val="20"/>
+                <w:szCs w:val="20"/>
+              </w:rPr>
+              <w:t>DurationValue</w:t>
+            </w:r>
+          </w:p>
+        </w:tc>
+        <w:tc>
+          <w:tcPr>
+            <w:tcW w:w="4752" w:type="dxa"/>
+            <w:noWrap/>
+            <w:hideMark/>
+          </w:tcPr>
+          <w:p>
+            <w:pPr>
+              <w:rPr>
+                <w:sz w:val="20"/>
+                <w:szCs w:val="20"/>
+              </w:rPr>
+            </w:pPr>
+            <w:r>
+              <w:rPr>
+                <w:sz w:val="20"/>
+                <w:szCs w:val="20"/>
+              </w:rPr>
+              <w:t>The duration value of the criteria</w:t>
+            </w:r>
+          </w:p>
+        </w:tc>
+      </w:tr>
+      <w:tr>
+        <w:trPr>
+          <w:trHeight w:val="315"/>
+        </w:trPr>
+        <w:tc>
+          <w:tcPr>
+            <w:tcW w:w="3544" w:type="dxa"/>
+            <w:noWrap/>
+            <w:hideMark/>
+          </w:tcPr>
+          <w:p>
+            <w:pPr>
+              <w:rPr>
+                <w:sz w:val="20"/>
+                <w:szCs w:val="20"/>
+              </w:rPr>
+            </w:pPr>
+            <w:r>
+              <w:rPr>
+                <w:sz w:val="20"/>
+                <w:szCs w:val="20"/>
+              </w:rPr>
+              <w:t>DurationUnit</w:t>
+            </w:r>
+          </w:p>
+        </w:tc>
+        <w:tc>
+          <w:tcPr>
+            <w:tcW w:w="4752" w:type="dxa"/>
+            <w:noWrap/>
+            <w:hideMark/>
+          </w:tcPr>
+          <w:p>
+            <w:pPr>
+              <w:rPr>
+                <w:sz w:val="20"/>
+                <w:szCs w:val="20"/>
+              </w:rPr>
+            </w:pPr>
+            <w:r>
+              <w:rPr>
+                <w:sz w:val="20"/>
+                <w:szCs w:val="20"/>
+              </w:rPr>
+              <w:t>The duration unit of the criteria</w:t>
+            </w:r>
+          </w:p>
+        </w:tc>
+      </w:tr>
+      <w:tr>
+        <w:trPr>
+          <w:trHeight w:val="315"/>
+        </w:trPr>
+        <w:tc>
+          <w:tcPr>
+            <w:tcW w:w="3544" w:type="dxa"/>
+            <w:noWrap/>
+            <w:hideMark/>
+          </w:tcPr>
+          <w:p>
+            <w:pPr>
+              <w:rPr>
+                <w:sz w:val="20"/>
+                <w:szCs w:val="20"/>
+              </w:rPr>
+            </w:pPr>
+            <w:r>
+              <w:rPr>
+                <w:sz w:val="20"/>
+                <w:szCs w:val="20"/>
+              </w:rPr>
+              <w:t>DurationMethod</w:t>
+            </w:r>
+          </w:p>
+        </w:tc>
+        <w:tc>
+          <w:tcPr>
+            <w:tcW w:w="4752" w:type="dxa"/>
+            <w:noWrap/>
+            <w:hideMark/>
+          </w:tcPr>
+          <w:p>
+            <w:pPr>
+              <w:rPr>
+                <w:sz w:val="20"/>
+                <w:szCs w:val="20"/>
+              </w:rPr>
+            </w:pPr>
+            <w:r>
+              <w:rPr>
+                <w:sz w:val="20"/>
+                <w:szCs w:val="20"/>
+              </w:rPr>
+              <w:t>The statistial method used to summaried the duration of the criteria</w:t>
+            </w:r>
+          </w:p>
+        </w:tc>
+      </w:tr>
+      <w:tr>
+        <w:trPr>
+          <w:trHeight w:val="315"/>
+        </w:trPr>
+        <w:tc>
+          <w:tcPr>
+            <w:tcW w:w="3544" w:type="dxa"/>
+            <w:noWrap/>
+            <w:hideMark/>
+          </w:tcPr>
+          <w:p>
+            <w:pPr>
+              <w:rPr>
+                <w:sz w:val="20"/>
+                <w:szCs w:val="20"/>
+              </w:rPr>
+            </w:pPr>
+            <w:r>
+              <w:rPr>
+                <w:sz w:val="20"/>
+                <w:szCs w:val="20"/>
+              </w:rPr>
+              <w:t>FreqValue</w:t>
+            </w:r>
+          </w:p>
+        </w:tc>
+        <w:tc>
+          <w:tcPr>
+            <w:tcW w:w="4752" w:type="dxa"/>
+            <w:noWrap/>
+            <w:hideMark/>
+          </w:tcPr>
+          <w:p>
+            <w:pPr>
+              <w:rPr>
+                <w:sz w:val="20"/>
+                <w:szCs w:val="20"/>
+              </w:rPr>
+            </w:pPr>
+            <w:r>
+              <w:rPr>
+                <w:sz w:val="20"/>
+                <w:szCs w:val="20"/>
+              </w:rPr>
+              <w:t>The frequency value of the criteria</w:t>
+            </w:r>
+          </w:p>
+        </w:tc>
+      </w:tr>
+      <w:tr>
+        <w:trPr>
+          <w:trHeight w:val="315"/>
+        </w:trPr>
+        <w:tc>
+          <w:tcPr>
+            <w:tcW w:w="3544" w:type="dxa"/>
+            <w:noWrap/>
+            <w:hideMark/>
+          </w:tcPr>
+          <w:p>
+            <w:pPr>
+              <w:rPr>
+                <w:sz w:val="20"/>
+                <w:szCs w:val="20"/>
+              </w:rPr>
+            </w:pPr>
+            <w:r>
+              <w:rPr>
+                <w:sz w:val="20"/>
+                <w:szCs w:val="20"/>
+              </w:rPr>
+              <w:t>FreqMethod</w:t>
+            </w:r>
+          </w:p>
+        </w:tc>
+        <w:tc>
+          <w:tcPr>
+            <w:tcW w:w="4752" w:type="dxa"/>
+            <w:noWrap/>
+            <w:hideMark/>
+          </w:tcPr>
+          <w:p>
+            <w:pPr>
+              <w:rPr>
+                <w:sz w:val="20"/>
+                <w:szCs w:val="20"/>
+              </w:rPr>
+            </w:pPr>
+            <w:r>
+              <w:rPr>
+                <w:sz w:val="20"/>
+                <w:szCs w:val="20"/>
+              </w:rPr>
+              <w:t>The frequency method of the criteria</w:t>
+            </w:r>
+          </w:p>
+        </w:tc>
+      </w:tr>
+      <w:tr>
+        <w:trPr>
+          <w:trHeight w:val="315"/>
+        </w:trPr>
+        <w:tc>
+          <w:tcPr>
+            <w:tcW w:w="3544" w:type="dxa"/>
+            <w:noWrap/>
+            <w:hideMark/>
+          </w:tcPr>
+          <w:p>
+            <w:pPr>
+              <w:rPr>
+                <w:sz w:val="20"/>
+                <w:szCs w:val="20"/>
+              </w:rPr>
+            </w:pPr>
+            <w:r>
+              <w:rPr>
+                <w:sz w:val="20"/>
+                <w:szCs w:val="20"/>
+              </w:rPr>
+              <w:lastRenderedPageBreak/>
+              <w:t>Value</w:t>
+            </w:r>
+          </w:p>
+        </w:tc>
+        <w:tc>
+          <w:tcPr>
+            <w:tcW w:w="4752" w:type="dxa"/>
+            <w:noWrap/>
+            <w:hideMark/>
+          </w:tcPr>
+          <w:p>
+            <w:pPr>
+              <w:rPr>
+                <w:sz w:val="20"/>
+                <w:szCs w:val="20"/>
+              </w:rPr>
+            </w:pPr>
+            <w:r>
+              <w:rPr>
+                <w:sz w:val="20"/>
+                <w:szCs w:val="20"/>
+              </w:rPr>
+              <w:t>The parameter measured value before the duration summary</w:t>
+            </w:r>
+          </w:p>
+        </w:tc>
+      </w:tr>
+      <w:tr>
+        <w:trPr>
+          <w:trHeight w:val="315"/>
+        </w:trPr>
+        <w:tc>
+          <w:tcPr>
+            <w:tcW w:w="3544" w:type="dxa"/>
+            <w:noWrap/>
+            <w:hideMark/>
+          </w:tcPr>
+          <w:p>
+            <w:pPr>
+              <w:rPr>
+                <w:sz w:val="20"/>
+                <w:szCs w:val="20"/>
+              </w:rPr>
+            </w:pPr>
+            <w:r>
+              <w:rPr>
+                <w:sz w:val="20"/>
+                <w:szCs w:val="20"/>
+              </w:rPr>
+              <w:t>Window_Start_win</w:t>
+            </w:r>
+          </w:p>
+        </w:tc>
+        <w:tc>
+          <w:tcPr>
+            <w:tcW w:w="4752" w:type="dxa"/>
+            <w:noWrap/>
+            <w:hideMark/>
+          </w:tcPr>
+          <w:p>
+            <w:pPr>
+              <w:rPr>
+                <w:sz w:val="20"/>
+                <w:szCs w:val="20"/>
+              </w:rPr>
+            </w:pPr>
+            <w:r>
+              <w:rPr>
+                <w:sz w:val="20"/>
+                <w:szCs w:val="20"/>
+              </w:rPr>
+              <w:t>The window start date and time</w:t>
+            </w:r>
+          </w:p>
+        </w:tc>
+      </w:tr>
+      <w:tr>
+        <w:trPr>
+          <w:trHeight w:val="315"/>
+        </w:trPr>
+        <w:tc>
+          <w:tcPr>
+            <w:tcW w:w="3544" w:type="dxa"/>
+            <w:noWrap/>
+            <w:hideMark/>
+          </w:tcPr>
+          <w:p>
+            <w:pPr>
+              <w:rPr>
+                <w:sz w:val="20"/>
+                <w:szCs w:val="20"/>
+              </w:rPr>
+            </w:pPr>
+            <w:r>
+              <w:rPr>
+                <w:sz w:val="20"/>
+                <w:szCs w:val="20"/>
+              </w:rPr>
+              <w:t>Window_End_win</w:t>
+            </w:r>
+          </w:p>
+        </w:tc>
+        <w:tc>
+          <w:tcPr>
+            <w:tcW w:w="4752" w:type="dxa"/>
+            <w:noWrap/>
+            <w:hideMark/>
+          </w:tcPr>
+          <w:p>
+            <w:pPr>
+              <w:rPr>
+                <w:sz w:val="20"/>
+                <w:szCs w:val="20"/>
+              </w:rPr>
+            </w:pPr>
+            <w:r>
+              <w:rPr>
+                <w:sz w:val="20"/>
+                <w:szCs w:val="20"/>
+              </w:rPr>
+              <w:t>The window end date and time</w:t>
+            </w:r>
+          </w:p>
+        </w:tc>
+      </w:tr>
+      <w:tr>
+        <w:trPr>
+          <w:trHeight w:val="315"/>
+        </w:trPr>
+        <w:tc>
+          <w:tcPr>
+            <w:tcW w:w="3544" w:type="dxa"/>
+            <w:noWrap/>
+            <w:hideMark/>
+          </w:tcPr>
+          <w:p>
+            <w:pPr>
+              <w:rPr>
+                <w:sz w:val="20"/>
+                <w:szCs w:val="20"/>
+              </w:rPr>
+            </w:pPr>
+            <w:r>
+              <w:rPr>
+                <w:sz w:val="20"/>
+                <w:szCs w:val="20"/>
+              </w:rPr>
+              <w:t>N_in_Window</w:t>
+            </w:r>
+          </w:p>
+        </w:tc>
+        <w:tc>
+          <w:tcPr>
+            <w:tcW w:w="4752" w:type="dxa"/>
+            <w:noWrap/>
+            <w:hideMark/>
+          </w:tcPr>
+          <w:p>
+            <w:pPr>
+              <w:rPr>
+                <w:sz w:val="20"/>
+                <w:szCs w:val="20"/>
+              </w:rPr>
+            </w:pPr>
+            <w:r>
+              <w:rPr>
+                <w:sz w:val="20"/>
+                <w:szCs w:val="20"/>
+              </w:rPr>
+              <w:t>Sample size in a duration window</w:t>
+            </w:r>
+          </w:p>
+        </w:tc>
+      </w:tr>
+      <w:tr>
+        <w:trPr>
+          <w:trHeight w:val="315"/>
+        </w:trPr>
+        <w:tc>
+          <w:tcPr>
+            <w:tcW w:w="3544" w:type="dxa"/>
+            <w:noWrap/>
+            <w:hideMark/>
+          </w:tcPr>
+          <w:p>
+            <w:pPr>
+              <w:rPr>
+                <w:sz w:val="20"/>
+                <w:szCs w:val="20"/>
+              </w:rPr>
+            </w:pPr>
+            <w:r>
+              <w:rPr>
+                <w:sz w:val="20"/>
+                <w:szCs w:val="20"/>
+              </w:rPr>
+              <w:t>Result_Duration</w:t>
+            </w:r>
+          </w:p>
+        </w:tc>
+        <w:tc>
+          <w:tcPr>
+            <w:tcW w:w="4752" w:type="dxa"/>
+            <w:noWrap/>
+            <w:hideMark/>
+          </w:tcPr>
+          <w:p>
+            <w:pPr>
+              <w:rPr>
+                <w:sz w:val="20"/>
+                <w:szCs w:val="20"/>
+              </w:rPr>
+            </w:pPr>
+            <w:r>
+              <w:rPr>
+                <w:sz w:val="20"/>
+                <w:szCs w:val="20"/>
+              </w:rPr>
+              <w:t>The summarized parameter value in the duration window</w:t>
+            </w:r>
+          </w:p>
+        </w:tc>
+      </w:tr>
+      <w:tr>
+        <w:trPr>
+          <w:trHeight w:val="315"/>
+        </w:trPr>
+        <w:tc>
+          <w:tcPr>
+            <w:tcW w:w="3544" w:type="dxa"/>
+            <w:noWrap/>
+            <w:hideMark/>
+          </w:tcPr>
+          <w:p>
+            <w:pPr>
+              <w:rPr>
+                <w:sz w:val="20"/>
+                <w:szCs w:val="20"/>
+              </w:rPr>
+            </w:pPr>
+            <w:r>
+              <w:rPr>
+                <w:sz w:val="20"/>
+                <w:szCs w:val="20"/>
+              </w:rPr>
+              <w:t>Value_win_min</w:t>
+            </w:r>
+          </w:p>
+        </w:tc>
+        <w:tc>
+          <w:tcPr>
+            <w:tcW w:w="4752" w:type="dxa"/>
+            <w:noWrap/>
+            <w:hideMark/>
+          </w:tcPr>
+          <w:p>
+            <w:pPr>
+              <w:rPr>
+                <w:sz w:val="20"/>
+                <w:szCs w:val="20"/>
+              </w:rPr>
+            </w:pPr>
+            <w:r>
+              <w:rPr>
+                <w:sz w:val="20"/>
+                <w:szCs w:val="20"/>
+              </w:rPr>
+              <w:t>The minimum value in the duration window</w:t>
+            </w:r>
+          </w:p>
+        </w:tc>
+      </w:tr>
+      <w:tr>
+        <w:trPr>
+          <w:trHeight w:val="315"/>
+        </w:trPr>
+        <w:tc>
+          <w:tcPr>
+            <w:tcW w:w="3544" w:type="dxa"/>
+            <w:noWrap/>
+            <w:hideMark/>
+          </w:tcPr>
+          <w:p>
+            <w:pPr>
+              <w:rPr>
+                <w:sz w:val="20"/>
+                <w:szCs w:val="20"/>
+              </w:rPr>
+            </w:pPr>
+            <w:r>
+              <w:rPr>
+                <w:sz w:val="20"/>
+                <w:szCs w:val="20"/>
+              </w:rPr>
+              <w:t>Value_win_max</w:t>
+            </w:r>
+          </w:p>
+        </w:tc>
+        <w:tc>
+          <w:tcPr>
+            <w:tcW w:w="4752" w:type="dxa"/>
+            <w:noWrap/>
+            <w:hideMark/>
+          </w:tcPr>
+          <w:p>
+            <w:pPr>
+              <w:rPr>
+                <w:sz w:val="20"/>
+                <w:szCs w:val="20"/>
+              </w:rPr>
+            </w:pPr>
+            <w:r>
+              <w:rPr>
+                <w:sz w:val="20"/>
+                <w:szCs w:val="20"/>
+              </w:rPr>
+              <w:t>The maximum value in the duration window</w:t>
+            </w:r>
+          </w:p>
+        </w:tc>
+      </w:tr>
+      <w:tr>
+        <w:trPr>
+          <w:trHeight w:val="315"/>
+        </w:trPr>
+        <w:tc>
+          <w:tcPr>
+            <w:tcW w:w="3544" w:type="dxa"/>
+            <w:noWrap/>
+            <w:hideMark/>
+          </w:tcPr>
+          <w:p>
+            <w:pPr>
+              <w:rPr>
+                <w:sz w:val="20"/>
+                <w:szCs w:val="20"/>
+              </w:rPr>
+            </w:pPr>
+            <w:r>
+              <w:rPr>
+                <w:sz w:val="20"/>
+                <w:szCs w:val="20"/>
+              </w:rPr>
+              <w:t>Threshold_Lower_win</w:t>
+            </w:r>
+          </w:p>
+        </w:tc>
+        <w:tc>
+          <w:tcPr>
+            <w:tcW w:w="4752" w:type="dxa"/>
+            <w:noWrap/>
+            <w:hideMark/>
+          </w:tcPr>
+          <w:p>
+            <w:pPr>
+              <w:rPr>
+                <w:sz w:val="20"/>
+                <w:szCs w:val="20"/>
+              </w:rPr>
+            </w:pPr>
+            <w:r>
+              <w:rPr>
+                <w:sz w:val="20"/>
+                <w:szCs w:val="20"/>
+              </w:rPr>
+              <w:t>The lower threshold of the criteria in the duration window</w:t>
+            </w:r>
+          </w:p>
+        </w:tc>
+      </w:tr>
+      <w:tr>
+        <w:trPr>
+          <w:trHeight w:val="315"/>
+        </w:trPr>
+        <w:tc>
+          <w:tcPr>
+            <w:tcW w:w="3544" w:type="dxa"/>
+            <w:noWrap/>
+            <w:hideMark/>
+          </w:tcPr>
+          <w:p>
+            <w:pPr>
+              <w:rPr>
+                <w:sz w:val="20"/>
+                <w:szCs w:val="20"/>
+              </w:rPr>
+            </w:pPr>
+            <w:r>
+              <w:rPr>
+                <w:sz w:val="20"/>
+                <w:szCs w:val="20"/>
+              </w:rPr>
+              <w:t>Threshold_Upper_win</w:t>
+            </w:r>
+          </w:p>
+        </w:tc>
+        <w:tc>
+          <w:tcPr>
+            <w:tcW w:w="4752" w:type="dxa"/>
+            <w:noWrap/>
+            <w:hideMark/>
+          </w:tcPr>
+          <w:p>
+            <w:pPr>
+              <w:rPr>
+                <w:sz w:val="20"/>
+                <w:szCs w:val="20"/>
+              </w:rPr>
+            </w:pPr>
+            <w:r>
+              <w:rPr>
+                <w:sz w:val="20"/>
+                <w:szCs w:val="20"/>
+              </w:rPr>
+              <w:t>The upper threshold of the criteria in the duration window</w:t>
+            </w:r>
+          </w:p>
+        </w:tc>
+      </w:tr>
+      <w:tr>
+        <w:trPr>
+          <w:trHeight w:val="315"/>
+        </w:trPr>
+        <w:tc>
+          <w:tcPr>
+            <w:tcW w:w="3544" w:type="dxa"/>
+            <w:noWrap/>
+            <w:hideMark/>
+          </w:tcPr>
+          <w:p>
+            <w:pPr>
+              <w:rPr>
+                <w:sz w:val="20"/>
+                <w:szCs w:val="20"/>
+              </w:rPr>
+            </w:pPr>
+            <w:r>
+              <w:rPr>
+                <w:sz w:val="20"/>
+                <w:szCs w:val="20"/>
+              </w:rPr>
+              <w:t>pH_win</w:t>
+            </w:r>
+          </w:p>
+        </w:tc>
+        <w:tc>
+          <w:tcPr>
+            <w:tcW w:w="4752" w:type="dxa"/>
+            <w:noWrap/>
+            <w:hideMark/>
+          </w:tcPr>
+          <w:p>
+            <w:pPr>
+              <w:rPr>
+                <w:sz w:val="20"/>
+                <w:szCs w:val="20"/>
+              </w:rPr>
+            </w:pPr>
+            <w:r>
+              <w:rPr>
+                <w:sz w:val="20"/>
+                <w:szCs w:val="20"/>
+              </w:rPr>
+              <w:t>The mean pH value in the duration window</w:t>
+            </w:r>
+          </w:p>
+        </w:tc>
+      </w:tr>
+      <w:tr>
+        <w:trPr>
+          <w:trHeight w:val="315"/>
+        </w:trPr>
+        <w:tc>
+          <w:tcPr>
+            <w:tcW w:w="3544" w:type="dxa"/>
+            <w:noWrap/>
+            <w:hideMark/>
+          </w:tcPr>
+          <w:p>
+            <w:pPr>
+              <w:rPr>
+                <w:sz w:val="20"/>
+                <w:szCs w:val="20"/>
+              </w:rPr>
+            </w:pPr>
+            <w:r>
+              <w:rPr>
+                <w:sz w:val="20"/>
+                <w:szCs w:val="20"/>
+              </w:rPr>
+              <w:t>Temperature_win</w:t>
+            </w:r>
+          </w:p>
+        </w:tc>
+        <w:tc>
+          <w:tcPr>
+            <w:tcW w:w="4752" w:type="dxa"/>
+            <w:noWrap/>
+            <w:hideMark/>
+          </w:tcPr>
+          <w:p>
+            <w:pPr>
+              <w:rPr>
+                <w:sz w:val="20"/>
+                <w:szCs w:val="20"/>
+              </w:rPr>
+            </w:pPr>
+            <w:r>
+              <w:rPr>
+                <w:sz w:val="20"/>
+                <w:szCs w:val="20"/>
+              </w:rPr>
+              <w:t>The mean temperature value in the duration window</w:t>
+            </w:r>
+          </w:p>
+        </w:tc>
+      </w:tr>
+      <w:tr>
+        <w:trPr>
+          <w:trHeight w:val="315"/>
+        </w:trPr>
+        <w:tc>
+          <w:tcPr>
+            <w:tcW w:w="3544" w:type="dxa"/>
+            <w:noWrap/>
+            <w:hideMark/>
+          </w:tcPr>
+          <w:p>
+            <w:pPr>
+              <w:rPr>
+                <w:sz w:val="20"/>
+                <w:szCs w:val="20"/>
+              </w:rPr>
+            </w:pPr>
+            <w:r>
+              <w:rPr>
+                <w:sz w:val="20"/>
+                <w:szCs w:val="20"/>
+              </w:rPr>
+              <w:t>Hardness_win</w:t>
+            </w:r>
+          </w:p>
+        </w:tc>
+        <w:tc>
+          <w:tcPr>
+            <w:tcW w:w="4752" w:type="dxa"/>
+            <w:noWrap/>
+            <w:hideMark/>
+          </w:tcPr>
+          <w:p>
+            <w:pPr>
+              <w:rPr>
+                <w:sz w:val="20"/>
+                <w:szCs w:val="20"/>
+              </w:rPr>
+            </w:pPr>
+            <w:r>
+              <w:rPr>
+                <w:sz w:val="20"/>
+                <w:szCs w:val="20"/>
+              </w:rPr>
+              <w:t>The mean hardness value in the duration window</w:t>
+            </w:r>
+          </w:p>
+        </w:tc>
+      </w:tr>
+      <w:tr>
+        <w:trPr>
+          <w:trHeight w:val="315"/>
+        </w:trPr>
+        <w:tc>
+          <w:tcPr>
+            <w:tcW w:w="3544" w:type="dxa"/>
+            <w:noWrap/>
+            <w:hideMark/>
+          </w:tcPr>
+          <w:p>
+            <w:pPr>
+              <w:rPr>
+                <w:sz w:val="20"/>
+                <w:szCs w:val="20"/>
+              </w:rPr>
+            </w:pPr>
+            <w:r>
+              <w:rPr>
+                <w:sz w:val="20"/>
+                <w:szCs w:val="20"/>
+              </w:rPr>
+              <w:t>Window_Status</w:t>
+            </w:r>
+          </w:p>
+        </w:tc>
+        <w:tc>
+          <w:tcPr>
+            <w:tcW w:w="4752" w:type="dxa"/>
+            <w:noWrap/>
+            <w:hideMark/>
+          </w:tcPr>
+          <w:p>
+            <w:pPr>
+              <w:rPr>
+                <w:sz w:val="20"/>
+                <w:szCs w:val="20"/>
+              </w:rPr>
+            </w:pPr>
+            <w:r>
+              <w:rPr>
+                <w:sz w:val="20"/>
+                <w:szCs w:val="20"/>
+              </w:rPr>
+              <w:t>Whether the window is complete or incomplete based on the duration value, unit and method</w:t>
+            </w:r>
+          </w:p>
+        </w:tc>
+      </w:tr>
+    </w:tbl>
+    <w:p>
+      <w:pPr>
+        <w:rPr>
+          <w:b/>
+          <w:bCs/>
+        </w:rPr>
+      </w:pPr>
+    </w:p>
+    <w:p>
+      <w:pPr>
+        <w:pStyle w:val="a9"/>
+        <w:numPr>
+          <w:ilvl w:val="0"/>
+          <w:numId w:val="8"/>
+        </w:numPr>
+        <w:rPr>
+          <w:b/>
+          <w:bCs/>
+        </w:rPr>
+      </w:pPr>
+      <w:r>
+        <w:rPr>
+          <w:b/>
+          <w:bCs/>
+        </w:rPr>
+        <w:t>TADAShinyAnalyze_batch_analysis_summary.csv</w:t>
+      </w:r>
+    </w:p>
+    <w:tbl>
+      <w:tblPr>
+        <w:tblStyle w:val="ae"/>
+        <w:tblW w:w="0" w:type="auto"/>
+        <w:tblLook w:val="04A0" w:firstRow="1" w:lastRow="0" w:firstColumn="1" w:lastColumn="0" w:noHBand="0" w:noVBand="1"/>
+      </w:tblPr>
+      <w:tblGrid>
+        <w:gridCol w:w="3560"/>
+        <w:gridCol w:w="4736"/>
+      </w:tblGrid>
+      <w:tr>
+        <w:trPr>
+          <w:trHeight w:val="323"/>
+        </w:trPr>
+        <w:tc>
+          <w:tcPr>
+            <w:tcW w:w="2972" w:type="dxa"/>
+            <w:noWrap/>
+            <w:hideMark/>
+          </w:tcPr>
+          <w:p>
+            <w:pPr>
+              <w:rPr>
+                <w:b/>
+                <w:bCs/>
+                <w:sz w:val="22"/>
+                <w:szCs w:val="22"/>
+              </w:rPr>
+            </w:pPr>
+            <w:r>
+              <w:rPr>
+                <w:b/>
+                <w:bCs/>
+                <w:sz w:val="22"/>
+                <w:szCs w:val="22"/>
+              </w:rPr>
+              <w:t>Column</w:t>
+            </w:r>
+          </w:p>
+        </w:tc>
+        <w:tc>
+          <w:tcPr>
+            <w:tcW w:w="5324" w:type="dxa"/>
+            <w:noWrap/>
+            <w:hideMark/>
+          </w:tcPr>
+          <w:p>
+            <w:pPr>
+              <w:rPr>
+                <w:b/>
+                <w:bCs/>
+                <w:sz w:val="22"/>
+                <w:szCs w:val="22"/>
+              </w:rPr>
+            </w:pPr>
+            <w:r>
+              <w:rPr>
+                <w:b/>
+                <w:bCs/>
+                <w:sz w:val="22"/>
+                <w:szCs w:val="22"/>
+              </w:rPr>
+              <w:t>Description</w:t>
+            </w:r>
+          </w:p>
+        </w:tc>
+      </w:tr>
+      <w:tr>
+        <w:trPr>
+          <w:trHeight w:val="323"/>
+        </w:trPr>
+        <w:tc>
+          <w:tcPr>
+            <w:tcW w:w="2972" w:type="dxa"/>
+            <w:noWrap/>
+            <w:hideMark/>
+          </w:tcPr>
+          <w:p>
+            <w:pPr>
+              <w:rPr>
+                <w:sz w:val="22"/>
+                <w:szCs w:val="22"/>
+              </w:rPr>
+            </w:pPr>
+            <w:r>
+              <w:rPr>
+                <w:sz w:val="22"/>
+                <w:szCs w:val="22"/>
+              </w:rPr>
+              <w:t>TADA.MonitoringLocationIdentifier</w:t>
+            </w:r>
+          </w:p>
+        </w:tc>
+        <w:tc>
+          <w:tcPr>
+            <w:tcW w:w="5324" w:type="dxa"/>
+            <w:noWrap/>
+            <w:hideMark/>
+          </w:tcPr>
+          <w:p>
+            <w:pPr>
+              <w:rPr>
+                <w:sz w:val="22"/>
+                <w:szCs w:val="22"/>
+              </w:rPr>
+            </w:pPr>
+            <w:r>
+              <w:rPr>
+                <w:sz w:val="22"/>
+                <w:szCs w:val="22"/>
+              </w:rPr>
+              <w:t>TADA-standardized version of MonitoringLocationIdentifier. A designator used to describe the unique name, number, or code assigned to identify the monitoring location.</w:t>
+            </w:r>
+          </w:p>
+        </w:tc>
+      </w:tr>
+      <w:tr>
+        <w:trPr>
+          <w:trHeight w:val="323"/>
+        </w:trPr>
+        <w:tc>
+          <w:tcPr>
+            <w:tcW w:w="2972" w:type="dxa"/>
+            <w:noWrap/>
+            <w:hideMark/>
+          </w:tcPr>
+          <w:p>
+            <w:pPr>
+              <w:rPr>
+                <w:sz w:val="22"/>
+                <w:szCs w:val="22"/>
+              </w:rPr>
+            </w:pPr>
+            <w:r>
+              <w:rPr>
+                <w:sz w:val="22"/>
+                <w:szCs w:val="22"/>
+              </w:rPr>
+              <w:t>TADA.MonitoringLocationName</w:t>
+            </w:r>
+          </w:p>
+        </w:tc>
+        <w:tc>
+          <w:tcPr>
+            <w:tcW w:w="5324" w:type="dxa"/>
+            <w:noWrap/>
+            <w:hideMark/>
+          </w:tcPr>
+          <w:p>
+            <w:pPr>
+              <w:rPr>
+                <w:sz w:val="22"/>
+                <w:szCs w:val="22"/>
+              </w:rPr>
+            </w:pPr>
+            <w:r>
+              <w:rPr>
+                <w:sz w:val="22"/>
+                <w:szCs w:val="22"/>
+              </w:rPr>
+              <w:t>TADA-standardized version of MonitoringLocationName. The designator specified by the sampling organization for the site at which sampling or other activities are conducted.</w:t>
+            </w:r>
+          </w:p>
+        </w:tc>
+      </w:tr>
+      <w:tr>
+        <w:trPr>
+          <w:trHeight w:val="323"/>
+        </w:trPr>
+        <w:tc>
+          <w:tcPr>
+            <w:tcW w:w="2972" w:type="dxa"/>
+            <w:noWrap/>
+            <w:hideMark/>
+          </w:tcPr>
+          <w:p>
+            <w:pPr>
+              <w:rPr>
+                <w:sz w:val="22"/>
+                <w:szCs w:val="22"/>
+              </w:rPr>
+            </w:pPr>
+            <w:r>
+              <w:rPr>
+                <w:sz w:val="22"/>
+                <w:szCs w:val="22"/>
+              </w:rPr>
+              <w:t>TADA.LongitudeMeasure</w:t>
+            </w:r>
+          </w:p>
+        </w:tc>
+        <w:tc>
+          <w:tcPr>
+            <w:tcW w:w="5324" w:type="dxa"/>
+            <w:noWrap/>
+            <w:hideMark/>
+          </w:tcPr>
+          <w:p>
+            <w:pPr>
+              <w:rPr>
+                <w:sz w:val="22"/>
+                <w:szCs w:val="22"/>
+              </w:rPr>
+            </w:pPr>
+            <w:r>
+              <w:rPr>
+                <w:sz w:val="22"/>
+                <w:szCs w:val="22"/>
+              </w:rPr>
+              <w:t>TADA-standarized version of LongitudeMeasure. The measure of the angular distance on a meridian east or west of the prime meridian.</w:t>
+            </w:r>
+          </w:p>
+        </w:tc>
+      </w:tr>
+      <w:tr>
+        <w:trPr>
+          <w:trHeight w:val="323"/>
+        </w:trPr>
+        <w:tc>
+          <w:tcPr>
+            <w:tcW w:w="2972" w:type="dxa"/>
+            <w:noWrap/>
+            <w:hideMark/>
+          </w:tcPr>
+          <w:p>
+            <w:pPr>
+              <w:rPr>
+                <w:sz w:val="22"/>
+                <w:szCs w:val="22"/>
+              </w:rPr>
+            </w:pPr>
+            <w:r>
+              <w:rPr>
+                <w:sz w:val="22"/>
+                <w:szCs w:val="22"/>
+              </w:rPr>
+              <w:t>TADA.LatitudeMeasure</w:t>
+            </w:r>
+          </w:p>
+        </w:tc>
+        <w:tc>
+          <w:tcPr>
+            <w:tcW w:w="5324" w:type="dxa"/>
+            <w:noWrap/>
+            <w:hideMark/>
+          </w:tcPr>
+          <w:p>
+            <w:pPr>
+              <w:rPr>
+                <w:sz w:val="22"/>
+                <w:szCs w:val="22"/>
+              </w:rPr>
+            </w:pPr>
+            <w:r>
+              <w:rPr>
+                <w:sz w:val="22"/>
+                <w:szCs w:val="22"/>
+              </w:rPr>
+              <w:t>TADA-standarized version of LatitudeMeasure. The measure of the angular distance on a meridian north or south of the equator.</w:t>
+            </w:r>
+          </w:p>
+        </w:tc>
+      </w:tr>
+      <w:tr>
+        <w:trPr>
+          <w:trHeight w:val="323"/>
+        </w:trPr>
+        <w:tc>
+          <w:tcPr>
+            <w:tcW w:w="2972" w:type="dxa"/>
+            <w:noWrap/>
+            <w:hideMark/>
+          </w:tcPr>
+          <w:p>
+            <w:pPr>
+              <w:rPr>
+                <w:sz w:val="22"/>
+                <w:szCs w:val="22"/>
+              </w:rPr>
+            </w:pPr>
+            <w:r>
+              <w:rPr>
+                <w:sz w:val="22"/>
+                <w:szCs w:val="22"/>
+              </w:rPr>
+              <w:lastRenderedPageBreak/>
+              <w:t>JoinToAU.AssessmentUnitIdentifier</w:t>
+            </w:r>
+          </w:p>
+        </w:tc>
+        <w:tc>
+          <w:tcPr>
+            <w:tcW w:w="5324" w:type="dxa"/>
+            <w:noWrap/>
+            <w:hideMark/>
+          </w:tcPr>
+          <w:p>
+            <w:pPr>
+              <w:rPr>
+                <w:sz w:val="22"/>
+                <w:szCs w:val="22"/>
+              </w:rPr>
+            </w:pPr>
+            <w:r>
+              <w:rPr>
+                <w:sz w:val="22"/>
+                <w:szCs w:val="22"/>
+              </w:rPr>
+              <w:t>The assessment unit identifier</w:t>
+            </w:r>
+          </w:p>
+        </w:tc>
+      </w:tr>
+      <w:tr>
+        <w:trPr>
+          <w:trHeight w:val="323"/>
+        </w:trPr>
+        <w:tc>
+          <w:tcPr>
+            <w:tcW w:w="2972" w:type="dxa"/>
+            <w:noWrap/>
+            <w:hideMark/>
+          </w:tcPr>
+          <w:p>
+            <w:pPr>
+              <w:rPr>
+                <w:sz w:val="22"/>
+                <w:szCs w:val="22"/>
+              </w:rPr>
+            </w:pPr>
+            <w:r>
+              <w:rPr>
+                <w:sz w:val="22"/>
+                <w:szCs w:val="22"/>
+              </w:rPr>
+              <w:t>ATTAINS.OrganizationIdentifier</w:t>
+            </w:r>
+          </w:p>
+        </w:tc>
+        <w:tc>
+          <w:tcPr>
+            <w:tcW w:w="5324" w:type="dxa"/>
+            <w:noWrap/>
+            <w:hideMark/>
+          </w:tcPr>
+          <w:p>
+            <w:pPr>
+              <w:rPr>
+                <w:sz w:val="22"/>
+                <w:szCs w:val="22"/>
+              </w:rPr>
+            </w:pPr>
+            <w:r>
+              <w:rPr>
+                <w:sz w:val="22"/>
+                <w:szCs w:val="22"/>
+              </w:rPr>
+              <w:t>The ATTAINS organization identifier</w:t>
+            </w:r>
+          </w:p>
+        </w:tc>
+      </w:tr>
+      <w:tr>
+        <w:trPr>
+          <w:trHeight w:val="323"/>
+        </w:trPr>
+        <w:tc>
+          <w:tcPr>
+            <w:tcW w:w="2972" w:type="dxa"/>
+            <w:noWrap/>
+            <w:hideMark/>
+          </w:tcPr>
+          <w:p>
+            <w:pPr>
+              <w:rPr>
+                <w:sz w:val="22"/>
+                <w:szCs w:val="22"/>
+              </w:rPr>
+            </w:pPr>
+            <w:r>
+              <w:rPr>
+                <w:sz w:val="22"/>
+                <w:szCs w:val="22"/>
+              </w:rPr>
+              <w:t>ATTAINS.ParameterName</w:t>
+            </w:r>
+          </w:p>
+        </w:tc>
+        <w:tc>
+          <w:tcPr>
+            <w:tcW w:w="5324" w:type="dxa"/>
+            <w:noWrap/>
+            <w:hideMark/>
+          </w:tcPr>
+          <w:p>
+            <w:pPr>
+              <w:rPr>
+                <w:sz w:val="22"/>
+                <w:szCs w:val="22"/>
+              </w:rPr>
+            </w:pPr>
+            <w:r>
+              <w:rPr>
+                <w:sz w:val="22"/>
+                <w:szCs w:val="22"/>
+              </w:rPr>
+              <w:t>The ATTAINS parameter name</w:t>
+            </w:r>
+          </w:p>
+        </w:tc>
+      </w:tr>
+      <w:tr>
+        <w:trPr>
+          <w:trHeight w:val="323"/>
+        </w:trPr>
+        <w:tc>
+          <w:tcPr>
+            <w:tcW w:w="2972" w:type="dxa"/>
+            <w:noWrap/>
+            <w:hideMark/>
+          </w:tcPr>
+          <w:p>
+            <w:pPr>
+              <w:rPr>
+                <w:sz w:val="22"/>
+                <w:szCs w:val="22"/>
+              </w:rPr>
+            </w:pPr>
+            <w:r>
+              <w:rPr>
+                <w:sz w:val="22"/>
+                <w:szCs w:val="22"/>
+              </w:rPr>
+              <w:t>ATTAINS.UseName</w:t>
+            </w:r>
+          </w:p>
+        </w:tc>
+        <w:tc>
+          <w:tcPr>
+            <w:tcW w:w="5324" w:type="dxa"/>
+            <w:noWrap/>
+            <w:hideMark/>
+          </w:tcPr>
+          <w:p>
+            <w:pPr>
+              <w:rPr>
+                <w:sz w:val="22"/>
+                <w:szCs w:val="22"/>
+              </w:rPr>
+            </w:pPr>
+            <w:r>
+              <w:rPr>
+                <w:sz w:val="22"/>
+                <w:szCs w:val="22"/>
+              </w:rPr>
+              <w:t>The ATTAINS use name of an assessment unit</w:t>
+            </w:r>
+          </w:p>
+        </w:tc>
+      </w:tr>
+      <w:tr>
+        <w:trPr>
+          <w:trHeight w:val="323"/>
+        </w:trPr>
+        <w:tc>
+          <w:tcPr>
+            <w:tcW w:w="2972" w:type="dxa"/>
+            <w:noWrap/>
+            <w:hideMark/>
+          </w:tcPr>
+          <w:p>
+            <w:pPr>
+              <w:rPr>
+                <w:sz w:val="22"/>
+                <w:szCs w:val="22"/>
+              </w:rPr>
+            </w:pPr>
+            <w:r>
+              <w:rPr>
+                <w:sz w:val="22"/>
+                <w:szCs w:val="22"/>
+              </w:rPr>
+              <w:t>AcuteChronic</w:t>
+            </w:r>
+          </w:p>
+        </w:tc>
+        <w:tc>
+          <w:tcPr>
+            <w:tcW w:w="5324" w:type="dxa"/>
+            <w:noWrap/>
+            <w:hideMark/>
+          </w:tcPr>
+          <w:p>
+            <w:pPr>
+              <w:rPr>
+                <w:sz w:val="22"/>
+                <w:szCs w:val="22"/>
+              </w:rPr>
+            </w:pPr>
+            <w:r>
+              <w:rPr>
+                <w:sz w:val="22"/>
+                <w:szCs w:val="22"/>
+              </w:rPr>
+              <w:t>Acute or chronic criteria category</w:t>
+            </w:r>
+          </w:p>
+        </w:tc>
+      </w:tr>
+      <w:tr>
+        <w:trPr>
+          <w:trHeight w:val="323"/>
+        </w:trPr>
+        <w:tc>
+          <w:tcPr>
+            <w:tcW w:w="2972" w:type="dxa"/>
+            <w:noWrap/>
+            <w:hideMark/>
+          </w:tcPr>
+          <w:p>
+            <w:pPr>
+              <w:rPr>
+                <w:sz w:val="22"/>
+                <w:szCs w:val="22"/>
+              </w:rPr>
+            </w:pPr>
+            <w:r>
+              <w:rPr>
+                <w:sz w:val="22"/>
+                <w:szCs w:val="22"/>
+              </w:rPr>
+              <w:t>UniqueSpatialCriteria</w:t>
+            </w:r>
+          </w:p>
+        </w:tc>
+        <w:tc>
+          <w:tcPr>
+            <w:tcW w:w="5324" w:type="dxa"/>
+            <w:noWrap/>
+            <w:hideMark/>
+          </w:tcPr>
+          <w:p>
+            <w:pPr>
+              <w:rPr>
+                <w:sz w:val="22"/>
+                <w:szCs w:val="22"/>
+              </w:rPr>
+            </w:pPr>
+            <w:r>
+              <w:rPr>
+                <w:sz w:val="22"/>
+                <w:szCs w:val="22"/>
+              </w:rPr>
+              <w:t>The unique spatial criteria information</w:t>
+            </w:r>
+          </w:p>
+        </w:tc>
+      </w:tr>
+      <w:tr>
+        <w:trPr>
+          <w:trHeight w:val="323"/>
+        </w:trPr>
+        <w:tc>
+          <w:tcPr>
+            <w:tcW w:w="2972" w:type="dxa"/>
+            <w:noWrap/>
+            <w:hideMark/>
+          </w:tcPr>
+          <w:p>
+            <w:pPr>
+              <w:rPr>
+                <w:sz w:val="22"/>
+                <w:szCs w:val="22"/>
+              </w:rPr>
+            </w:pPr>
+            <w:r>
+              <w:rPr>
+                <w:sz w:val="22"/>
+                <w:szCs w:val="22"/>
+              </w:rPr>
+              <w:t>Season</w:t>
+            </w:r>
+          </w:p>
+        </w:tc>
+        <w:tc>
+          <w:tcPr>
+            <w:tcW w:w="5324" w:type="dxa"/>
+            <w:noWrap/>
+            <w:hideMark/>
+          </w:tcPr>
+          <w:p>
+            <w:pPr>
+              <w:rPr>
+                <w:sz w:val="22"/>
+                <w:szCs w:val="22"/>
+              </w:rPr>
+            </w:pPr>
+            <w:r>
+              <w:rPr>
+                <w:sz w:val="22"/>
+                <w:szCs w:val="22"/>
+              </w:rPr>
+              <w:t>The season criteria information</w:t>
+            </w:r>
+          </w:p>
+        </w:tc>
+      </w:tr>
+      <w:tr>
+        <w:trPr>
+          <w:trHeight w:val="323"/>
+        </w:trPr>
+        <w:tc>
+          <w:tcPr>
+            <w:tcW w:w="2972" w:type="dxa"/>
+            <w:noWrap/>
+            <w:hideMark/>
+          </w:tcPr>
+          <w:p>
+            <w:pPr>
+              <w:rPr>
+                <w:sz w:val="22"/>
+                <w:szCs w:val="22"/>
+              </w:rPr>
+            </w:pPr>
+            <w:r>
+              <w:rPr>
+                <w:sz w:val="22"/>
+                <w:szCs w:val="22"/>
+              </w:rPr>
+              <w:t>EquationBased</w:t>
+            </w:r>
+          </w:p>
+        </w:tc>
+        <w:tc>
+          <w:tcPr>
+            <w:tcW w:w="5324" w:type="dxa"/>
+            <w:noWrap/>
+            <w:hideMark/>
+          </w:tcPr>
+          <w:p>
+            <w:pPr>
+              <w:rPr>
+                <w:sz w:val="22"/>
+                <w:szCs w:val="22"/>
+              </w:rPr>
+            </w:pPr>
+            <w:r>
+              <w:rPr>
+                <w:sz w:val="22"/>
+                <w:szCs w:val="22"/>
+              </w:rPr>
+              <w:t>Whether the criteria is based on an equation with covariates or is a fixed magnitude</w:t>
+            </w:r>
+          </w:p>
+        </w:tc>
+      </w:tr>
+      <w:tr>
+        <w:trPr>
+          <w:trHeight w:val="323"/>
+        </w:trPr>
+        <w:tc>
+          <w:tcPr>
+            <w:tcW w:w="2972" w:type="dxa"/>
+            <w:noWrap/>
+            <w:hideMark/>
+          </w:tcPr>
+          <w:p>
+            <w:pPr>
+              <w:rPr>
+                <w:sz w:val="22"/>
+                <w:szCs w:val="22"/>
+              </w:rPr>
+            </w:pPr>
+            <w:r>
+              <w:rPr>
+                <w:sz w:val="22"/>
+                <w:szCs w:val="22"/>
+              </w:rPr>
+              <w:t>EquationType</w:t>
+            </w:r>
+          </w:p>
+        </w:tc>
+        <w:tc>
+          <w:tcPr>
+            <w:tcW w:w="5324" w:type="dxa"/>
+            <w:noWrap/>
+            <w:hideMark/>
+          </w:tcPr>
+          <w:p>
+            <w:pPr>
+              <w:rPr>
+                <w:sz w:val="22"/>
+                <w:szCs w:val="22"/>
+              </w:rPr>
+            </w:pPr>
+            <w:r>
+              <w:rPr>
+                <w:sz w:val="22"/>
+                <w:szCs w:val="22"/>
+              </w:rPr>
+              <w:t xml:space="preserve">The type of the equation if the criteria is equation-based </w:t>
+            </w:r>
+          </w:p>
+        </w:tc>
+      </w:tr>
+      <w:tr>
+        <w:trPr>
+          <w:trHeight w:val="323"/>
+        </w:trPr>
+        <w:tc>
+          <w:tcPr>
+            <w:tcW w:w="2972" w:type="dxa"/>
+            <w:noWrap/>
+            <w:hideMark/>
+          </w:tcPr>
+          <w:p>
+            <w:pPr>
+              <w:rPr>
+                <w:sz w:val="22"/>
+                <w:szCs w:val="22"/>
+              </w:rPr>
+            </w:pPr>
+            <w:r>
+              <w:rPr>
+                <w:sz w:val="22"/>
+                <w:szCs w:val="22"/>
+              </w:rPr>
+              <w:t>TADA.CharacteristicName</w:t>
+            </w:r>
+          </w:p>
+        </w:tc>
+        <w:tc>
+          <w:tcPr>
+            <w:tcW w:w="5324" w:type="dxa"/>
+            <w:noWrap/>
+            <w:hideMark/>
+          </w:tcPr>
+          <w:p>
+            <w:pPr>
+              <w:rPr>
+                <w:sz w:val="22"/>
+                <w:szCs w:val="22"/>
+              </w:rPr>
+            </w:pPr>
+            <w:r>
+              <w:rPr>
+                <w:sz w:val="22"/>
+                <w:szCs w:val="22"/>
+              </w:rPr>
+              <w:t>The object, property, or substance which is evaluated or enumerated by either a direct field measurement, a direct field observation, or by laboratory analysis of material collected in the field.  TADA-standardized variables are presented in uppercase and are the result of harmonization between USGS and WQX values, which may vary by case.</w:t>
+            </w:r>
+          </w:p>
+        </w:tc>
+      </w:tr>
+      <w:tr>
+        <w:trPr>
+          <w:trHeight w:val="323"/>
+        </w:trPr>
+        <w:tc>
+          <w:tcPr>
+            <w:tcW w:w="2972" w:type="dxa"/>
+            <w:noWrap/>
+            <w:hideMark/>
+          </w:tcPr>
+          <w:p>
+            <w:pPr>
+              <w:rPr>
+                <w:sz w:val="22"/>
+                <w:szCs w:val="22"/>
+              </w:rPr>
+            </w:pPr>
+            <w:r>
+              <w:rPr>
+                <w:sz w:val="22"/>
+                <w:szCs w:val="22"/>
+              </w:rPr>
+              <w:t>TADA.ResultSampleFractionText</w:t>
+            </w:r>
+          </w:p>
+        </w:tc>
+        <w:tc>
+          <w:tcPr>
+            <w:tcW w:w="5324" w:type="dxa"/>
+            <w:noWrap/>
+            <w:hideMark/>
+          </w:tcPr>
+          <w:p>
+            <w:pPr>
+              <w:rPr>
+                <w:sz w:val="22"/>
+                <w:szCs w:val="22"/>
+              </w:rPr>
+            </w:pPr>
+            <w:r>
+              <w:rPr>
+                <w:sz w:val="22"/>
+                <w:szCs w:val="22"/>
+              </w:rPr>
+              <w:t>The text name of the portion of the sample associated with results obtained from a physically-partitioned sample (e.g., dissolved).  TADA-standardized variables are presented in uppercase and are the result of harmonization between USGS and WQX values, which may vary by case.</w:t>
+            </w:r>
+          </w:p>
+        </w:tc>
+      </w:tr>
+      <w:tr>
+        <w:trPr>
+          <w:trHeight w:val="323"/>
+        </w:trPr>
+        <w:tc>
+          <w:tcPr>
+            <w:tcW w:w="2972" w:type="dxa"/>
+            <w:noWrap/>
+            <w:hideMark/>
+          </w:tcPr>
+          <w:p>
+            <w:pPr>
+              <w:rPr>
+                <w:sz w:val="22"/>
+                <w:szCs w:val="22"/>
+              </w:rPr>
+            </w:pPr>
+            <w:r>
+              <w:rPr>
+                <w:sz w:val="22"/>
+                <w:szCs w:val="22"/>
+              </w:rPr>
+              <w:t>TADA.MethodSpeciationName</w:t>
+            </w:r>
+          </w:p>
+        </w:tc>
+        <w:tc>
+          <w:tcPr>
+            <w:tcW w:w="5324" w:type="dxa"/>
+            <w:noWrap/>
+            <w:hideMark/>
+          </w:tcPr>
+          <w:p>
+            <w:pPr>
+              <w:rPr>
+                <w:sz w:val="22"/>
+                <w:szCs w:val="22"/>
+              </w:rPr>
+            </w:pPr>
+            <w:r>
+              <w:rPr>
+                <w:sz w:val="22"/>
+                <w:szCs w:val="22"/>
+              </w:rPr>
+              <w:t>Identifies the chemical speciation in which the measured result is expressed. TADA-standardized variables are presented in uppercase and are the result of harmonization between USGS and WQX values, which may vary by case.</w:t>
+            </w:r>
+          </w:p>
+        </w:tc>
+      </w:tr>
+      <w:tr>
+        <w:trPr>
+          <w:trHeight w:val="323"/>
+        </w:trPr>
+        <w:tc>
+          <w:tcPr>
+            <w:tcW w:w="2972" w:type="dxa"/>
+            <w:noWrap/>
+            <w:hideMark/>
+          </w:tcPr>
+          <w:p>
+            <w:pPr>
+              <w:rPr>
+                <w:sz w:val="22"/>
+                <w:szCs w:val="22"/>
+              </w:rPr>
+            </w:pPr>
+            <w:r>
+              <w:rPr>
+                <w:sz w:val="22"/>
+                <w:szCs w:val="22"/>
+              </w:rPr>
+              <w:t>TADA.ResultMeasure.MeasureUnitCode</w:t>
+            </w:r>
+          </w:p>
+        </w:tc>
+        <w:tc>
+          <w:tcPr>
+            <w:tcW w:w="5324" w:type="dxa"/>
+            <w:noWrap/>
+            <w:hideMark/>
+          </w:tcPr>
+          <w:p>
+            <w:pPr>
+              <w:rPr>
+                <w:sz w:val="22"/>
+                <w:szCs w:val="22"/>
+              </w:rPr>
+            </w:pPr>
+            <w:r>
+              <w:rPr>
+                <w:sz w:val="22"/>
+                <w:szCs w:val="22"/>
+              </w:rPr>
+              <w:t>TADA-standardized version of ResultMeasure.MeasureUnitCode. The code describing the units of the reportable measure of the result for the chemical, microbiological or other characteristic being analyzed.</w:t>
+            </w:r>
+          </w:p>
+        </w:tc>
+      </w:tr>
+      <w:tr>
+        <w:trPr>
+          <w:trHeight w:val="323"/>
+        </w:trPr>
+        <w:tc>
+          <w:tcPr>
+            <w:tcW w:w="2972" w:type="dxa"/>
+            <w:noWrap/>
+            <w:hideMark/>
+          </w:tcPr>
+          <w:p>
+            <w:pPr>
+              <w:rPr>
+                <w:sz w:val="22"/>
+                <w:szCs w:val="22"/>
+              </w:rPr>
+            </w:pPr>
+            <w:r>
+              <w:rPr>
+                <w:sz w:val="22"/>
+                <w:szCs w:val="22"/>
+              </w:rPr>
+              <w:t>Sample_Count</w:t>
+            </w:r>
+          </w:p>
+        </w:tc>
+        <w:tc>
+          <w:tcPr>
+            <w:tcW w:w="5324" w:type="dxa"/>
+            <w:noWrap/>
+            <w:hideMark/>
+          </w:tcPr>
+          <w:p>
+            <w:pPr>
+              <w:rPr>
+                <w:sz w:val="22"/>
+                <w:szCs w:val="22"/>
+              </w:rPr>
+            </w:pPr>
+            <w:r>
+              <w:rPr>
+                <w:sz w:val="22"/>
+                <w:szCs w:val="22"/>
+              </w:rPr>
+              <w:t>Sample size in a site</w:t>
+            </w:r>
+          </w:p>
+        </w:tc>
+      </w:tr>
+      <w:tr>
+        <w:trPr>
+          <w:trHeight w:val="323"/>
+        </w:trPr>
+        <w:tc>
+          <w:tcPr>
+            <w:tcW w:w="2972" w:type="dxa"/>
+            <w:noWrap/>
+            <w:hideMark/>
+          </w:tcPr>
+          <w:p>
+            <w:pPr>
+              <w:rPr>
+                <w:sz w:val="22"/>
+                <w:szCs w:val="22"/>
+              </w:rPr>
+            </w:pPr>
+            <w:r>
+              <w:rPr>
+                <w:sz w:val="22"/>
+                <w:szCs w:val="22"/>
+              </w:rPr>
+              <w:lastRenderedPageBreak/>
+              <w:t>Start_Date</w:t>
+            </w:r>
+          </w:p>
+        </w:tc>
+        <w:tc>
+          <w:tcPr>
+            <w:tcW w:w="5324" w:type="dxa"/>
+            <w:noWrap/>
+            <w:hideMark/>
+          </w:tcPr>
+          <w:p>
+            <w:pPr>
+              <w:rPr>
+                <w:sz w:val="22"/>
+                <w:szCs w:val="22"/>
+              </w:rPr>
+            </w:pPr>
+            <w:r>
+              <w:rPr>
+                <w:sz w:val="22"/>
+                <w:szCs w:val="22"/>
+              </w:rPr>
+              <w:t>The state date of the samples in a site</w:t>
+            </w:r>
+          </w:p>
+        </w:tc>
+      </w:tr>
+      <w:tr>
+        <w:trPr>
+          <w:trHeight w:val="323"/>
+        </w:trPr>
+        <w:tc>
+          <w:tcPr>
+            <w:tcW w:w="2972" w:type="dxa"/>
+            <w:noWrap/>
+            <w:hideMark/>
+          </w:tcPr>
+          <w:p>
+            <w:pPr>
+              <w:rPr>
+                <w:sz w:val="22"/>
+                <w:szCs w:val="22"/>
+              </w:rPr>
+            </w:pPr>
+            <w:r>
+              <w:rPr>
+                <w:sz w:val="22"/>
+                <w:szCs w:val="22"/>
+              </w:rPr>
+              <w:t>End_Date</w:t>
+            </w:r>
+          </w:p>
+        </w:tc>
+        <w:tc>
+          <w:tcPr>
+            <w:tcW w:w="5324" w:type="dxa"/>
+            <w:noWrap/>
+            <w:hideMark/>
+          </w:tcPr>
+          <w:p>
+            <w:pPr>
+              <w:rPr>
+                <w:sz w:val="22"/>
+                <w:szCs w:val="22"/>
+              </w:rPr>
+            </w:pPr>
+            <w:r>
+              <w:rPr>
+                <w:sz w:val="22"/>
+                <w:szCs w:val="22"/>
+              </w:rPr>
+              <w:t>The end date of the samples in a site</w:t>
+            </w:r>
+          </w:p>
+        </w:tc>
+      </w:tr>
+      <w:tr>
+        <w:trPr>
+          <w:trHeight w:val="323"/>
+        </w:trPr>
+        <w:tc>
+          <w:tcPr>
+            <w:tcW w:w="2972" w:type="dxa"/>
+            <w:noWrap/>
+            <w:hideMark/>
+          </w:tcPr>
+          <w:p>
+            <w:pPr>
+              <w:rPr>
+                <w:sz w:val="22"/>
+                <w:szCs w:val="22"/>
+              </w:rPr>
+            </w:pPr>
+            <w:r>
+              <w:rPr>
+                <w:sz w:val="22"/>
+                <w:szCs w:val="22"/>
+              </w:rPr>
+              <w:t>Minimum</w:t>
+            </w:r>
+          </w:p>
+        </w:tc>
+        <w:tc>
+          <w:tcPr>
+            <w:tcW w:w="5324" w:type="dxa"/>
+            <w:noWrap/>
+            <w:hideMark/>
+          </w:tcPr>
+          <w:p>
+            <w:pPr>
+              <w:rPr>
+                <w:sz w:val="22"/>
+                <w:szCs w:val="22"/>
+              </w:rPr>
+            </w:pPr>
+            <w:r>
+              <w:rPr>
+                <w:sz w:val="22"/>
+                <w:szCs w:val="22"/>
+              </w:rPr>
+              <w:t>The minimum value in a site</w:t>
+            </w:r>
+          </w:p>
+        </w:tc>
+      </w:tr>
+      <w:tr>
+        <w:trPr>
+          <w:trHeight w:val="323"/>
+        </w:trPr>
+        <w:tc>
+          <w:tcPr>
+            <w:tcW w:w="2972" w:type="dxa"/>
+            <w:noWrap/>
+            <w:hideMark/>
+          </w:tcPr>
+          <w:p>
+            <w:pPr>
+              <w:rPr>
+                <w:sz w:val="22"/>
+                <w:szCs w:val="22"/>
+              </w:rPr>
+            </w:pPr>
+            <w:r>
+              <w:rPr>
+                <w:sz w:val="22"/>
+                <w:szCs w:val="22"/>
+              </w:rPr>
+              <w:t>Median</w:t>
+            </w:r>
+          </w:p>
+        </w:tc>
+        <w:tc>
+          <w:tcPr>
+            <w:tcW w:w="5324" w:type="dxa"/>
+            <w:noWrap/>
+            <w:hideMark/>
+          </w:tcPr>
+          <w:p>
+            <w:pPr>
+              <w:rPr>
+                <w:sz w:val="22"/>
+                <w:szCs w:val="22"/>
+              </w:rPr>
+            </w:pPr>
+            <w:r>
+              <w:rPr>
+                <w:sz w:val="22"/>
+                <w:szCs w:val="22"/>
+              </w:rPr>
+              <w:t>The median value in a site</w:t>
+            </w:r>
+          </w:p>
+        </w:tc>
+      </w:tr>
+      <w:tr>
+        <w:trPr>
+          <w:trHeight w:val="323"/>
+        </w:trPr>
+        <w:tc>
+          <w:tcPr>
+            <w:tcW w:w="2972" w:type="dxa"/>
+            <w:noWrap/>
+            <w:hideMark/>
+          </w:tcPr>
+          <w:p>
+            <w:pPr>
+              <w:rPr>
+                <w:sz w:val="22"/>
+                <w:szCs w:val="22"/>
+              </w:rPr>
+            </w:pPr>
+            <w:r>
+              <w:rPr>
+                <w:sz w:val="22"/>
+                <w:szCs w:val="22"/>
+              </w:rPr>
+              <w:t>Maximum</w:t>
+            </w:r>
+          </w:p>
+        </w:tc>
+        <w:tc>
+          <w:tcPr>
+            <w:tcW w:w="5324" w:type="dxa"/>
+            <w:noWrap/>
+            <w:hideMark/>
+          </w:tcPr>
+          <w:p>
+            <w:pPr>
+              <w:rPr>
+                <w:sz w:val="22"/>
+                <w:szCs w:val="22"/>
+              </w:rPr>
+            </w:pPr>
+            <w:r>
+              <w:rPr>
+                <w:sz w:val="22"/>
+                <w:szCs w:val="22"/>
+              </w:rPr>
+              <w:t>The maximum in a site</w:t>
+            </w:r>
+          </w:p>
+        </w:tc>
+      </w:tr>
+      <w:tr>
+        <w:trPr>
+          <w:trHeight w:val="323"/>
+        </w:trPr>
+        <w:tc>
+          <w:tcPr>
+            <w:tcW w:w="2972" w:type="dxa"/>
+            <w:noWrap/>
+            <w:hideMark/>
+          </w:tcPr>
+          <w:p>
+            <w:pPr>
+              <w:rPr>
+                <w:sz w:val="22"/>
+                <w:szCs w:val="22"/>
+              </w:rPr>
+            </w:pPr>
+            <w:r>
+              <w:rPr>
+                <w:sz w:val="22"/>
+                <w:szCs w:val="22"/>
+              </w:rPr>
+              <w:t>Number_of_Excursions</w:t>
+            </w:r>
+          </w:p>
+        </w:tc>
+        <w:tc>
+          <w:tcPr>
+            <w:tcW w:w="5324" w:type="dxa"/>
+            <w:noWrap/>
+            <w:hideMark/>
+          </w:tcPr>
+          <w:p>
+            <w:pPr>
+              <w:rPr>
+                <w:sz w:val="22"/>
+                <w:szCs w:val="22"/>
+              </w:rPr>
+            </w:pPr>
+            <w:r>
+              <w:rPr>
+                <w:sz w:val="22"/>
+                <w:szCs w:val="22"/>
+              </w:rPr>
+              <w:t>The number of excursions in a site</w:t>
+            </w:r>
+          </w:p>
+        </w:tc>
+      </w:tr>
+      <w:tr>
+        <w:trPr>
+          <w:trHeight w:val="323"/>
+        </w:trPr>
+        <w:tc>
+          <w:tcPr>
+            <w:tcW w:w="2972" w:type="dxa"/>
+            <w:noWrap/>
+            <w:hideMark/>
+          </w:tcPr>
+          <w:p>
+            <w:pPr>
+              <w:rPr>
+                <w:sz w:val="22"/>
+                <w:szCs w:val="22"/>
+              </w:rPr>
+            </w:pPr>
+            <w:r>
+              <w:rPr>
+                <w:sz w:val="22"/>
+                <w:szCs w:val="22"/>
+              </w:rPr>
+              <w:t>Excursion_Percentage</w:t>
+            </w:r>
+          </w:p>
+        </w:tc>
+        <w:tc>
+          <w:tcPr>
+            <w:tcW w:w="5324" w:type="dxa"/>
+            <w:noWrap/>
+            <w:hideMark/>
+          </w:tcPr>
+          <w:p>
+            <w:pPr>
+              <w:rPr>
+                <w:sz w:val="22"/>
+                <w:szCs w:val="22"/>
+              </w:rPr>
+            </w:pPr>
+            <w:r>
+              <w:rPr>
+                <w:sz w:val="22"/>
+                <w:szCs w:val="22"/>
+              </w:rPr>
+              <w:t>The percentage of excursion in a site</w:t>
+            </w:r>
+          </w:p>
+        </w:tc>
+      </w:tr>
+      <w:tr>
+        <w:trPr>
+          <w:trHeight w:val="323"/>
+        </w:trPr>
+        <w:tc>
+          <w:tcPr>
+            <w:tcW w:w="2972" w:type="dxa"/>
+            <w:noWrap/>
+            <w:hideMark/>
+          </w:tcPr>
+          <w:p>
+            <w:pPr>
+              <w:rPr>
+                <w:sz w:val="22"/>
+                <w:szCs w:val="22"/>
+              </w:rPr>
+            </w:pPr>
+            <w:r>
+              <w:rPr>
+                <w:sz w:val="22"/>
+                <w:szCs w:val="22"/>
+              </w:rPr>
+              <w:t>Duration_Excursions</w:t>
+            </w:r>
+          </w:p>
+        </w:tc>
+        <w:tc>
+          <w:tcPr>
+            <w:tcW w:w="5324" w:type="dxa"/>
+            <w:noWrap/>
+            <w:hideMark/>
+          </w:tcPr>
+          <w:p>
+            <w:pPr>
+              <w:rPr>
+                <w:sz w:val="22"/>
+                <w:szCs w:val="22"/>
+              </w:rPr>
+            </w:pPr>
+            <w:r>
+              <w:rPr>
+                <w:sz w:val="22"/>
+                <w:szCs w:val="22"/>
+              </w:rPr>
+              <w:t>The number of excursions based on the duration method in a site</w:t>
+            </w:r>
+          </w:p>
+        </w:tc>
+      </w:tr>
+      <w:tr>
+        <w:trPr>
+          <w:trHeight w:val="323"/>
+        </w:trPr>
+        <w:tc>
+          <w:tcPr>
+            <w:tcW w:w="2972" w:type="dxa"/>
+            <w:noWrap/>
+            <w:hideMark/>
+          </w:tcPr>
+          <w:p>
+            <w:pPr>
+              <w:rPr>
+                <w:sz w:val="22"/>
+                <w:szCs w:val="22"/>
+              </w:rPr>
+            </w:pPr>
+            <w:r>
+              <w:rPr>
+                <w:sz w:val="22"/>
+                <w:szCs w:val="22"/>
+              </w:rPr>
+              <w:t>Duration_Percentage</w:t>
+            </w:r>
+          </w:p>
+        </w:tc>
+        <w:tc>
+          <w:tcPr>
+            <w:tcW w:w="5324" w:type="dxa"/>
+            <w:noWrap/>
+            <w:hideMark/>
+          </w:tcPr>
+          <w:p>
+            <w:pPr>
+              <w:rPr>
+                <w:sz w:val="22"/>
+                <w:szCs w:val="22"/>
+              </w:rPr>
+            </w:pPr>
+            <w:r>
+              <w:rPr>
+                <w:sz w:val="22"/>
+                <w:szCs w:val="22"/>
+              </w:rPr>
+              <w:t>The percentage of excursions based on the duration method in a site</w:t>
+            </w:r>
+          </w:p>
+        </w:tc>
+      </w:tr>
+      <w:tr>
+        <w:trPr>
+          <w:trHeight w:val="323"/>
+        </w:trPr>
+        <w:tc>
+          <w:tcPr>
+            <w:tcW w:w="2972" w:type="dxa"/>
+            <w:noWrap/>
+            <w:hideMark/>
+          </w:tcPr>
+          <w:p>
+            <w:pPr>
+              <w:rPr>
+                <w:sz w:val="22"/>
+                <w:szCs w:val="22"/>
+              </w:rPr>
+            </w:pPr>
+            <w:r>
+              <w:rPr>
+                <w:sz w:val="22"/>
+                <w:szCs w:val="22"/>
+              </w:rPr>
+              <w:t>Exceedance</w:t>
+            </w:r>
+          </w:p>
+        </w:tc>
+        <w:tc>
+          <w:tcPr>
+            <w:tcW w:w="5324" w:type="dxa"/>
+            <w:noWrap/>
+            <w:hideMark/>
+          </w:tcPr>
+          <w:p>
+            <w:pPr>
+              <w:rPr>
+                <w:sz w:val="22"/>
+                <w:szCs w:val="22"/>
+              </w:rPr>
+            </w:pPr>
+            <w:r>
+              <w:rPr>
+                <w:sz w:val="22"/>
+                <w:szCs w:val="22"/>
+              </w:rPr>
+              <w:t>Whether the parameter exceeds or does not exceed based on the duration and frequency methods</w:t>
+            </w:r>
+          </w:p>
+        </w:tc>
+      </w:tr>
+      <w:tr>
+        <w:trPr>
+          <w:trHeight w:val="323"/>
+        </w:trPr>
+        <w:tc>
+          <w:tcPr>
+            <w:tcW w:w="2972" w:type="dxa"/>
+            <w:noWrap/>
+            <w:hideMark/>
+          </w:tcPr>
+          <w:p>
+            <w:pPr>
+              <w:rPr>
+                <w:sz w:val="22"/>
+                <w:szCs w:val="22"/>
+              </w:rPr>
+            </w:pPr>
+            <w:r>
+              <w:rPr>
+                <w:sz w:val="22"/>
+                <w:szCs w:val="22"/>
+              </w:rPr>
+              <w:t>Sufficient_Data</w:t>
+            </w:r>
+          </w:p>
+        </w:tc>
+        <w:tc>
+          <w:tcPr>
+            <w:tcW w:w="5324" w:type="dxa"/>
+            <w:noWrap/>
+            <w:hideMark/>
+          </w:tcPr>
+          <w:p>
+            <w:pPr>
+              <w:rPr>
+                <w:sz w:val="22"/>
+                <w:szCs w:val="22"/>
+              </w:rPr>
+            </w:pPr>
+            <w:r>
+              <w:rPr>
+                <w:sz w:val="22"/>
+                <w:szCs w:val="22"/>
+              </w:rPr>
+              <w:t>Whether the sample size is sufficient or insufficient</w:t>
+            </w:r>
+          </w:p>
+        </w:tc>
+      </w:tr>
+      <w:tr>
+        <w:trPr>
+          <w:trHeight w:val="323"/>
+        </w:trPr>
+        <w:tc>
+          <w:tcPr>
+            <w:tcW w:w="2972" w:type="dxa"/>
+            <w:noWrap/>
+            <w:hideMark/>
+          </w:tcPr>
+          <w:p>
+            <w:pPr>
+              <w:rPr>
+                <w:sz w:val="22"/>
+                <w:szCs w:val="22"/>
+              </w:rPr>
+            </w:pPr>
+            <w:r>
+              <w:rPr>
+                <w:sz w:val="22"/>
+                <w:szCs w:val="22"/>
+              </w:rPr>
+              <w:t>Duration</w:t>
+            </w:r>
+          </w:p>
+        </w:tc>
+        <w:tc>
+          <w:tcPr>
+            <w:tcW w:w="5324" w:type="dxa"/>
+            <w:noWrap/>
+            <w:hideMark/>
+          </w:tcPr>
+          <w:p>
+            <w:pPr>
+              <w:rPr>
+                <w:sz w:val="22"/>
+                <w:szCs w:val="22"/>
+              </w:rPr>
+            </w:pPr>
+            <w:r>
+              <w:rPr>
+                <w:sz w:val="22"/>
+                <w:szCs w:val="22"/>
+              </w:rPr>
+              <w:t>The duration value, method, and unit</w:t>
+            </w:r>
+          </w:p>
+        </w:tc>
+      </w:tr>
+      <w:tr>
+        <w:trPr>
+          <w:trHeight w:val="323"/>
+        </w:trPr>
+        <w:tc>
+          <w:tcPr>
+            <w:tcW w:w="2972" w:type="dxa"/>
+            <w:noWrap/>
+            <w:hideMark/>
+          </w:tcPr>
+          <w:p>
+            <w:pPr>
+              <w:rPr>
+                <w:sz w:val="22"/>
+                <w:szCs w:val="22"/>
+              </w:rPr>
+            </w:pPr>
+            <w:r>
+              <w:rPr>
+                <w:sz w:val="22"/>
+                <w:szCs w:val="22"/>
+              </w:rPr>
+              <w:t>Frequency</w:t>
+            </w:r>
+          </w:p>
+        </w:tc>
+        <w:tc>
+          <w:tcPr>
+            <w:tcW w:w="5324" w:type="dxa"/>
+            <w:noWrap/>
+            <w:hideMark/>
+          </w:tcPr>
+          <w:p>
+            <w:pPr>
+              <w:rPr>
+                <w:sz w:val="22"/>
+                <w:szCs w:val="22"/>
+              </w:rPr>
+            </w:pPr>
+            <w:r>
+              <w:rPr>
+                <w:sz w:val="22"/>
+                <w:szCs w:val="22"/>
+              </w:rPr>
+              <w:t>The frequency value and method</w:t>
+            </w:r>
+          </w:p>
+        </w:tc>
+      </w:tr>
+    </w:tbl>
+    <w:p>
+      <w:pPr>
+        <w:rPr>
+          <w:rFonts w:hint="eastAsia"/>
+          <w:b/>
+          <w:bCs/>
+        </w:rPr>
+      </w:pPr>
+    </w:p>
     <w:sectPr>
       <w:pgSz w:w="11906" w:h="16838"/>
       <w:pgMar w:top="1440" w:right="1800" w:bottom="1440" w:left="1800" w:header="851" w:footer="992" w:gutter="0"/>
@@ -908,6 +4099,95 @@
     </w:lvl>
   </w:abstractNum>
   <w:abstractNum w:abstractNumId="2" w15:restartNumberingAfterBreak="0">
+    <w:nsid w:val="44C91DD6"/>
+    <w:multiLevelType w:val="hybridMultilevel"/>
+    <w:tmpl w:val="DB60707C"/>
+    <w:lvl w:ilvl="0" w:tplc="C11E20A0">
+      <w:start w:val="1"/>
+      <w:numFmt w:val="decimal"/>
+      <w:lvlText w:val="%1."/>
+      <w:lvlJc w:val="left"/>
+      <w:pPr>
+        <w:ind w:left="360" w:hanging="360"/>
+      </w:pPr>
+      <w:rPr>
+        <w:rFonts w:hint="default"/>
+      </w:rPr>
+    </w:lvl>
+    <w:lvl w:ilvl="1" w:tplc="04090019" w:tentative="1">
+      <w:start w:val="1"/>
+      <w:numFmt w:val="ideographTraditional"/>
+      <w:lvlText w:val="%2、"/>
+      <w:lvlJc w:val="left"/>
+      <w:pPr>
+        <w:ind w:left="960" w:hanging="480"/>
+      </w:pPr>
+    </w:lvl>
+    <w:lvl w:ilvl="2" w:tplc="0409001B" w:tentative="1">
+      <w:start w:val="1"/>
+      <w:numFmt w:val="lowerRoman"/>
+      <w:lvlText w:val="%3."/>
+      <w:lvlJc w:val="right"/>
+      <w:pPr>
+        <w:ind w:left="1440" w:hanging="480"/>
+      </w:pPr>
+    </w:lvl>
+    <w:lvl w:ilvl="3" w:tplc="0409000F" w:tentative="1">
+      <w:start w:val="1"/>
+      <w:numFmt w:val="decimal"/>
+      <w:lvlText w:val="%4."/>
+      <w:lvlJc w:val="left"/>
+      <w:pPr>
+        <w:ind w:left="1920" w:hanging="480"/>
+      </w:pPr>
+    </w:lvl>
+    <w:lvl w:ilvl="4" w:tplc="04090019" w:tentative="1">
+      <w:start w:val="1"/>
+      <w:numFmt w:val="ideographTraditional"/>
+      <w:lvlText w:val="%5、"/>
+      <w:lvlJc w:val="left"/>
+      <w:pPr>
+        <w:ind w:left="2400" w:hanging="480"/>
+      </w:pPr>
+    </w:lvl>
+    <w:lvl w:ilvl="5" w:tplc="0409001B" w:tentative="1">
+      <w:start w:val="1"/>
+      <w:numFmt w:val="lowerRoman"/>
+      <w:lvlText w:val="%6."/>
+      <w:lvlJc w:val="right"/>
+      <w:pPr>
+        <w:ind w:left="2880" w:hanging="480"/>
+      </w:pPr>
+    </w:lvl>
+    <w:lvl w:ilvl="6" w:tplc="0409000F" w:tentative="1">
+      <w:start w:val="1"/>
+      <w:numFmt w:val="decimal"/>
+      <w:lvlText w:val="%7."/>
+      <w:lvlJc w:val="left"/>
+      <w:pPr>
+        <w:ind w:left="3360" w:hanging="480"/>
+      </w:pPr>
+    </w:lvl>
+    <w:lvl w:ilvl="7" w:tplc="04090019" w:tentative="1">
+      <w:start w:val="1"/>
+      <w:numFmt w:val="ideographTraditional"/>
+      <w:lvlText w:val="%8、"/>
+      <w:lvlJc w:val="left"/>
+      <w:pPr>
+        <w:ind w:left="3840" w:hanging="480"/>
+      </w:pPr>
+    </w:lvl>
+    <w:lvl w:ilvl="8" w:tplc="0409001B" w:tentative="1">
+      <w:start w:val="1"/>
+      <w:numFmt w:val="lowerRoman"/>
+      <w:lvlText w:val="%9."/>
+      <w:lvlJc w:val="right"/>
+      <w:pPr>
+        <w:ind w:left="4320" w:hanging="480"/>
+      </w:pPr>
+    </w:lvl>
+  </w:abstractNum>
+  <w:abstractNum w:abstractNumId="3" w15:restartNumberingAfterBreak="0">
     <w:nsid w:val="55AD148D"/>
     <w:multiLevelType w:val="multilevel"/>
     <w:tmpl w:val="1A58E454"/>
@@ -1028,7 +4308,7 @@
       </w:pPr>
     </w:lvl>
   </w:abstractNum>
-  <w:abstractNum w:abstractNumId="3" w15:restartNumberingAfterBreak="0">
+  <w:abstractNum w:abstractNumId="4" w15:restartNumberingAfterBreak="0">
     <w:nsid w:val="6F1672E3"/>
     <w:multiLevelType w:val="multilevel"/>
     <w:tmpl w:val="9CA61588"/>
@@ -1143,7 +4423,7 @@
       </w:pPr>
     </w:lvl>
   </w:abstractNum>
-  <w:abstractNum w:abstractNumId="4" w15:restartNumberingAfterBreak="0">
+  <w:abstractNum w:abstractNumId="5" w15:restartNumberingAfterBreak="0">
     <w:nsid w:val="74D60438"/>
     <w:multiLevelType w:val="multilevel"/>
     <w:tmpl w:val="DBA87A80"/>
@@ -1260,23 +4540,142 @@
       </w:rPr>
     </w:lvl>
   </w:abstractNum>
+  <w:abstractNum w:abstractNumId="6" w15:restartNumberingAfterBreak="0">
+    <w:nsid w:val="7A58622F"/>
+    <w:multiLevelType w:val="hybridMultilevel"/>
+    <w:tmpl w:val="E1E49104"/>
+    <w:lvl w:ilvl="0" w:tplc="04090001">
+      <w:start w:val="1"/>
+      <w:numFmt w:val="bullet"/>
+      <w:lvlText w:val=""/>
+      <w:lvlJc w:val="left"/>
+      <w:pPr>
+        <w:ind w:left="480" w:hanging="480"/>
+      </w:pPr>
+      <w:rPr>
+        <w:rFonts w:ascii="Wingdings" w:hAnsi="Wingdings" w:hint="default"/>
+      </w:rPr>
+    </w:lvl>
+    <w:lvl w:ilvl="1" w:tplc="04090003" w:tentative="1">
+      <w:start w:val="1"/>
+      <w:numFmt w:val="bullet"/>
+      <w:lvlText w:val=""/>
+      <w:lvlJc w:val="left"/>
+      <w:pPr>
+        <w:ind w:left="960" w:hanging="480"/>
+      </w:pPr>
+      <w:rPr>
+        <w:rFonts w:ascii="Wingdings" w:hAnsi="Wingdings" w:hint="default"/>
+      </w:rPr>
+    </w:lvl>
+    <w:lvl w:ilvl="2" w:tplc="04090005" w:tentative="1">
+      <w:start w:val="1"/>
+      <w:numFmt w:val="bullet"/>
+      <w:lvlText w:val=""/>
+      <w:lvlJc w:val="left"/>
+      <w:pPr>
+        <w:ind w:left="1440" w:hanging="480"/>
+      </w:pPr>
+      <w:rPr>
+        <w:rFonts w:ascii="Wingdings" w:hAnsi="Wingdings" w:hint="default"/>
+      </w:rPr>
+    </w:lvl>
+    <w:lvl w:ilvl="3" w:tplc="04090001" w:tentative="1">
+      <w:start w:val="1"/>
+      <w:numFmt w:val="bullet"/>
+      <w:lvlText w:val=""/>
+      <w:lvlJc w:val="left"/>
+      <w:pPr>
+        <w:ind w:left="1920" w:hanging="480"/>
+      </w:pPr>
+      <w:rPr>
+        <w:rFonts w:ascii="Wingdings" w:hAnsi="Wingdings" w:hint="default"/>
+      </w:rPr>
+    </w:lvl>
+    <w:lvl w:ilvl="4" w:tplc="04090003" w:tentative="1">
+      <w:start w:val="1"/>
+      <w:numFmt w:val="bullet"/>
+      <w:lvlText w:val=""/>
+      <w:lvlJc w:val="left"/>
+      <w:pPr>
+        <w:ind w:left="2400" w:hanging="480"/>
+      </w:pPr>
+      <w:rPr>
+        <w:rFonts w:ascii="Wingdings" w:hAnsi="Wingdings" w:hint="default"/>
+      </w:rPr>
+    </w:lvl>
+    <w:lvl w:ilvl="5" w:tplc="04090005" w:tentative="1">
+      <w:start w:val="1"/>
+      <w:numFmt w:val="bullet"/>
+      <w:lvlText w:val=""/>
+      <w:lvlJc w:val="left"/>
+      <w:pPr>
+        <w:ind w:left="2880" w:hanging="480"/>
+      </w:pPr>
+      <w:rPr>
+        <w:rFonts w:ascii="Wingdings" w:hAnsi="Wingdings" w:hint="default"/>
+      </w:rPr>
+    </w:lvl>
+    <w:lvl w:ilvl="6" w:tplc="04090001" w:tentative="1">
+      <w:start w:val="1"/>
+      <w:numFmt w:val="bullet"/>
+      <w:lvlText w:val=""/>
+      <w:lvlJc w:val="left"/>
+      <w:pPr>
+        <w:ind w:left="3360" w:hanging="480"/>
+      </w:pPr>
+      <w:rPr>
+        <w:rFonts w:ascii="Wingdings" w:hAnsi="Wingdings" w:hint="default"/>
+      </w:rPr>
+    </w:lvl>
+    <w:lvl w:ilvl="7" w:tplc="04090003" w:tentative="1">
+      <w:start w:val="1"/>
+      <w:numFmt w:val="bullet"/>
+      <w:lvlText w:val=""/>
+      <w:lvlJc w:val="left"/>
+      <w:pPr>
+        <w:ind w:left="3840" w:hanging="480"/>
+      </w:pPr>
+      <w:rPr>
+        <w:rFonts w:ascii="Wingdings" w:hAnsi="Wingdings" w:hint="default"/>
+      </w:rPr>
+    </w:lvl>
+    <w:lvl w:ilvl="8" w:tplc="04090005" w:tentative="1">
+      <w:start w:val="1"/>
+      <w:numFmt w:val="bullet"/>
+      <w:lvlText w:val=""/>
+      <w:lvlJc w:val="left"/>
+      <w:pPr>
+        <w:ind w:left="4320" w:hanging="480"/>
+      </w:pPr>
+      <w:rPr>
+        <w:rFonts w:ascii="Wingdings" w:hAnsi="Wingdings" w:hint="default"/>
+      </w:rPr>
+    </w:lvl>
+  </w:abstractNum>
   <w:num w:numId="1" w16cid:durableId="145979634">
-    <w:abstractNumId w:val="4"/>
+    <w:abstractNumId w:val="5"/>
   </w:num>
   <w:num w:numId="2" w16cid:durableId="1129398909">
-    <w:abstractNumId w:val="4"/>
+    <w:abstractNumId w:val="5"/>
   </w:num>
   <w:num w:numId="3" w16cid:durableId="796072010">
-    <w:abstractNumId w:val="4"/>
+    <w:abstractNumId w:val="5"/>
   </w:num>
   <w:num w:numId="4" w16cid:durableId="529151828">
-    <w:abstractNumId w:val="3"/>
+    <w:abstractNumId w:val="4"/>
   </w:num>
   <w:num w:numId="5" w16cid:durableId="645352174">
     <w:abstractNumId w:val="1"/>
   </w:num>
   <w:num w:numId="6" w16cid:durableId="69036617">
+    <w:abstractNumId w:val="3"/>
+  </w:num>
+  <w:num w:numId="7" w16cid:durableId="1829665125">
     <w:abstractNumId w:val="2"/>
+  </w:num>
+  <w:num w:numId="8" w16cid:durableId="1900700040">
+    <w:abstractNumId w:val="6"/>
   </w:num>
 </w:numbering>
 </file>
@@ -2229,6 +5628,25 @@
       <w:spacing w:val="5"/>
     </w:rPr>
   </w:style>
+  <w:style w:type="table" w:styleId="ae">
+    <w:name w:val="Table Grid"/>
+    <w:basedOn w:val="a1"/>
+    <w:uiPriority w:val="39"/>
+    <w:rsid w:val="00403BAE"/>
+    <w:pPr>
+      <w:spacing w:after="0" w:line="240" w:lineRule="auto"/>
+    </w:pPr>
+    <w:tblPr>
+      <w:tblBorders>
+        <w:top w:val="single" w:sz="4" w:space="0" w:color="auto"/>
+        <w:left w:val="single" w:sz="4" w:space="0" w:color="auto"/>
+        <w:bottom w:val="single" w:sz="4" w:space="0" w:color="auto"/>
+        <w:right w:val="single" w:sz="4" w:space="0" w:color="auto"/>
+        <w:insideH w:val="single" w:sz="4" w:space="0" w:color="auto"/>
+        <w:insideV w:val="single" w:sz="4" w:space="0" w:color="auto"/>
+      </w:tblBorders>
+    </w:tblPr>
+  </w:style>
 </w:styles>
 </file>
 

</xml_diff>

<commit_message>
Update the Word documentation.
</commit_message>
<xml_diff>
--- a/inst/extdata/ReadMe_Batch.docx
+++ b/inst/extdata/ReadMe_Batch.docx
@@ -30,7 +30,25 @@
         <w:t>Batch Analysis</w:t>
       </w:r>
       <w:r>
-        <w:t xml:space="preserve"> tab is a ZIP archive that contains the results of the water quality excursion and exceedance analysis based on magnitude, duration, and frequency, according to the criteria of a state or tribe.</w:t>
+        <w:t xml:space="preserve"> tab is a ZIP archive that contains the results of the water quality excursion and exceedance analysis based on magnitude, duration, and frequency, according to the criteria of a </w:t>
+      </w:r>
+      <w:r>
+        <w:rPr>
+          <w:rFonts w:hint="eastAsia"/>
+        </w:rPr>
+        <w:t>S</w:t>
+      </w:r>
+      <w:r>
+        <w:t xml:space="preserve">tate or </w:t>
+      </w:r>
+      <w:r>
+        <w:rPr>
+          <w:rFonts w:hint="eastAsia"/>
+        </w:rPr>
+        <w:t>T</w:t>
+      </w:r>
+      <w:r>
+        <w:t>ribe.</w:t>
       </w:r>
     </w:p>
     <w:p>
@@ -111,6 +129,15 @@
         <w:br/>
         <w:t>R Data file that stores the datasets and session information.</w:t>
       </w:r>
+      <w:r>
+        <w:rPr>
+          <w:rFonts w:hint="eastAsia"/>
+        </w:rPr>
+        <w:t xml:space="preserve"> </w:t>
+      </w:r>
+      <w:r>
+        <w:t>While the average user may not need or use this file, the information provided within the .rda file is helpful for the developer as they work to troubleshoot suspected issues with the R Shiny application.</w:t>
+      </w:r>
     </w:p>
     <w:p>
       <w:r>
@@ -126,6 +153,14 @@
           <w:bCs/>
         </w:rPr>
       </w:pPr>
+      <w:r>
+        <w:rPr>
+          <w:rFonts w:hint="eastAsia"/>
+          <w:b/>
+          <w:bCs/>
+        </w:rPr>
+        <w:t xml:space="preserve">Batch </w:t>
+      </w:r>
       <w:r>
         <w:rPr>
           <w:b/>
@@ -149,7 +184,25 @@
         <w:t>Filter the criteria table</w:t>
       </w:r>
       <w:r>
-        <w:t xml:space="preserve"> for the selected state/tribe. The table includes information on magnitude, duration, and frequency.</w:t>
+        <w:t xml:space="preserve"> for the selected </w:t>
+      </w:r>
+      <w:r>
+        <w:rPr>
+          <w:rFonts w:hint="eastAsia"/>
+        </w:rPr>
+        <w:t>S</w:t>
+      </w:r>
+      <w:r>
+        <w:t>tate</w:t>
+      </w:r>
+      <w:r>
+        <w:rPr>
+          <w:rFonts w:hint="eastAsia"/>
+        </w:rPr>
+        <w:t xml:space="preserve"> or T</w:t>
+      </w:r>
+      <w:r>
+        <w:t>ribe. The table includes information on magnitude, duration, and frequency.</w:t>
       </w:r>
     </w:p>
     <w:p>
@@ -203,7 +256,11 @@
         <w:t>Join the criteria table</w:t>
       </w:r>
       <w:r>
-        <w:t xml:space="preserve"> to the water quality dataset using the parameter name (TADA.CharacteristicName) and unit (TADA.ResultMeasure.MeasureUnitCode in the water quality dataset and MagnitudeUnit in the criteria table) as the primary join keys. Optionally, assessment use (ATTAINS.UseName) and fraction (TADA.ResultSampleFractionText) can be included as additional join keys.</w:t>
+        <w:t xml:space="preserve"> to the water quality dataset using the parameter name (TADA.CharacteristicName) and unit (TADA.ResultMeasure.MeasureUnitCode in the water quality dataset and </w:t>
+      </w:r>
+      <w:r>
+        <w:lastRenderedPageBreak/>
+        <w:t>MagnitudeUnit in the criteria table) as the primary join keys. Optionally, assessment use (ATTAINS.UseName) and fraction (TADA.ResultSampleFractionText) can be included as additional join keys.</w:t>
       </w:r>
     </w:p>
     <w:p>
@@ -218,11 +275,34 @@
           <w:b/>
           <w:bCs/>
         </w:rPr>
-        <w:lastRenderedPageBreak/>
         <w:t>Calculate excursions</w:t>
       </w:r>
       <w:r>
         <w:t xml:space="preserve"> for each water quality measurement record.</w:t>
+      </w:r>
+    </w:p>
+    <w:p>
+      <w:pPr>
+        <w:ind w:left="720"/>
+      </w:pPr>
+      <w:r>
+        <w:t>In this documentation, an excursion is any record (either an individual measurement or a duration-window summary value) whose value does not meet its magnitude criterion, i.e., it falls outside the acceptable range defined by the lower and/or upper thresholds.</w:t>
+      </w:r>
+    </w:p>
+    <w:p>
+      <w:pPr>
+        <w:ind w:left="720"/>
+      </w:pPr>
+      <w:r>
+        <w:t>For criteria without a duration component, excursions are individual measurements that do not meet the criterion.</w:t>
+      </w:r>
+    </w:p>
+    <w:p>
+      <w:pPr>
+        <w:ind w:left="720"/>
+      </w:pPr>
+      <w:r>
+        <w:t>For criteria with a duration component, excursions are duration-window summary values (e.g., 7-day mean, 30-day mean) that do not meet the criterion.</w:t>
       </w:r>
     </w:p>
     <w:p>
@@ -259,10 +339,18 @@
           <w:b/>
           <w:bCs/>
         </w:rPr>
-        <w:t>Summarize the excursion dataset.</w:t>
-      </w:r>
-      <w:r>
-        <w:t xml:space="preserve"> Aggregate excursion data by the selected analysis unit. Calculate sample counts, date ranges, and basic statistics. Determine excursion frequency and percentage.</w:t>
+        <w:t>Summarize the excursion dataset</w:t>
+      </w:r>
+      <w:r>
+        <w:rPr>
+          <w:rFonts w:hint="eastAsia"/>
+          <w:b/>
+          <w:bCs/>
+        </w:rPr>
+        <w:t xml:space="preserve"> </w:t>
+      </w:r>
+      <w:r>
+        <w:t>Aggregate excursion data by the selected analysis unit. Calculate sample counts, date ranges, and basic statistics. Determine excursion frequency and percentage.</w:t>
       </w:r>
     </w:p>
     <w:p>
@@ -277,7 +365,7 @@
           <w:b/>
           <w:bCs/>
         </w:rPr>
-        <w:t>Aggregate the time series.</w:t>
+        <w:t>Aggregate the time series</w:t>
       </w:r>
     </w:p>
     <w:p>
@@ -321,6 +409,7 @@
         </w:numPr>
       </w:pPr>
       <w:r>
+        <w:lastRenderedPageBreak/>
         <w:t>Aggregate the time series by the spatial unit (Monitoring Location ID or Assessment Unit). Apply the same aggregation to available covariates.</w:t>
       </w:r>
     </w:p>
@@ -372,7 +461,22 @@
         </w:numPr>
       </w:pPr>
       <w:r>
-        <w:t>Arithmetic mean/min/max</w:t>
+        <w:t>Arithmetic mean/min</w:t>
+      </w:r>
+      <w:r>
+        <w:rPr>
+          <w:rFonts w:hint="eastAsia"/>
+        </w:rPr>
+        <w:t>imum (min)</w:t>
+      </w:r>
+      <w:r>
+        <w:t>/max</w:t>
+      </w:r>
+      <w:r>
+        <w:rPr>
+          <w:rFonts w:hint="eastAsia"/>
+        </w:rPr>
+        <w:t>imum (max)</w:t>
       </w:r>
     </w:p>
     <w:p>
@@ -405,8 +509,13 @@
         </w:numPr>
       </w:pPr>
       <w:r>
-        <w:lastRenderedPageBreak/>
         <w:t>Arithmetic extremes</w:t>
+      </w:r>
+      <w:r>
+        <w:rPr>
+          <w:rFonts w:hint="eastAsia"/>
+        </w:rPr>
+        <w:t xml:space="preserve"> (minimum and maximum)</w:t>
       </w:r>
     </w:p>
     <w:p>
@@ -479,10 +588,43 @@
           <w:b/>
           <w:bCs/>
         </w:rPr>
-        <w:t>Number not meeting:</w:t>
-      </w:r>
-      <w:r>
-        <w:t xml:space="preserve"> Count excursions directly to determine exceedance.</w:t>
+        <w:t>Number not meeting</w:t>
+      </w:r>
+      <w:r>
+        <w:rPr>
+          <w:rFonts w:hint="eastAsia"/>
+          <w:b/>
+          <w:bCs/>
+        </w:rPr>
+        <w:t xml:space="preserve"> (</w:t>
+      </w:r>
+      <w:r>
+        <w:rPr>
+          <w:b/>
+          <w:bCs/>
+        </w:rPr>
+        <w:t>NumberNotMeeting</w:t>
+      </w:r>
+      <w:r>
+        <w:rPr>
+          <w:rFonts w:hint="eastAsia"/>
+          <w:b/>
+          <w:bCs/>
+        </w:rPr>
+        <w:t>)</w:t>
+      </w:r>
+      <w:r>
+        <w:rPr>
+          <w:b/>
+          <w:bCs/>
+        </w:rPr>
+        <w:t>:</w:t>
+      </w:r>
+      <w:r>
+        <w:t xml:space="preserve"> </w:t>
+      </w:r>
+      <w:r>
+        <w:t>Count excursions (measurement-level excursions and, where applicable, duration-window excursions) to determine exceedance.</w:t>
       </w:r>
     </w:p>
     <w:p>
@@ -494,13 +636,68 @@
       </w:pPr>
       <w:r>
         <w:rPr>
+          <w:rFonts w:hint="eastAsia"/>
           <w:b/>
           <w:bCs/>
         </w:rPr>
-        <w:t>Percent of samples not meeting:</w:t>
-      </w:r>
-      <w:r>
-        <w:t xml:space="preserve"> Calculate the percentage of samples that do not meet criteria.</w:t>
+        <w:t>N</w:t>
+      </w:r>
+      <w:r>
+        <w:rPr>
+          <w:b/>
+          <w:bCs/>
+        </w:rPr>
+        <w:t>-samples in 3 years</w:t>
+      </w:r>
+      <w:r>
+        <w:rPr>
+          <w:rFonts w:hint="eastAsia"/>
+          <w:b/>
+          <w:bCs/>
+        </w:rPr>
+        <w:t xml:space="preserve"> (</w:t>
+      </w:r>
+      <w:r>
+        <w:rPr>
+          <w:b/>
+          <w:bCs/>
+        </w:rPr>
+        <w:t>n-samples in 3 years</w:t>
+      </w:r>
+      <w:r>
+        <w:rPr>
+          <w:rFonts w:hint="eastAsia"/>
+          <w:b/>
+          <w:bCs/>
+        </w:rPr>
+        <w:t xml:space="preserve">): </w:t>
+      </w:r>
+      <w:r>
+        <w:t>Co</w:t>
+      </w:r>
+      <w:r>
+        <w:rPr>
+          <w:rFonts w:hint="eastAsia"/>
+        </w:rPr>
+        <w:t>unt</w:t>
+      </w:r>
+      <w:r>
+        <w:t xml:space="preserve"> the maximum number of excursions observed in any rolling 3-year period </w:t>
+      </w:r>
+      <w:r>
+        <w:rPr>
+          <w:rFonts w:hint="eastAsia"/>
+        </w:rPr>
+        <w:t>and c</w:t>
+      </w:r>
+      <w:r>
+        <w:t>lassify as Exceed if the maximum 3-year count is greater than</w:t>
+      </w:r>
+      <w:r>
+        <w:rPr>
+          <w:rFonts w:hint="eastAsia"/>
+        </w:rPr>
+        <w:t xml:space="preserve"> the allowed value.</w:t>
       </w:r>
     </w:p>
     <w:p>
@@ -515,6 +712,25 @@
           <w:b/>
           <w:bCs/>
         </w:rPr>
+        <w:t>Percent of samples not meeting:</w:t>
+      </w:r>
+      <w:r>
+        <w:t xml:space="preserve"> Calculate the percentage of samples that do not meet criteria.</w:t>
+      </w:r>
+    </w:p>
+    <w:p>
+      <w:pPr>
+        <w:numPr>
+          <w:ilvl w:val="1"/>
+          <w:numId w:val="6"/>
+        </w:numPr>
+      </w:pPr>
+      <w:r>
+        <w:rPr>
+          <w:b/>
+          <w:bCs/>
+        </w:rPr>
+        <w:lastRenderedPageBreak/>
         <w:t>Percentile method:</w:t>
       </w:r>
       <w:r>
@@ -538,6 +754,27 @@
       <w:r>
         <w:t xml:space="preserve"> and determine the Exceed/Not Exceed status of each spatial unit.</w:t>
       </w:r>
+      <w:r>
+        <w:rPr>
+          <w:rFonts w:hint="eastAsia"/>
+        </w:rPr>
+        <w:t xml:space="preserve"> </w:t>
+      </w:r>
+      <w:r>
+        <w:t>Exceedance is defined as cases where the frequency of excursions exceeds the specified frequency criterion</w:t>
+      </w:r>
+      <w:r>
+        <w:rPr>
+          <w:rFonts w:hint="eastAsia"/>
+        </w:rPr>
+        <w:t xml:space="preserve"> </w:t>
+      </w:r>
+      <w:r>
+        <w:t>(FreqValue and FreqMethod)</w:t>
+      </w:r>
+      <w:r>
+        <w:t xml:space="preserve"> for that spatial unit.</w:t>
+      </w:r>
     </w:p>
     <w:p>
       <w:pPr>
@@ -551,10 +788,45 @@
           <w:b/>
           <w:bCs/>
         </w:rPr>
-        <w:t>Combine results.</w:t>
-      </w:r>
-      <w:r>
-        <w:t xml:space="preserve"> Integrate the duration and frequency assessment summaries with the original excursion summary.</w:t>
+        <w:t>Combine results</w:t>
+      </w:r>
+      <w:r>
+        <w:rPr>
+          <w:rFonts w:hint="eastAsia"/>
+          <w:b/>
+          <w:bCs/>
+        </w:rPr>
+        <w:t xml:space="preserve"> </w:t>
+      </w:r>
+      <w:r>
+        <w:t>Integrate the duration and frequency assessment summaries with the original excursion summary.</w:t>
+      </w:r>
+    </w:p>
+    <w:p>
+      <w:pPr>
+        <w:ind w:left="360"/>
+        <w:rPr>
+          <w:b/>
+          <w:bCs/>
+        </w:rPr>
+      </w:pPr>
+      <w:r>
+        <w:rPr>
+          <w:rFonts w:hint="eastAsia"/>
+          <w:b/>
+          <w:bCs/>
+        </w:rPr>
+        <w:t>Notes:</w:t>
+      </w:r>
+      <w:r>
+        <w:rPr>
+          <w:b/>
+          <w:bCs/>
+        </w:rPr>
+        <w:br/>
+      </w:r>
+      <w:r>
+        <w:t>Currently, the tool is designed to analyze the duration and frequency methods described in Steps 8 and 10 above. Additional methods are planned for future updates.</w:t>
       </w:r>
     </w:p>
     <w:p>
@@ -877,8 +1149,359 @@
                 <w:sz w:val="20"/>
                 <w:szCs w:val="20"/>
               </w:rPr>
+              <w:t>ATTAINS.UseName</w:t>
+            </w:r>
+          </w:p>
+        </w:tc>
+        <w:tc>
+          <w:tcPr>
+            <w:tcW w:w="4752" w:type="dxa"/>
+            <w:noWrap/>
+            <w:hideMark/>
+          </w:tcPr>
+          <w:p>
+            <w:pPr>
+              <w:rPr>
+                <w:sz w:val="20"/>
+                <w:szCs w:val="20"/>
+              </w:rPr>
+            </w:pPr>
+            <w:r>
+              <w:rPr>
+                <w:sz w:val="20"/>
+                <w:szCs w:val="20"/>
+              </w:rPr>
+              <w:t>The ATTAINS use name of an assessment unit</w:t>
+            </w:r>
+          </w:p>
+        </w:tc>
+      </w:tr>
+      <w:tr>
+        <w:trPr>
+          <w:trHeight w:val="315"/>
+        </w:trPr>
+        <w:tc>
+          <w:tcPr>
+            <w:tcW w:w="3544" w:type="dxa"/>
+            <w:noWrap/>
+            <w:hideMark/>
+          </w:tcPr>
+          <w:p>
+            <w:pPr>
+              <w:rPr>
+                <w:sz w:val="20"/>
+                <w:szCs w:val="20"/>
+              </w:rPr>
+            </w:pPr>
+            <w:r>
+              <w:rPr>
+                <w:sz w:val="20"/>
+                <w:szCs w:val="20"/>
+              </w:rPr>
+              <w:t>AcuteChronic</w:t>
+            </w:r>
+          </w:p>
+        </w:tc>
+        <w:tc>
+          <w:tcPr>
+            <w:tcW w:w="4752" w:type="dxa"/>
+            <w:noWrap/>
+            <w:hideMark/>
+          </w:tcPr>
+          <w:p>
+            <w:pPr>
+              <w:rPr>
+                <w:sz w:val="20"/>
+                <w:szCs w:val="20"/>
+              </w:rPr>
+            </w:pPr>
+            <w:r>
+              <w:rPr>
+                <w:sz w:val="20"/>
+                <w:szCs w:val="20"/>
+              </w:rPr>
+              <w:t>Acute or chronic criteria category</w:t>
+            </w:r>
+          </w:p>
+        </w:tc>
+      </w:tr>
+      <w:tr>
+        <w:trPr>
+          <w:trHeight w:val="315"/>
+        </w:trPr>
+        <w:tc>
+          <w:tcPr>
+            <w:tcW w:w="3544" w:type="dxa"/>
+            <w:noWrap/>
+            <w:hideMark/>
+          </w:tcPr>
+          <w:p>
+            <w:pPr>
+              <w:rPr>
+                <w:sz w:val="20"/>
+                <w:szCs w:val="20"/>
+              </w:rPr>
+            </w:pPr>
+            <w:r>
+              <w:rPr>
+                <w:sz w:val="20"/>
+                <w:szCs w:val="20"/>
+              </w:rPr>
+              <w:t>UniqueSpatialCriteria</w:t>
+            </w:r>
+          </w:p>
+        </w:tc>
+        <w:tc>
+          <w:tcPr>
+            <w:tcW w:w="4752" w:type="dxa"/>
+            <w:noWrap/>
+            <w:hideMark/>
+          </w:tcPr>
+          <w:p>
+            <w:pPr>
+              <w:rPr>
+                <w:sz w:val="20"/>
+                <w:szCs w:val="20"/>
+              </w:rPr>
+            </w:pPr>
+            <w:r>
+              <w:rPr>
+                <w:sz w:val="20"/>
+                <w:szCs w:val="20"/>
+              </w:rPr>
+              <w:t>The unique spatial criteria information</w:t>
+            </w:r>
+          </w:p>
+        </w:tc>
+      </w:tr>
+      <w:tr>
+        <w:trPr>
+          <w:trHeight w:val="315"/>
+        </w:trPr>
+        <w:tc>
+          <w:tcPr>
+            <w:tcW w:w="3544" w:type="dxa"/>
+            <w:noWrap/>
+            <w:hideMark/>
+          </w:tcPr>
+          <w:p>
+            <w:pPr>
+              <w:rPr>
+                <w:sz w:val="20"/>
+                <w:szCs w:val="20"/>
+              </w:rPr>
+            </w:pPr>
+            <w:r>
+              <w:rPr>
+                <w:sz w:val="20"/>
+                <w:szCs w:val="20"/>
+              </w:rPr>
+              <w:t>Season</w:t>
+            </w:r>
+          </w:p>
+        </w:tc>
+        <w:tc>
+          <w:tcPr>
+            <w:tcW w:w="4752" w:type="dxa"/>
+            <w:noWrap/>
+            <w:hideMark/>
+          </w:tcPr>
+          <w:p>
+            <w:pPr>
+              <w:rPr>
+                <w:sz w:val="20"/>
+                <w:szCs w:val="20"/>
+              </w:rPr>
+            </w:pPr>
+            <w:r>
+              <w:rPr>
+                <w:sz w:val="20"/>
+                <w:szCs w:val="20"/>
+              </w:rPr>
+              <w:t>The season criteria information</w:t>
+            </w:r>
+          </w:p>
+        </w:tc>
+      </w:tr>
+      <w:tr>
+        <w:trPr>
+          <w:trHeight w:val="315"/>
+        </w:trPr>
+        <w:tc>
+          <w:tcPr>
+            <w:tcW w:w="3544" w:type="dxa"/>
+            <w:noWrap/>
+            <w:hideMark/>
+          </w:tcPr>
+          <w:p>
+            <w:pPr>
+              <w:rPr>
+                <w:sz w:val="20"/>
+                <w:szCs w:val="20"/>
+              </w:rPr>
+            </w:pPr>
+            <w:r>
+              <w:rPr>
+                <w:sz w:val="20"/>
+                <w:szCs w:val="20"/>
+              </w:rPr>
+              <w:t>EquationBased</w:t>
+            </w:r>
+          </w:p>
+        </w:tc>
+        <w:tc>
+          <w:tcPr>
+            <w:tcW w:w="4752" w:type="dxa"/>
+            <w:noWrap/>
+            <w:hideMark/>
+          </w:tcPr>
+          <w:p>
+            <w:pPr>
+              <w:rPr>
+                <w:sz w:val="20"/>
+                <w:szCs w:val="20"/>
+              </w:rPr>
+            </w:pPr>
+            <w:r>
+              <w:rPr>
+                <w:sz w:val="20"/>
+                <w:szCs w:val="20"/>
+              </w:rPr>
+              <w:t>Whether the criteria is based on an equation with covariates or is a fixed magnitude</w:t>
+            </w:r>
+          </w:p>
+        </w:tc>
+      </w:tr>
+      <w:tr>
+        <w:trPr>
+          <w:trHeight w:val="315"/>
+        </w:trPr>
+        <w:tc>
+          <w:tcPr>
+            <w:tcW w:w="3544" w:type="dxa"/>
+            <w:noWrap/>
+            <w:hideMark/>
+          </w:tcPr>
+          <w:p>
+            <w:pPr>
+              <w:rPr>
+                <w:sz w:val="20"/>
+                <w:szCs w:val="20"/>
+              </w:rPr>
+            </w:pPr>
+            <w:r>
+              <w:rPr>
+                <w:sz w:val="20"/>
+                <w:szCs w:val="20"/>
+              </w:rPr>
+              <w:t>EquationType</w:t>
+            </w:r>
+          </w:p>
+        </w:tc>
+        <w:tc>
+          <w:tcPr>
+            <w:tcW w:w="4752" w:type="dxa"/>
+            <w:noWrap/>
+            <w:hideMark/>
+          </w:tcPr>
+          <w:p>
+            <w:pPr>
+              <w:rPr>
+                <w:sz w:val="20"/>
+                <w:szCs w:val="20"/>
+              </w:rPr>
+            </w:pPr>
+            <w:r>
+              <w:rPr>
+                <w:sz w:val="20"/>
+                <w:szCs w:val="20"/>
+              </w:rPr>
+              <w:t xml:space="preserve">The type of the equation if the criteria is equation-based </w:t>
+            </w:r>
+          </w:p>
+        </w:tc>
+      </w:tr>
+      <w:tr>
+        <w:trPr>
+          <w:trHeight w:val="315"/>
+        </w:trPr>
+        <w:tc>
+          <w:tcPr>
+            <w:tcW w:w="3544" w:type="dxa"/>
+            <w:noWrap/>
+            <w:hideMark/>
+          </w:tcPr>
+          <w:p>
+            <w:pPr>
+              <w:rPr>
+                <w:sz w:val="20"/>
+                <w:szCs w:val="20"/>
+              </w:rPr>
+            </w:pPr>
+            <w:r>
+              <w:rPr>
+                <w:sz w:val="20"/>
+                <w:szCs w:val="20"/>
+              </w:rPr>
+              <w:t>TADA.CharacteristicName</w:t>
+            </w:r>
+          </w:p>
+        </w:tc>
+        <w:tc>
+          <w:tcPr>
+            <w:tcW w:w="4752" w:type="dxa"/>
+            <w:noWrap/>
+            <w:hideMark/>
+          </w:tcPr>
+          <w:p>
+            <w:pPr>
+              <w:rPr>
+                <w:sz w:val="20"/>
+                <w:szCs w:val="20"/>
+              </w:rPr>
+            </w:pPr>
+            <w:r>
+              <w:rPr>
+                <w:sz w:val="20"/>
+                <w:szCs w:val="20"/>
+              </w:rPr>
+              <w:t xml:space="preserve">The object, property, or substance which is evaluated or enumerated by either a direct field measurement, a direct field observation, or by </w:t>
+            </w:r>
+            <w:r>
+              <w:rPr>
+                <w:sz w:val="20"/>
+                <w:szCs w:val="20"/>
+              </w:rPr>
               <w:lastRenderedPageBreak/>
-              <w:t>ATTAINS.UseName</w:t>
+              <w:t>laboratory analysis of material collected in the field.  TADA-standardized variables are presented in uppercase and are the result of harmonization between USGS and WQX values, which may vary by case.</w:t>
+            </w:r>
+          </w:p>
+        </w:tc>
+      </w:tr>
+      <w:tr>
+        <w:trPr>
+          <w:trHeight w:val="315"/>
+        </w:trPr>
+        <w:tc>
+          <w:tcPr>
+            <w:tcW w:w="3544" w:type="dxa"/>
+            <w:noWrap/>
+            <w:hideMark/>
+          </w:tcPr>
+          <w:p>
+            <w:pPr>
+              <w:rPr>
+                <w:sz w:val="20"/>
+                <w:szCs w:val="20"/>
+              </w:rPr>
+            </w:pPr>
+            <w:r>
+              <w:rPr>
+                <w:sz w:val="20"/>
+                <w:szCs w:val="20"/>
+              </w:rPr>
+              <w:lastRenderedPageBreak/>
+              <w:t>TADA.ResultSampleFractionText</w:t>
             </w:r>
           </w:p>
         </w:tc>
@@ -900,7 +1523,7 @@
                 <w:sz w:val="20"/>
                 <w:szCs w:val="20"/>
               </w:rPr>
-              <w:t>The ATTAINS use name of an assessment unit</w:t>
+              <w:t>The text name of the portion of the sample associated with results obtained from a physically-partitioned sample (e.g., dissolved).  TADA-standardized variables are presented in uppercase and are the result of harmonization between USGS and WQX values, which may vary by case.</w:t>
             </w:r>
           </w:p>
         </w:tc>
@@ -927,7 +1550,7 @@
                 <w:sz w:val="20"/>
                 <w:szCs w:val="20"/>
               </w:rPr>
-              <w:t>AcuteChronic</w:t>
+              <w:t>TADA.MethodSpeciationName</w:t>
             </w:r>
           </w:p>
         </w:tc>
@@ -949,7 +1572,7 @@
                 <w:sz w:val="20"/>
                 <w:szCs w:val="20"/>
               </w:rPr>
-              <w:t>Acute or chronic criteria category</w:t>
+              <w:t>Identifies the chemical speciation in which the measured result is expressed. TADA-standardized variables are presented in uppercase and are the result of harmonization between USGS and WQX values, which may vary by case.</w:t>
             </w:r>
           </w:p>
         </w:tc>
@@ -976,7 +1599,7 @@
                 <w:sz w:val="20"/>
                 <w:szCs w:val="20"/>
               </w:rPr>
-              <w:t>UniqueSpatialCriteria</w:t>
+              <w:t>TADA.ResultMeasure.MeasureUnitCode</w:t>
             </w:r>
           </w:p>
         </w:tc>
@@ -998,7 +1621,7 @@
                 <w:sz w:val="20"/>
                 <w:szCs w:val="20"/>
               </w:rPr>
-              <w:t>The unique spatial criteria information</w:t>
+              <w:t>TADA-standardized version of ResultMeasure.MeasureUnitCode. The code describing the units of the reportable measure of the result for the chemical, microbiological or other characteristic being analyzed.</w:t>
             </w:r>
           </w:p>
         </w:tc>
@@ -1025,7 +1648,7 @@
                 <w:sz w:val="20"/>
                 <w:szCs w:val="20"/>
               </w:rPr>
-              <w:t>Season</w:t>
+              <w:t>DurationValue</w:t>
             </w:r>
           </w:p>
         </w:tc>
@@ -1047,7 +1670,7 @@
                 <w:sz w:val="20"/>
                 <w:szCs w:val="20"/>
               </w:rPr>
-              <w:t>The season criteria information</w:t>
+              <w:t>The duration value of the criteria</w:t>
             </w:r>
           </w:p>
         </w:tc>
@@ -1074,7 +1697,7 @@
                 <w:sz w:val="20"/>
                 <w:szCs w:val="20"/>
               </w:rPr>
-              <w:t>EquationBased</w:t>
+              <w:t>DurationUnit</w:t>
             </w:r>
           </w:p>
         </w:tc>
@@ -1096,7 +1719,7 @@
                 <w:sz w:val="20"/>
                 <w:szCs w:val="20"/>
               </w:rPr>
-              <w:t>Whether the criteria is based on an equation with covariates or is a fixed magnitude</w:t>
+              <w:t>The duration unit of the criteria</w:t>
             </w:r>
           </w:p>
         </w:tc>
@@ -1123,7 +1746,7 @@
                 <w:sz w:val="20"/>
                 <w:szCs w:val="20"/>
               </w:rPr>
-              <w:t>EquationType</w:t>
+              <w:t>DurationMethod</w:t>
             </w:r>
           </w:p>
         </w:tc>
@@ -1145,7 +1768,37 @@
                 <w:sz w:val="20"/>
                 <w:szCs w:val="20"/>
               </w:rPr>
-              <w:t xml:space="preserve">The type of the equation if the criteria is equation-based </w:t>
+              <w:t>The statisti</w:t>
+            </w:r>
+            <w:r>
+              <w:rPr>
+                <w:rFonts w:hint="eastAsia"/>
+                <w:sz w:val="20"/>
+                <w:szCs w:val="20"/>
+              </w:rPr>
+              <w:t>c</w:t>
+            </w:r>
+            <w:r>
+              <w:rPr>
+                <w:sz w:val="20"/>
+                <w:szCs w:val="20"/>
+              </w:rPr>
+              <w:t>al method used to summari</w:t>
+            </w:r>
+            <w:r>
+              <w:rPr>
+                <w:rFonts w:hint="eastAsia"/>
+                <w:sz w:val="20"/>
+                <w:szCs w:val="20"/>
+              </w:rPr>
+              <w:t>z</w:t>
+            </w:r>
+            <w:r>
+              <w:rPr>
+                <w:sz w:val="20"/>
+                <w:szCs w:val="20"/>
+              </w:rPr>
+              <w:t>ed the duration of the criteria</w:t>
             </w:r>
           </w:p>
         </w:tc>
@@ -1172,7 +1825,7 @@
                 <w:sz w:val="20"/>
                 <w:szCs w:val="20"/>
               </w:rPr>
-              <w:t>TADA.CharacteristicName</w:t>
+              <w:t>FreqValue</w:t>
             </w:r>
           </w:p>
         </w:tc>
@@ -1194,7 +1847,7 @@
                 <w:sz w:val="20"/>
                 <w:szCs w:val="20"/>
               </w:rPr>
-              <w:t>The object, property, or substance which is evaluated or enumerated by either a direct field measurement, a direct field observation, or by laboratory analysis of material collected in the field.  TADA-standardized variables are presented in uppercase and are the result of harmonization between USGS and WQX values, which may vary by case.</w:t>
+              <w:t>The frequency value of the criteria</w:t>
             </w:r>
           </w:p>
         </w:tc>
@@ -1221,7 +1874,7 @@
                 <w:sz w:val="20"/>
                 <w:szCs w:val="20"/>
               </w:rPr>
-              <w:t>TADA.ResultSampleFractionText</w:t>
+              <w:t>FreqMethod</w:t>
             </w:r>
           </w:p>
         </w:tc>
@@ -1243,7 +1896,7 @@
                 <w:sz w:val="20"/>
                 <w:szCs w:val="20"/>
               </w:rPr>
-              <w:t>The text name of the portion of the sample associated with results obtained from a physically-partitioned sample (e.g., dissolved).  TADA-standardized variables are presented in uppercase and are the result of harmonization between USGS and WQX values, which may vary by case.</w:t>
+              <w:t>The frequency method of the criteria</w:t>
             </w:r>
           </w:p>
         </w:tc>
@@ -1270,7 +1923,7 @@
                 <w:sz w:val="20"/>
                 <w:szCs w:val="20"/>
               </w:rPr>
-              <w:t>TADA.MethodSpeciationName</w:t>
+              <w:t>Value</w:t>
             </w:r>
           </w:p>
         </w:tc>
@@ -1292,7 +1945,7 @@
                 <w:sz w:val="20"/>
                 <w:szCs w:val="20"/>
               </w:rPr>
-              <w:t>Identifies the chemical speciation in which the measured result is expressed. TADA-standardized variables are presented in uppercase and are the result of harmonization between USGS and WQX values, which may vary by case.</w:t>
+              <w:t>The parameter measured value before the duration summary</w:t>
             </w:r>
           </w:p>
         </w:tc>
@@ -1319,7 +1972,7 @@
                 <w:sz w:val="20"/>
                 <w:szCs w:val="20"/>
               </w:rPr>
-              <w:t>TADA.ResultMeasure.MeasureUnitCode</w:t>
+              <w:t>Window_Start_win</w:t>
             </w:r>
           </w:p>
         </w:tc>
@@ -1341,7 +1994,7 @@
                 <w:sz w:val="20"/>
                 <w:szCs w:val="20"/>
               </w:rPr>
-              <w:t>TADA-standardized version of ResultMeasure.MeasureUnitCode. The code describing the units of the reportable measure of the result for the chemical, microbiological or other characteristic being analyzed.</w:t>
+              <w:t>The window start date and time</w:t>
             </w:r>
           </w:p>
         </w:tc>
@@ -1368,7 +2021,7 @@
                 <w:sz w:val="20"/>
                 <w:szCs w:val="20"/>
               </w:rPr>
-              <w:t>DurationValue</w:t>
+              <w:t>Window_End_win</w:t>
             </w:r>
           </w:p>
         </w:tc>
@@ -1390,7 +2043,7 @@
                 <w:sz w:val="20"/>
                 <w:szCs w:val="20"/>
               </w:rPr>
-              <w:t>The duration value of the criteria</w:t>
+              <w:t>The window end date and time</w:t>
             </w:r>
           </w:p>
         </w:tc>
@@ -1417,7 +2070,7 @@
                 <w:sz w:val="20"/>
                 <w:szCs w:val="20"/>
               </w:rPr>
-              <w:t>DurationUnit</w:t>
+              <w:t>N_in_Window</w:t>
             </w:r>
           </w:p>
         </w:tc>
@@ -1439,7 +2092,7 @@
                 <w:sz w:val="20"/>
                 <w:szCs w:val="20"/>
               </w:rPr>
-              <w:t>The duration unit of the criteria</w:t>
+              <w:t>Sample size in a duration window</w:t>
             </w:r>
           </w:p>
         </w:tc>
@@ -1466,7 +2119,7 @@
                 <w:sz w:val="20"/>
                 <w:szCs w:val="20"/>
               </w:rPr>
-              <w:t>DurationMethod</w:t>
+              <w:t>Result_Duration</w:t>
             </w:r>
           </w:p>
         </w:tc>
@@ -1488,7 +2141,7 @@
                 <w:sz w:val="20"/>
                 <w:szCs w:val="20"/>
               </w:rPr>
-              <w:t>The statistial method used to summaried the duration of the criteria</w:t>
+              <w:t>The summarized parameter value in the duration window</w:t>
             </w:r>
           </w:p>
         </w:tc>
@@ -1515,7 +2168,7 @@
                 <w:sz w:val="20"/>
                 <w:szCs w:val="20"/>
               </w:rPr>
-              <w:t>FreqValue</w:t>
+              <w:t>Value_win_min</w:t>
             </w:r>
           </w:p>
         </w:tc>
@@ -1537,7 +2190,7 @@
                 <w:sz w:val="20"/>
                 <w:szCs w:val="20"/>
               </w:rPr>
-              <w:t>The frequency value of the criteria</w:t>
+              <w:t>The minimum value in the duration window</w:t>
             </w:r>
           </w:p>
         </w:tc>
@@ -1564,7 +2217,7 @@
                 <w:sz w:val="20"/>
                 <w:szCs w:val="20"/>
               </w:rPr>
-              <w:t>FreqMethod</w:t>
+              <w:t>Value_win_max</w:t>
             </w:r>
           </w:p>
         </w:tc>
@@ -1586,7 +2239,7 @@
                 <w:sz w:val="20"/>
                 <w:szCs w:val="20"/>
               </w:rPr>
-              <w:t>The frequency method of the criteria</w:t>
+              <w:t>The maximum value in the duration window</w:t>
             </w:r>
           </w:p>
         </w:tc>
@@ -1613,399 +2266,56 @@
                 <w:sz w:val="20"/>
                 <w:szCs w:val="20"/>
               </w:rPr>
+              <w:t>Threshold_Lower_win</w:t>
+            </w:r>
+          </w:p>
+        </w:tc>
+        <w:tc>
+          <w:tcPr>
+            <w:tcW w:w="4752" w:type="dxa"/>
+            <w:noWrap/>
+            <w:hideMark/>
+          </w:tcPr>
+          <w:p>
+            <w:pPr>
+              <w:rPr>
+                <w:sz w:val="20"/>
+                <w:szCs w:val="20"/>
+              </w:rPr>
+            </w:pPr>
+            <w:r>
+              <w:rPr>
+                <w:sz w:val="20"/>
+                <w:szCs w:val="20"/>
+              </w:rPr>
+              <w:t>The lower threshold of the criteria in the duration window</w:t>
+            </w:r>
+          </w:p>
+        </w:tc>
+      </w:tr>
+      <w:tr>
+        <w:trPr>
+          <w:trHeight w:val="315"/>
+        </w:trPr>
+        <w:tc>
+          <w:tcPr>
+            <w:tcW w:w="3544" w:type="dxa"/>
+            <w:noWrap/>
+            <w:hideMark/>
+          </w:tcPr>
+          <w:p>
+            <w:pPr>
+              <w:rPr>
+                <w:sz w:val="20"/>
+                <w:szCs w:val="20"/>
+              </w:rPr>
+            </w:pPr>
+            <w:r>
+              <w:rPr>
+                <w:sz w:val="20"/>
+                <w:szCs w:val="20"/>
+              </w:rPr>
               <w:lastRenderedPageBreak/>
-              <w:t>Value</w:t>
-            </w:r>
-          </w:p>
-        </w:tc>
-        <w:tc>
-          <w:tcPr>
-            <w:tcW w:w="4752" w:type="dxa"/>
-            <w:noWrap/>
-            <w:hideMark/>
-          </w:tcPr>
-          <w:p>
-            <w:pPr>
-              <w:rPr>
-                <w:sz w:val="20"/>
-                <w:szCs w:val="20"/>
-              </w:rPr>
-            </w:pPr>
-            <w:r>
-              <w:rPr>
-                <w:sz w:val="20"/>
-                <w:szCs w:val="20"/>
-              </w:rPr>
-              <w:t>The parameter measured value before the duration summary</w:t>
-            </w:r>
-          </w:p>
-        </w:tc>
-      </w:tr>
-      <w:tr>
-        <w:trPr>
-          <w:trHeight w:val="315"/>
-        </w:trPr>
-        <w:tc>
-          <w:tcPr>
-            <w:tcW w:w="3544" w:type="dxa"/>
-            <w:noWrap/>
-            <w:hideMark/>
-          </w:tcPr>
-          <w:p>
-            <w:pPr>
-              <w:rPr>
-                <w:sz w:val="20"/>
-                <w:szCs w:val="20"/>
-              </w:rPr>
-            </w:pPr>
-            <w:r>
-              <w:rPr>
-                <w:sz w:val="20"/>
-                <w:szCs w:val="20"/>
-              </w:rPr>
-              <w:t>Window_Start_win</w:t>
-            </w:r>
-          </w:p>
-        </w:tc>
-        <w:tc>
-          <w:tcPr>
-            <w:tcW w:w="4752" w:type="dxa"/>
-            <w:noWrap/>
-            <w:hideMark/>
-          </w:tcPr>
-          <w:p>
-            <w:pPr>
-              <w:rPr>
-                <w:sz w:val="20"/>
-                <w:szCs w:val="20"/>
-              </w:rPr>
-            </w:pPr>
-            <w:r>
-              <w:rPr>
-                <w:sz w:val="20"/>
-                <w:szCs w:val="20"/>
-              </w:rPr>
-              <w:t>The window start date and time</w:t>
-            </w:r>
-          </w:p>
-        </w:tc>
-      </w:tr>
-      <w:tr>
-        <w:trPr>
-          <w:trHeight w:val="315"/>
-        </w:trPr>
-        <w:tc>
-          <w:tcPr>
-            <w:tcW w:w="3544" w:type="dxa"/>
-            <w:noWrap/>
-            <w:hideMark/>
-          </w:tcPr>
-          <w:p>
-            <w:pPr>
-              <w:rPr>
-                <w:sz w:val="20"/>
-                <w:szCs w:val="20"/>
-              </w:rPr>
-            </w:pPr>
-            <w:r>
-              <w:rPr>
-                <w:sz w:val="20"/>
-                <w:szCs w:val="20"/>
-              </w:rPr>
-              <w:t>Window_End_win</w:t>
-            </w:r>
-          </w:p>
-        </w:tc>
-        <w:tc>
-          <w:tcPr>
-            <w:tcW w:w="4752" w:type="dxa"/>
-            <w:noWrap/>
-            <w:hideMark/>
-          </w:tcPr>
-          <w:p>
-            <w:pPr>
-              <w:rPr>
-                <w:sz w:val="20"/>
-                <w:szCs w:val="20"/>
-              </w:rPr>
-            </w:pPr>
-            <w:r>
-              <w:rPr>
-                <w:sz w:val="20"/>
-                <w:szCs w:val="20"/>
-              </w:rPr>
-              <w:t>The window end date and time</w:t>
-            </w:r>
-          </w:p>
-        </w:tc>
-      </w:tr>
-      <w:tr>
-        <w:trPr>
-          <w:trHeight w:val="315"/>
-        </w:trPr>
-        <w:tc>
-          <w:tcPr>
-            <w:tcW w:w="3544" w:type="dxa"/>
-            <w:noWrap/>
-            <w:hideMark/>
-          </w:tcPr>
-          <w:p>
-            <w:pPr>
-              <w:rPr>
-                <w:sz w:val="20"/>
-                <w:szCs w:val="20"/>
-              </w:rPr>
-            </w:pPr>
-            <w:r>
-              <w:rPr>
-                <w:sz w:val="20"/>
-                <w:szCs w:val="20"/>
-              </w:rPr>
-              <w:t>N_in_Window</w:t>
-            </w:r>
-          </w:p>
-        </w:tc>
-        <w:tc>
-          <w:tcPr>
-            <w:tcW w:w="4752" w:type="dxa"/>
-            <w:noWrap/>
-            <w:hideMark/>
-          </w:tcPr>
-          <w:p>
-            <w:pPr>
-              <w:rPr>
-                <w:sz w:val="20"/>
-                <w:szCs w:val="20"/>
-              </w:rPr>
-            </w:pPr>
-            <w:r>
-              <w:rPr>
-                <w:sz w:val="20"/>
-                <w:szCs w:val="20"/>
-              </w:rPr>
-              <w:t>Sample size in a duration window</w:t>
-            </w:r>
-          </w:p>
-        </w:tc>
-      </w:tr>
-      <w:tr>
-        <w:trPr>
-          <w:trHeight w:val="315"/>
-        </w:trPr>
-        <w:tc>
-          <w:tcPr>
-            <w:tcW w:w="3544" w:type="dxa"/>
-            <w:noWrap/>
-            <w:hideMark/>
-          </w:tcPr>
-          <w:p>
-            <w:pPr>
-              <w:rPr>
-                <w:sz w:val="20"/>
-                <w:szCs w:val="20"/>
-              </w:rPr>
-            </w:pPr>
-            <w:r>
-              <w:rPr>
-                <w:sz w:val="20"/>
-                <w:szCs w:val="20"/>
-              </w:rPr>
-              <w:t>Result_Duration</w:t>
-            </w:r>
-          </w:p>
-        </w:tc>
-        <w:tc>
-          <w:tcPr>
-            <w:tcW w:w="4752" w:type="dxa"/>
-            <w:noWrap/>
-            <w:hideMark/>
-          </w:tcPr>
-          <w:p>
-            <w:pPr>
-              <w:rPr>
-                <w:sz w:val="20"/>
-                <w:szCs w:val="20"/>
-              </w:rPr>
-            </w:pPr>
-            <w:r>
-              <w:rPr>
-                <w:sz w:val="20"/>
-                <w:szCs w:val="20"/>
-              </w:rPr>
-              <w:t>The summarized parameter value in the duration window</w:t>
-            </w:r>
-          </w:p>
-        </w:tc>
-      </w:tr>
-      <w:tr>
-        <w:trPr>
-          <w:trHeight w:val="315"/>
-        </w:trPr>
-        <w:tc>
-          <w:tcPr>
-            <w:tcW w:w="3544" w:type="dxa"/>
-            <w:noWrap/>
-            <w:hideMark/>
-          </w:tcPr>
-          <w:p>
-            <w:pPr>
-              <w:rPr>
-                <w:sz w:val="20"/>
-                <w:szCs w:val="20"/>
-              </w:rPr>
-            </w:pPr>
-            <w:r>
-              <w:rPr>
-                <w:sz w:val="20"/>
-                <w:szCs w:val="20"/>
-              </w:rPr>
-              <w:t>Value_win_min</w:t>
-            </w:r>
-          </w:p>
-        </w:tc>
-        <w:tc>
-          <w:tcPr>
-            <w:tcW w:w="4752" w:type="dxa"/>
-            <w:noWrap/>
-            <w:hideMark/>
-          </w:tcPr>
-          <w:p>
-            <w:pPr>
-              <w:rPr>
-                <w:sz w:val="20"/>
-                <w:szCs w:val="20"/>
-              </w:rPr>
-            </w:pPr>
-            <w:r>
-              <w:rPr>
-                <w:sz w:val="20"/>
-                <w:szCs w:val="20"/>
-              </w:rPr>
-              <w:t>The minimum value in the duration window</w:t>
-            </w:r>
-          </w:p>
-        </w:tc>
-      </w:tr>
-      <w:tr>
-        <w:trPr>
-          <w:trHeight w:val="315"/>
-        </w:trPr>
-        <w:tc>
-          <w:tcPr>
-            <w:tcW w:w="3544" w:type="dxa"/>
-            <w:noWrap/>
-            <w:hideMark/>
-          </w:tcPr>
-          <w:p>
-            <w:pPr>
-              <w:rPr>
-                <w:sz w:val="20"/>
-                <w:szCs w:val="20"/>
-              </w:rPr>
-            </w:pPr>
-            <w:r>
-              <w:rPr>
-                <w:sz w:val="20"/>
-                <w:szCs w:val="20"/>
-              </w:rPr>
-              <w:t>Value_win_max</w:t>
-            </w:r>
-          </w:p>
-        </w:tc>
-        <w:tc>
-          <w:tcPr>
-            <w:tcW w:w="4752" w:type="dxa"/>
-            <w:noWrap/>
-            <w:hideMark/>
-          </w:tcPr>
-          <w:p>
-            <w:pPr>
-              <w:rPr>
-                <w:sz w:val="20"/>
-                <w:szCs w:val="20"/>
-              </w:rPr>
-            </w:pPr>
-            <w:r>
-              <w:rPr>
-                <w:sz w:val="20"/>
-                <w:szCs w:val="20"/>
-              </w:rPr>
-              <w:t>The maximum value in the duration window</w:t>
-            </w:r>
-          </w:p>
-        </w:tc>
-      </w:tr>
-      <w:tr>
-        <w:trPr>
-          <w:trHeight w:val="315"/>
-        </w:trPr>
-        <w:tc>
-          <w:tcPr>
-            <w:tcW w:w="3544" w:type="dxa"/>
-            <w:noWrap/>
-            <w:hideMark/>
-          </w:tcPr>
-          <w:p>
-            <w:pPr>
-              <w:rPr>
-                <w:sz w:val="20"/>
-                <w:szCs w:val="20"/>
-              </w:rPr>
-            </w:pPr>
-            <w:r>
-              <w:rPr>
-                <w:sz w:val="20"/>
-                <w:szCs w:val="20"/>
-              </w:rPr>
-              <w:t>Threshold_Lower_win</w:t>
-            </w:r>
-          </w:p>
-        </w:tc>
-        <w:tc>
-          <w:tcPr>
-            <w:tcW w:w="4752" w:type="dxa"/>
-            <w:noWrap/>
-            <w:hideMark/>
-          </w:tcPr>
-          <w:p>
-            <w:pPr>
-              <w:rPr>
-                <w:sz w:val="20"/>
-                <w:szCs w:val="20"/>
-              </w:rPr>
-            </w:pPr>
-            <w:r>
-              <w:rPr>
-                <w:sz w:val="20"/>
-                <w:szCs w:val="20"/>
-              </w:rPr>
-              <w:t>The lower threshold of the criteria in the duration window</w:t>
-            </w:r>
-          </w:p>
-        </w:tc>
-      </w:tr>
-      <w:tr>
-        <w:trPr>
-          <w:trHeight w:val="315"/>
-        </w:trPr>
-        <w:tc>
-          <w:tcPr>
-            <w:tcW w:w="3544" w:type="dxa"/>
-            <w:noWrap/>
-            <w:hideMark/>
-          </w:tcPr>
-          <w:p>
-            <w:pPr>
-              <w:rPr>
-                <w:sz w:val="20"/>
-                <w:szCs w:val="20"/>
-              </w:rPr>
-            </w:pPr>
-            <w:r>
-              <w:rPr>
-                <w:sz w:val="20"/>
-                <w:szCs w:val="20"/>
-              </w:rPr>
               <w:t>Threshold_Upper_win</w:t>
             </w:r>
           </w:p>
@@ -2467,7 +2777,21 @@
                 <w:sz w:val="22"/>
                 <w:szCs w:val="22"/>
               </w:rPr>
-              <w:t>TADA-standarized version of LongitudeMeasure. The measure of the angular distance on a meridian east or west of the prime meridian.</w:t>
+              <w:t>TADA-</w:t>
+            </w:r>
+            <w:r>
+              <w:rPr>
+                <w:sz w:val="22"/>
+                <w:szCs w:val="22"/>
+              </w:rPr>
+              <w:t>standardized</w:t>
+            </w:r>
+            <w:r>
+              <w:rPr>
+                <w:sz w:val="22"/>
+                <w:szCs w:val="22"/>
+              </w:rPr>
+              <w:t xml:space="preserve"> version of LongitudeMeasure. The measure of the angular distance on a meridian east or west of the prime meridian.</w:t>
             </w:r>
           </w:p>
         </w:tc>
@@ -2516,7 +2840,21 @@
                 <w:sz w:val="22"/>
                 <w:szCs w:val="22"/>
               </w:rPr>
-              <w:t>TADA-standarized version of LatitudeMeasure. The measure of the angular distance on a meridian north or south of the equator.</w:t>
+              <w:t>TADA-</w:t>
+            </w:r>
+            <w:r>
+              <w:rPr>
+                <w:sz w:val="22"/>
+                <w:szCs w:val="22"/>
+              </w:rPr>
+              <w:t>standardized</w:t>
+            </w:r>
+            <w:r>
+              <w:rPr>
+                <w:sz w:val="22"/>
+                <w:szCs w:val="22"/>
+              </w:rPr>
+              <w:t xml:space="preserve"> version of LatitudeMeasure. The measure of the angular distance on a meridian north or south of the equator.</w:t>
             </w:r>
           </w:p>
         </w:tc>
@@ -2543,8 +2881,457 @@
                 <w:sz w:val="22"/>
                 <w:szCs w:val="22"/>
               </w:rPr>
+              <w:t>JoinToAU.AssessmentUnitIdentifier</w:t>
+            </w:r>
+          </w:p>
+        </w:tc>
+        <w:tc>
+          <w:tcPr>
+            <w:tcW w:w="5324" w:type="dxa"/>
+            <w:noWrap/>
+            <w:hideMark/>
+          </w:tcPr>
+          <w:p>
+            <w:pPr>
+              <w:rPr>
+                <w:sz w:val="22"/>
+                <w:szCs w:val="22"/>
+              </w:rPr>
+            </w:pPr>
+            <w:r>
+              <w:rPr>
+                <w:sz w:val="22"/>
+                <w:szCs w:val="22"/>
+              </w:rPr>
+              <w:t>The assessment unit identifier</w:t>
+            </w:r>
+          </w:p>
+        </w:tc>
+      </w:tr>
+      <w:tr>
+        <w:trPr>
+          <w:trHeight w:val="323"/>
+        </w:trPr>
+        <w:tc>
+          <w:tcPr>
+            <w:tcW w:w="2972" w:type="dxa"/>
+            <w:noWrap/>
+            <w:hideMark/>
+          </w:tcPr>
+          <w:p>
+            <w:pPr>
+              <w:rPr>
+                <w:sz w:val="22"/>
+                <w:szCs w:val="22"/>
+              </w:rPr>
+            </w:pPr>
+            <w:r>
+              <w:rPr>
+                <w:sz w:val="22"/>
+                <w:szCs w:val="22"/>
+              </w:rPr>
+              <w:t>ATTAINS.OrganizationIdentifier</w:t>
+            </w:r>
+          </w:p>
+        </w:tc>
+        <w:tc>
+          <w:tcPr>
+            <w:tcW w:w="5324" w:type="dxa"/>
+            <w:noWrap/>
+            <w:hideMark/>
+          </w:tcPr>
+          <w:p>
+            <w:pPr>
+              <w:rPr>
+                <w:sz w:val="22"/>
+                <w:szCs w:val="22"/>
+              </w:rPr>
+            </w:pPr>
+            <w:r>
+              <w:rPr>
+                <w:sz w:val="22"/>
+                <w:szCs w:val="22"/>
+              </w:rPr>
+              <w:t>The ATTAINS organization identifier</w:t>
+            </w:r>
+          </w:p>
+        </w:tc>
+      </w:tr>
+      <w:tr>
+        <w:trPr>
+          <w:trHeight w:val="323"/>
+        </w:trPr>
+        <w:tc>
+          <w:tcPr>
+            <w:tcW w:w="2972" w:type="dxa"/>
+            <w:noWrap/>
+            <w:hideMark/>
+          </w:tcPr>
+          <w:p>
+            <w:pPr>
+              <w:rPr>
+                <w:sz w:val="22"/>
+                <w:szCs w:val="22"/>
+              </w:rPr>
+            </w:pPr>
+            <w:r>
+              <w:rPr>
+                <w:sz w:val="22"/>
+                <w:szCs w:val="22"/>
+              </w:rPr>
+              <w:t>ATTAINS.ParameterName</w:t>
+            </w:r>
+          </w:p>
+        </w:tc>
+        <w:tc>
+          <w:tcPr>
+            <w:tcW w:w="5324" w:type="dxa"/>
+            <w:noWrap/>
+            <w:hideMark/>
+          </w:tcPr>
+          <w:p>
+            <w:pPr>
+              <w:rPr>
+                <w:sz w:val="22"/>
+                <w:szCs w:val="22"/>
+              </w:rPr>
+            </w:pPr>
+            <w:r>
+              <w:rPr>
+                <w:sz w:val="22"/>
+                <w:szCs w:val="22"/>
+              </w:rPr>
+              <w:t>The ATTAINS parameter name</w:t>
+            </w:r>
+          </w:p>
+        </w:tc>
+      </w:tr>
+      <w:tr>
+        <w:trPr>
+          <w:trHeight w:val="323"/>
+        </w:trPr>
+        <w:tc>
+          <w:tcPr>
+            <w:tcW w:w="2972" w:type="dxa"/>
+            <w:noWrap/>
+            <w:hideMark/>
+          </w:tcPr>
+          <w:p>
+            <w:pPr>
+              <w:rPr>
+                <w:sz w:val="22"/>
+                <w:szCs w:val="22"/>
+              </w:rPr>
+            </w:pPr>
+            <w:r>
+              <w:rPr>
+                <w:sz w:val="22"/>
+                <w:szCs w:val="22"/>
+              </w:rPr>
+              <w:t>ATTAINS.UseName</w:t>
+            </w:r>
+          </w:p>
+        </w:tc>
+        <w:tc>
+          <w:tcPr>
+            <w:tcW w:w="5324" w:type="dxa"/>
+            <w:noWrap/>
+            <w:hideMark/>
+          </w:tcPr>
+          <w:p>
+            <w:pPr>
+              <w:rPr>
+                <w:sz w:val="22"/>
+                <w:szCs w:val="22"/>
+              </w:rPr>
+            </w:pPr>
+            <w:r>
+              <w:rPr>
+                <w:sz w:val="22"/>
+                <w:szCs w:val="22"/>
+              </w:rPr>
+              <w:t>The ATTAINS use name of an assessment unit</w:t>
+            </w:r>
+          </w:p>
+        </w:tc>
+      </w:tr>
+      <w:tr>
+        <w:trPr>
+          <w:trHeight w:val="323"/>
+        </w:trPr>
+        <w:tc>
+          <w:tcPr>
+            <w:tcW w:w="2972" w:type="dxa"/>
+            <w:noWrap/>
+            <w:hideMark/>
+          </w:tcPr>
+          <w:p>
+            <w:pPr>
+              <w:rPr>
+                <w:sz w:val="22"/>
+                <w:szCs w:val="22"/>
+              </w:rPr>
+            </w:pPr>
+            <w:r>
+              <w:rPr>
+                <w:sz w:val="22"/>
+                <w:szCs w:val="22"/>
+              </w:rPr>
+              <w:t>AcuteChronic</w:t>
+            </w:r>
+          </w:p>
+        </w:tc>
+        <w:tc>
+          <w:tcPr>
+            <w:tcW w:w="5324" w:type="dxa"/>
+            <w:noWrap/>
+            <w:hideMark/>
+          </w:tcPr>
+          <w:p>
+            <w:pPr>
+              <w:rPr>
+                <w:sz w:val="22"/>
+                <w:szCs w:val="22"/>
+              </w:rPr>
+            </w:pPr>
+            <w:r>
+              <w:rPr>
+                <w:sz w:val="22"/>
+                <w:szCs w:val="22"/>
+              </w:rPr>
+              <w:t>Acute or chronic criteria category</w:t>
+            </w:r>
+          </w:p>
+        </w:tc>
+      </w:tr>
+      <w:tr>
+        <w:trPr>
+          <w:trHeight w:val="323"/>
+        </w:trPr>
+        <w:tc>
+          <w:tcPr>
+            <w:tcW w:w="2972" w:type="dxa"/>
+            <w:noWrap/>
+            <w:hideMark/>
+          </w:tcPr>
+          <w:p>
+            <w:pPr>
+              <w:rPr>
+                <w:sz w:val="22"/>
+                <w:szCs w:val="22"/>
+              </w:rPr>
+            </w:pPr>
+            <w:r>
+              <w:rPr>
+                <w:sz w:val="22"/>
+                <w:szCs w:val="22"/>
+              </w:rPr>
+              <w:t>UniqueSpatialCriteria</w:t>
+            </w:r>
+          </w:p>
+        </w:tc>
+        <w:tc>
+          <w:tcPr>
+            <w:tcW w:w="5324" w:type="dxa"/>
+            <w:noWrap/>
+            <w:hideMark/>
+          </w:tcPr>
+          <w:p>
+            <w:pPr>
+              <w:rPr>
+                <w:sz w:val="22"/>
+                <w:szCs w:val="22"/>
+              </w:rPr>
+            </w:pPr>
+            <w:r>
+              <w:rPr>
+                <w:sz w:val="22"/>
+                <w:szCs w:val="22"/>
+              </w:rPr>
+              <w:t>The unique spatial criteria information</w:t>
+            </w:r>
+          </w:p>
+        </w:tc>
+      </w:tr>
+      <w:tr>
+        <w:trPr>
+          <w:trHeight w:val="323"/>
+        </w:trPr>
+        <w:tc>
+          <w:tcPr>
+            <w:tcW w:w="2972" w:type="dxa"/>
+            <w:noWrap/>
+            <w:hideMark/>
+          </w:tcPr>
+          <w:p>
+            <w:pPr>
+              <w:rPr>
+                <w:sz w:val="22"/>
+                <w:szCs w:val="22"/>
+              </w:rPr>
+            </w:pPr>
+            <w:r>
+              <w:rPr>
+                <w:sz w:val="22"/>
+                <w:szCs w:val="22"/>
+              </w:rPr>
+              <w:t>Season</w:t>
+            </w:r>
+          </w:p>
+        </w:tc>
+        <w:tc>
+          <w:tcPr>
+            <w:tcW w:w="5324" w:type="dxa"/>
+            <w:noWrap/>
+            <w:hideMark/>
+          </w:tcPr>
+          <w:p>
+            <w:pPr>
+              <w:rPr>
+                <w:sz w:val="22"/>
+                <w:szCs w:val="22"/>
+              </w:rPr>
+            </w:pPr>
+            <w:r>
+              <w:rPr>
+                <w:sz w:val="22"/>
+                <w:szCs w:val="22"/>
+              </w:rPr>
+              <w:t>The season criteria information</w:t>
+            </w:r>
+          </w:p>
+        </w:tc>
+      </w:tr>
+      <w:tr>
+        <w:trPr>
+          <w:trHeight w:val="323"/>
+        </w:trPr>
+        <w:tc>
+          <w:tcPr>
+            <w:tcW w:w="2972" w:type="dxa"/>
+            <w:noWrap/>
+            <w:hideMark/>
+          </w:tcPr>
+          <w:p>
+            <w:pPr>
+              <w:rPr>
+                <w:sz w:val="22"/>
+                <w:szCs w:val="22"/>
+              </w:rPr>
+            </w:pPr>
+            <w:r>
+              <w:rPr>
+                <w:sz w:val="22"/>
+                <w:szCs w:val="22"/>
+              </w:rPr>
+              <w:t>EquationBased</w:t>
+            </w:r>
+          </w:p>
+        </w:tc>
+        <w:tc>
+          <w:tcPr>
+            <w:tcW w:w="5324" w:type="dxa"/>
+            <w:noWrap/>
+            <w:hideMark/>
+          </w:tcPr>
+          <w:p>
+            <w:pPr>
+              <w:rPr>
+                <w:sz w:val="22"/>
+                <w:szCs w:val="22"/>
+              </w:rPr>
+            </w:pPr>
+            <w:r>
+              <w:rPr>
+                <w:sz w:val="22"/>
+                <w:szCs w:val="22"/>
+              </w:rPr>
+              <w:t>Whether the criteria is based on an equation with covariates or is a fixed magnitude</w:t>
+            </w:r>
+          </w:p>
+        </w:tc>
+      </w:tr>
+      <w:tr>
+        <w:trPr>
+          <w:trHeight w:val="323"/>
+        </w:trPr>
+        <w:tc>
+          <w:tcPr>
+            <w:tcW w:w="2972" w:type="dxa"/>
+            <w:noWrap/>
+            <w:hideMark/>
+          </w:tcPr>
+          <w:p>
+            <w:pPr>
+              <w:rPr>
+                <w:sz w:val="22"/>
+                <w:szCs w:val="22"/>
+              </w:rPr>
+            </w:pPr>
+            <w:r>
+              <w:rPr>
+                <w:sz w:val="22"/>
+                <w:szCs w:val="22"/>
+              </w:rPr>
+              <w:t>EquationType</w:t>
+            </w:r>
+          </w:p>
+        </w:tc>
+        <w:tc>
+          <w:tcPr>
+            <w:tcW w:w="5324" w:type="dxa"/>
+            <w:noWrap/>
+            <w:hideMark/>
+          </w:tcPr>
+          <w:p>
+            <w:pPr>
+              <w:rPr>
+                <w:sz w:val="22"/>
+                <w:szCs w:val="22"/>
+              </w:rPr>
+            </w:pPr>
+            <w:r>
+              <w:rPr>
+                <w:sz w:val="22"/>
+                <w:szCs w:val="22"/>
+              </w:rPr>
+              <w:t xml:space="preserve">The type of the equation if the criteria is </w:t>
+            </w:r>
+            <w:r>
+              <w:rPr>
+                <w:sz w:val="22"/>
+                <w:szCs w:val="22"/>
+              </w:rPr>
               <w:lastRenderedPageBreak/>
-              <w:t>JoinToAU.AssessmentUnitIdentifier</w:t>
+              <w:t xml:space="preserve">equation-based </w:t>
+            </w:r>
+          </w:p>
+        </w:tc>
+      </w:tr>
+      <w:tr>
+        <w:trPr>
+          <w:trHeight w:val="323"/>
+        </w:trPr>
+        <w:tc>
+          <w:tcPr>
+            <w:tcW w:w="2972" w:type="dxa"/>
+            <w:noWrap/>
+            <w:hideMark/>
+          </w:tcPr>
+          <w:p>
+            <w:pPr>
+              <w:rPr>
+                <w:sz w:val="22"/>
+                <w:szCs w:val="22"/>
+              </w:rPr>
+            </w:pPr>
+            <w:r>
+              <w:rPr>
+                <w:sz w:val="22"/>
+                <w:szCs w:val="22"/>
+              </w:rPr>
+              <w:lastRenderedPageBreak/>
+              <w:t>TADA.CharacteristicName</w:t>
             </w:r>
           </w:p>
         </w:tc>
@@ -2566,7 +3353,7 @@
                 <w:sz w:val="22"/>
                 <w:szCs w:val="22"/>
               </w:rPr>
-              <w:t>The assessment unit identifier</w:t>
+              <w:t>The object, property, or substance which is evaluated or enumerated by either a direct field measurement, a direct field observation, or by laboratory analysis of material collected in the field.  TADA-standardized variables are presented in uppercase and are the result of harmonization between USGS and WQX values, which may vary by case.</w:t>
             </w:r>
           </w:p>
         </w:tc>
@@ -2593,7 +3380,7 @@
                 <w:sz w:val="22"/>
                 <w:szCs w:val="22"/>
               </w:rPr>
-              <w:t>ATTAINS.OrganizationIdentifier</w:t>
+              <w:t>TADA.ResultSampleFractionText</w:t>
             </w:r>
           </w:p>
         </w:tc>
@@ -2615,7 +3402,7 @@
                 <w:sz w:val="22"/>
                 <w:szCs w:val="22"/>
               </w:rPr>
-              <w:t>The ATTAINS organization identifier</w:t>
+              <w:t>The text name of the portion of the sample associated with results obtained from a physically-partitioned sample (e.g., dissolved).  TADA-standardized variables are presented in uppercase and are the result of harmonization between USGS and WQX values, which may vary by case.</w:t>
             </w:r>
           </w:p>
         </w:tc>
@@ -2642,7 +3429,7 @@
                 <w:sz w:val="22"/>
                 <w:szCs w:val="22"/>
               </w:rPr>
-              <w:t>ATTAINS.ParameterName</w:t>
+              <w:t>TADA.MethodSpeciationName</w:t>
             </w:r>
           </w:p>
         </w:tc>
@@ -2664,7 +3451,7 @@
                 <w:sz w:val="22"/>
                 <w:szCs w:val="22"/>
               </w:rPr>
-              <w:t>The ATTAINS parameter name</w:t>
+              <w:t>Identifies the chemical speciation in which the measured result is expressed. TADA-standardized variables are presented in uppercase and are the result of harmonization between USGS and WQX values, which may vary by case.</w:t>
             </w:r>
           </w:p>
         </w:tc>
@@ -2691,7 +3478,7 @@
                 <w:sz w:val="22"/>
                 <w:szCs w:val="22"/>
               </w:rPr>
-              <w:t>ATTAINS.UseName</w:t>
+              <w:t>TADA.ResultMeasure.MeasureUnitCode</w:t>
             </w:r>
           </w:p>
         </w:tc>
@@ -2713,7 +3500,7 @@
                 <w:sz w:val="22"/>
                 <w:szCs w:val="22"/>
               </w:rPr>
-              <w:t>The ATTAINS use name of an assessment unit</w:t>
+              <w:t>TADA-standardized version of ResultMeasure.MeasureUnitCode. The code describing the units of the reportable measure of the result for the chemical, microbiological or other characteristic being analyzed.</w:t>
             </w:r>
           </w:p>
         </w:tc>
@@ -2740,7 +3527,7 @@
                 <w:sz w:val="22"/>
                 <w:szCs w:val="22"/>
               </w:rPr>
-              <w:t>AcuteChronic</w:t>
+              <w:t>Sample_Count</w:t>
             </w:r>
           </w:p>
         </w:tc>
@@ -2762,7 +3549,7 @@
                 <w:sz w:val="22"/>
                 <w:szCs w:val="22"/>
               </w:rPr>
-              <w:t>Acute or chronic criteria category</w:t>
+              <w:t>Sample size in a site</w:t>
             </w:r>
           </w:p>
         </w:tc>
@@ -2789,7 +3576,7 @@
                 <w:sz w:val="22"/>
                 <w:szCs w:val="22"/>
               </w:rPr>
-              <w:t>UniqueSpatialCriteria</w:t>
+              <w:t>Start_Date</w:t>
             </w:r>
           </w:p>
         </w:tc>
@@ -2811,7 +3598,22 @@
                 <w:sz w:val="22"/>
                 <w:szCs w:val="22"/>
               </w:rPr>
-              <w:t>The unique spatial criteria information</w:t>
+              <w:t>The sta</w:t>
+            </w:r>
+            <w:r>
+              <w:rPr>
+                <w:rFonts w:hint="eastAsia"/>
+                <w:sz w:val="22"/>
+                <w:szCs w:val="22"/>
+              </w:rPr>
+              <w:t>rt</w:t>
+            </w:r>
+            <w:r>
+              <w:rPr>
+                <w:sz w:val="22"/>
+                <w:szCs w:val="22"/>
+              </w:rPr>
+              <w:t xml:space="preserve"> date of the samples in a site</w:t>
             </w:r>
           </w:p>
         </w:tc>
@@ -2838,7 +3640,7 @@
                 <w:sz w:val="22"/>
                 <w:szCs w:val="22"/>
               </w:rPr>
-              <w:t>Season</w:t>
+              <w:t>End_Date</w:t>
             </w:r>
           </w:p>
         </w:tc>
@@ -2860,7 +3662,7 @@
                 <w:sz w:val="22"/>
                 <w:szCs w:val="22"/>
               </w:rPr>
-              <w:t>The season criteria information</w:t>
+              <w:t>The end date of the samples in a site</w:t>
             </w:r>
           </w:p>
         </w:tc>
@@ -2887,7 +3689,7 @@
                 <w:sz w:val="22"/>
                 <w:szCs w:val="22"/>
               </w:rPr>
-              <w:t>EquationBased</w:t>
+              <w:t>Minimum</w:t>
             </w:r>
           </w:p>
         </w:tc>
@@ -2909,7 +3711,7 @@
                 <w:sz w:val="22"/>
                 <w:szCs w:val="22"/>
               </w:rPr>
-              <w:t>Whether the criteria is based on an equation with covariates or is a fixed magnitude</w:t>
+              <w:t>The minimum value in a site</w:t>
             </w:r>
           </w:p>
         </w:tc>
@@ -2936,7 +3738,7 @@
                 <w:sz w:val="22"/>
                 <w:szCs w:val="22"/>
               </w:rPr>
-              <w:t>EquationType</w:t>
+              <w:t>Median</w:t>
             </w:r>
           </w:p>
         </w:tc>
@@ -2958,7 +3760,7 @@
                 <w:sz w:val="22"/>
                 <w:szCs w:val="22"/>
               </w:rPr>
-              <w:t xml:space="preserve">The type of the equation if the criteria is equation-based </w:t>
+              <w:t>The median value in a site</w:t>
             </w:r>
           </w:p>
         </w:tc>
@@ -2985,7 +3787,7 @@
                 <w:sz w:val="22"/>
                 <w:szCs w:val="22"/>
               </w:rPr>
-              <w:t>TADA.CharacteristicName</w:t>
+              <w:t>Maximum</w:t>
             </w:r>
           </w:p>
         </w:tc>
@@ -3007,7 +3809,7 @@
                 <w:sz w:val="22"/>
                 <w:szCs w:val="22"/>
               </w:rPr>
-              <w:t>The object, property, or substance which is evaluated or enumerated by either a direct field measurement, a direct field observation, or by laboratory analysis of material collected in the field.  TADA-standardized variables are presented in uppercase and are the result of harmonization between USGS and WQX values, which may vary by case.</w:t>
+              <w:t>The maximum in a site</w:t>
             </w:r>
           </w:p>
         </w:tc>
@@ -3034,7 +3836,7 @@
                 <w:sz w:val="22"/>
                 <w:szCs w:val="22"/>
               </w:rPr>
-              <w:t>TADA.ResultSampleFractionText</w:t>
+              <w:t>Number_of_Excursions</w:t>
             </w:r>
           </w:p>
         </w:tc>
@@ -3056,7 +3858,7 @@
                 <w:sz w:val="22"/>
                 <w:szCs w:val="22"/>
               </w:rPr>
-              <w:t>The text name of the portion of the sample associated with results obtained from a physically-partitioned sample (e.g., dissolved).  TADA-standardized variables are presented in uppercase and are the result of harmonization between USGS and WQX values, which may vary by case.</w:t>
+              <w:t>The number of excursions in a site</w:t>
             </w:r>
           </w:p>
         </w:tc>
@@ -3083,7 +3885,7 @@
                 <w:sz w:val="22"/>
                 <w:szCs w:val="22"/>
               </w:rPr>
-              <w:t>TADA.MethodSpeciationName</w:t>
+              <w:t>Excursion_Percentage</w:t>
             </w:r>
           </w:p>
         </w:tc>
@@ -3105,7 +3907,7 @@
                 <w:sz w:val="22"/>
                 <w:szCs w:val="22"/>
               </w:rPr>
-              <w:t>Identifies the chemical speciation in which the measured result is expressed. TADA-standardized variables are presented in uppercase and are the result of harmonization between USGS and WQX values, which may vary by case.</w:t>
+              <w:t>The percentage of excursion in a site</w:t>
             </w:r>
           </w:p>
         </w:tc>
@@ -3132,7 +3934,7 @@
                 <w:sz w:val="22"/>
                 <w:szCs w:val="22"/>
               </w:rPr>
-              <w:t>TADA.ResultMeasure.MeasureUnitCode</w:t>
+              <w:t>Duration_Excursions</w:t>
             </w:r>
           </w:p>
         </w:tc>
@@ -3154,7 +3956,7 @@
                 <w:sz w:val="22"/>
                 <w:szCs w:val="22"/>
               </w:rPr>
-              <w:t>TADA-standardized version of ResultMeasure.MeasureUnitCode. The code describing the units of the reportable measure of the result for the chemical, microbiological or other characteristic being analyzed.</w:t>
+              <w:t>The number of excursions based on the duration method in a site</w:t>
             </w:r>
           </w:p>
         </w:tc>
@@ -3181,7 +3983,7 @@
                 <w:sz w:val="22"/>
                 <w:szCs w:val="22"/>
               </w:rPr>
-              <w:t>Sample_Count</w:t>
+              <w:t>Duration_Percentage</w:t>
             </w:r>
           </w:p>
         </w:tc>
@@ -3203,7 +4005,15 @@
                 <w:sz w:val="22"/>
                 <w:szCs w:val="22"/>
               </w:rPr>
-              <w:t>Sample size in a site</w:t>
+              <w:t xml:space="preserve">The percentage of excursions based on the </w:t>
+            </w:r>
+            <w:r>
+              <w:rPr>
+                <w:sz w:val="22"/>
+                <w:szCs w:val="22"/>
+              </w:rPr>
+              <w:lastRenderedPageBreak/>
+              <w:t>duration method in a site</w:t>
             </w:r>
           </w:p>
         </w:tc>
@@ -3231,447 +4041,6 @@
                 <w:szCs w:val="22"/>
               </w:rPr>
               <w:lastRenderedPageBreak/>
-              <w:t>Start_Date</w:t>
-            </w:r>
-          </w:p>
-        </w:tc>
-        <w:tc>
-          <w:tcPr>
-            <w:tcW w:w="5324" w:type="dxa"/>
-            <w:noWrap/>
-            <w:hideMark/>
-          </w:tcPr>
-          <w:p>
-            <w:pPr>
-              <w:rPr>
-                <w:sz w:val="22"/>
-                <w:szCs w:val="22"/>
-              </w:rPr>
-            </w:pPr>
-            <w:r>
-              <w:rPr>
-                <w:sz w:val="22"/>
-                <w:szCs w:val="22"/>
-              </w:rPr>
-              <w:t>The state date of the samples in a site</w:t>
-            </w:r>
-          </w:p>
-        </w:tc>
-      </w:tr>
-      <w:tr>
-        <w:trPr>
-          <w:trHeight w:val="323"/>
-        </w:trPr>
-        <w:tc>
-          <w:tcPr>
-            <w:tcW w:w="2972" w:type="dxa"/>
-            <w:noWrap/>
-            <w:hideMark/>
-          </w:tcPr>
-          <w:p>
-            <w:pPr>
-              <w:rPr>
-                <w:sz w:val="22"/>
-                <w:szCs w:val="22"/>
-              </w:rPr>
-            </w:pPr>
-            <w:r>
-              <w:rPr>
-                <w:sz w:val="22"/>
-                <w:szCs w:val="22"/>
-              </w:rPr>
-              <w:t>End_Date</w:t>
-            </w:r>
-          </w:p>
-        </w:tc>
-        <w:tc>
-          <w:tcPr>
-            <w:tcW w:w="5324" w:type="dxa"/>
-            <w:noWrap/>
-            <w:hideMark/>
-          </w:tcPr>
-          <w:p>
-            <w:pPr>
-              <w:rPr>
-                <w:sz w:val="22"/>
-                <w:szCs w:val="22"/>
-              </w:rPr>
-            </w:pPr>
-            <w:r>
-              <w:rPr>
-                <w:sz w:val="22"/>
-                <w:szCs w:val="22"/>
-              </w:rPr>
-              <w:t>The end date of the samples in a site</w:t>
-            </w:r>
-          </w:p>
-        </w:tc>
-      </w:tr>
-      <w:tr>
-        <w:trPr>
-          <w:trHeight w:val="323"/>
-        </w:trPr>
-        <w:tc>
-          <w:tcPr>
-            <w:tcW w:w="2972" w:type="dxa"/>
-            <w:noWrap/>
-            <w:hideMark/>
-          </w:tcPr>
-          <w:p>
-            <w:pPr>
-              <w:rPr>
-                <w:sz w:val="22"/>
-                <w:szCs w:val="22"/>
-              </w:rPr>
-            </w:pPr>
-            <w:r>
-              <w:rPr>
-                <w:sz w:val="22"/>
-                <w:szCs w:val="22"/>
-              </w:rPr>
-              <w:t>Minimum</w:t>
-            </w:r>
-          </w:p>
-        </w:tc>
-        <w:tc>
-          <w:tcPr>
-            <w:tcW w:w="5324" w:type="dxa"/>
-            <w:noWrap/>
-            <w:hideMark/>
-          </w:tcPr>
-          <w:p>
-            <w:pPr>
-              <w:rPr>
-                <w:sz w:val="22"/>
-                <w:szCs w:val="22"/>
-              </w:rPr>
-            </w:pPr>
-            <w:r>
-              <w:rPr>
-                <w:sz w:val="22"/>
-                <w:szCs w:val="22"/>
-              </w:rPr>
-              <w:t>The minimum value in a site</w:t>
-            </w:r>
-          </w:p>
-        </w:tc>
-      </w:tr>
-      <w:tr>
-        <w:trPr>
-          <w:trHeight w:val="323"/>
-        </w:trPr>
-        <w:tc>
-          <w:tcPr>
-            <w:tcW w:w="2972" w:type="dxa"/>
-            <w:noWrap/>
-            <w:hideMark/>
-          </w:tcPr>
-          <w:p>
-            <w:pPr>
-              <w:rPr>
-                <w:sz w:val="22"/>
-                <w:szCs w:val="22"/>
-              </w:rPr>
-            </w:pPr>
-            <w:r>
-              <w:rPr>
-                <w:sz w:val="22"/>
-                <w:szCs w:val="22"/>
-              </w:rPr>
-              <w:t>Median</w:t>
-            </w:r>
-          </w:p>
-        </w:tc>
-        <w:tc>
-          <w:tcPr>
-            <w:tcW w:w="5324" w:type="dxa"/>
-            <w:noWrap/>
-            <w:hideMark/>
-          </w:tcPr>
-          <w:p>
-            <w:pPr>
-              <w:rPr>
-                <w:sz w:val="22"/>
-                <w:szCs w:val="22"/>
-              </w:rPr>
-            </w:pPr>
-            <w:r>
-              <w:rPr>
-                <w:sz w:val="22"/>
-                <w:szCs w:val="22"/>
-              </w:rPr>
-              <w:t>The median value in a site</w:t>
-            </w:r>
-          </w:p>
-        </w:tc>
-      </w:tr>
-      <w:tr>
-        <w:trPr>
-          <w:trHeight w:val="323"/>
-        </w:trPr>
-        <w:tc>
-          <w:tcPr>
-            <w:tcW w:w="2972" w:type="dxa"/>
-            <w:noWrap/>
-            <w:hideMark/>
-          </w:tcPr>
-          <w:p>
-            <w:pPr>
-              <w:rPr>
-                <w:sz w:val="22"/>
-                <w:szCs w:val="22"/>
-              </w:rPr>
-            </w:pPr>
-            <w:r>
-              <w:rPr>
-                <w:sz w:val="22"/>
-                <w:szCs w:val="22"/>
-              </w:rPr>
-              <w:t>Maximum</w:t>
-            </w:r>
-          </w:p>
-        </w:tc>
-        <w:tc>
-          <w:tcPr>
-            <w:tcW w:w="5324" w:type="dxa"/>
-            <w:noWrap/>
-            <w:hideMark/>
-          </w:tcPr>
-          <w:p>
-            <w:pPr>
-              <w:rPr>
-                <w:sz w:val="22"/>
-                <w:szCs w:val="22"/>
-              </w:rPr>
-            </w:pPr>
-            <w:r>
-              <w:rPr>
-                <w:sz w:val="22"/>
-                <w:szCs w:val="22"/>
-              </w:rPr>
-              <w:t>The maximum in a site</w:t>
-            </w:r>
-          </w:p>
-        </w:tc>
-      </w:tr>
-      <w:tr>
-        <w:trPr>
-          <w:trHeight w:val="323"/>
-        </w:trPr>
-        <w:tc>
-          <w:tcPr>
-            <w:tcW w:w="2972" w:type="dxa"/>
-            <w:noWrap/>
-            <w:hideMark/>
-          </w:tcPr>
-          <w:p>
-            <w:pPr>
-              <w:rPr>
-                <w:sz w:val="22"/>
-                <w:szCs w:val="22"/>
-              </w:rPr>
-            </w:pPr>
-            <w:r>
-              <w:rPr>
-                <w:sz w:val="22"/>
-                <w:szCs w:val="22"/>
-              </w:rPr>
-              <w:t>Number_of_Excursions</w:t>
-            </w:r>
-          </w:p>
-        </w:tc>
-        <w:tc>
-          <w:tcPr>
-            <w:tcW w:w="5324" w:type="dxa"/>
-            <w:noWrap/>
-            <w:hideMark/>
-          </w:tcPr>
-          <w:p>
-            <w:pPr>
-              <w:rPr>
-                <w:sz w:val="22"/>
-                <w:szCs w:val="22"/>
-              </w:rPr>
-            </w:pPr>
-            <w:r>
-              <w:rPr>
-                <w:sz w:val="22"/>
-                <w:szCs w:val="22"/>
-              </w:rPr>
-              <w:t>The number of excursions in a site</w:t>
-            </w:r>
-          </w:p>
-        </w:tc>
-      </w:tr>
-      <w:tr>
-        <w:trPr>
-          <w:trHeight w:val="323"/>
-        </w:trPr>
-        <w:tc>
-          <w:tcPr>
-            <w:tcW w:w="2972" w:type="dxa"/>
-            <w:noWrap/>
-            <w:hideMark/>
-          </w:tcPr>
-          <w:p>
-            <w:pPr>
-              <w:rPr>
-                <w:sz w:val="22"/>
-                <w:szCs w:val="22"/>
-              </w:rPr>
-            </w:pPr>
-            <w:r>
-              <w:rPr>
-                <w:sz w:val="22"/>
-                <w:szCs w:val="22"/>
-              </w:rPr>
-              <w:t>Excursion_Percentage</w:t>
-            </w:r>
-          </w:p>
-        </w:tc>
-        <w:tc>
-          <w:tcPr>
-            <w:tcW w:w="5324" w:type="dxa"/>
-            <w:noWrap/>
-            <w:hideMark/>
-          </w:tcPr>
-          <w:p>
-            <w:pPr>
-              <w:rPr>
-                <w:sz w:val="22"/>
-                <w:szCs w:val="22"/>
-              </w:rPr>
-            </w:pPr>
-            <w:r>
-              <w:rPr>
-                <w:sz w:val="22"/>
-                <w:szCs w:val="22"/>
-              </w:rPr>
-              <w:t>The percentage of excursion in a site</w:t>
-            </w:r>
-          </w:p>
-        </w:tc>
-      </w:tr>
-      <w:tr>
-        <w:trPr>
-          <w:trHeight w:val="323"/>
-        </w:trPr>
-        <w:tc>
-          <w:tcPr>
-            <w:tcW w:w="2972" w:type="dxa"/>
-            <w:noWrap/>
-            <w:hideMark/>
-          </w:tcPr>
-          <w:p>
-            <w:pPr>
-              <w:rPr>
-                <w:sz w:val="22"/>
-                <w:szCs w:val="22"/>
-              </w:rPr>
-            </w:pPr>
-            <w:r>
-              <w:rPr>
-                <w:sz w:val="22"/>
-                <w:szCs w:val="22"/>
-              </w:rPr>
-              <w:t>Duration_Excursions</w:t>
-            </w:r>
-          </w:p>
-        </w:tc>
-        <w:tc>
-          <w:tcPr>
-            <w:tcW w:w="5324" w:type="dxa"/>
-            <w:noWrap/>
-            <w:hideMark/>
-          </w:tcPr>
-          <w:p>
-            <w:pPr>
-              <w:rPr>
-                <w:sz w:val="22"/>
-                <w:szCs w:val="22"/>
-              </w:rPr>
-            </w:pPr>
-            <w:r>
-              <w:rPr>
-                <w:sz w:val="22"/>
-                <w:szCs w:val="22"/>
-              </w:rPr>
-              <w:t>The number of excursions based on the duration method in a site</w:t>
-            </w:r>
-          </w:p>
-        </w:tc>
-      </w:tr>
-      <w:tr>
-        <w:trPr>
-          <w:trHeight w:val="323"/>
-        </w:trPr>
-        <w:tc>
-          <w:tcPr>
-            <w:tcW w:w="2972" w:type="dxa"/>
-            <w:noWrap/>
-            <w:hideMark/>
-          </w:tcPr>
-          <w:p>
-            <w:pPr>
-              <w:rPr>
-                <w:sz w:val="22"/>
-                <w:szCs w:val="22"/>
-              </w:rPr>
-            </w:pPr>
-            <w:r>
-              <w:rPr>
-                <w:sz w:val="22"/>
-                <w:szCs w:val="22"/>
-              </w:rPr>
-              <w:t>Duration_Percentage</w:t>
-            </w:r>
-          </w:p>
-        </w:tc>
-        <w:tc>
-          <w:tcPr>
-            <w:tcW w:w="5324" w:type="dxa"/>
-            <w:noWrap/>
-            <w:hideMark/>
-          </w:tcPr>
-          <w:p>
-            <w:pPr>
-              <w:rPr>
-                <w:sz w:val="22"/>
-                <w:szCs w:val="22"/>
-              </w:rPr>
-            </w:pPr>
-            <w:r>
-              <w:rPr>
-                <w:sz w:val="22"/>
-                <w:szCs w:val="22"/>
-              </w:rPr>
-              <w:t>The percentage of excursions based on the duration method in a site</w:t>
-            </w:r>
-          </w:p>
-        </w:tc>
-      </w:tr>
-      <w:tr>
-        <w:trPr>
-          <w:trHeight w:val="323"/>
-        </w:trPr>
-        <w:tc>
-          <w:tcPr>
-            <w:tcW w:w="2972" w:type="dxa"/>
-            <w:noWrap/>
-            <w:hideMark/>
-          </w:tcPr>
-          <w:p>
-            <w:pPr>
-              <w:rPr>
-                <w:sz w:val="22"/>
-                <w:szCs w:val="22"/>
-              </w:rPr>
-            </w:pPr>
-            <w:r>
-              <w:rPr>
-                <w:sz w:val="22"/>
-                <w:szCs w:val="22"/>
-              </w:rPr>
               <w:t>Exceedance</w:t>
             </w:r>
           </w:p>
@@ -3850,11 +4219,42 @@
     <w:p>
       <w:pPr>
         <w:rPr>
-          <w:rFonts w:hint="eastAsia"/>
           <w:b/>
           <w:bCs/>
         </w:rPr>
       </w:pPr>
+    </w:p>
+    <w:p>
+      <w:r>
+        <w:rPr>
+          <w:rFonts w:hint="eastAsia"/>
+        </w:rPr>
+        <w:t xml:space="preserve">This file was last updated </w:t>
+      </w:r>
+      <w:r>
+        <w:rPr>
+          <w:rFonts w:hint="eastAsia"/>
+        </w:rPr>
+        <w:t>o</w:t>
+      </w:r>
+      <w:r>
+        <w:rPr>
+          <w:rFonts w:hint="eastAsia"/>
+        </w:rPr>
+        <w:t>n 2025-11-</w:t>
+      </w:r>
+      <w:r>
+        <w:rPr>
+          <w:rFonts w:hint="eastAsia"/>
+        </w:rPr>
+        <w:t>20</w:t>
+      </w:r>
+      <w:r>
+        <w:rPr>
+          <w:rFonts w:hint="eastAsia"/>
+        </w:rPr>
+        <w:t>.</w:t>
+      </w:r>
     </w:p>
     <w:sectPr>
       <w:pgSz w:w="11906" w:h="16838"/>
@@ -5306,6 +5706,7 @@
   <w:style w:type="character" w:default="1" w:styleId="a0">
     <w:name w:val="Default Paragraph Font"/>
     <w:uiPriority w:val="1"/>
+    <w:semiHidden/>
     <w:unhideWhenUsed/>
   </w:style>
   <w:style w:type="table" w:default="1" w:styleId="a1">
@@ -5943,4 +6344,16 @@
     </a:ext>
   </a:extLst>
 </a:theme>
+</file>
+
+<file path=customXml/item1.xml><?xml version="1.0" encoding="utf-8"?>
+<b:Sources xmlns:b="http://schemas.openxmlformats.org/officeDocument/2006/bibliography" xmlns="http://schemas.openxmlformats.org/officeDocument/2006/bibliography" SelectedStyle="\APASixthEditionOfficeOnline.xsl" StyleName="APA" Version="6"/>
+</file>
+
+<file path=customXml/itemProps1.xml><?xml version="1.0" encoding="utf-8"?>
+<ds:datastoreItem xmlns:ds="http://schemas.openxmlformats.org/officeDocument/2006/customXml" ds:itemID="{7EC932A7-A901-445A-B5DC-00AADE56E3F1}">
+  <ds:schemaRefs>
+    <ds:schemaRef ds:uri="http://schemas.openxmlformats.org/officeDocument/2006/bibliography"/>
+  </ds:schemaRefs>
+</ds:datastoreItem>
 </file>
</xml_diff>

<commit_message>
Update introduction texts. Add disclaimer. Fix Option B selection list
</commit_message>
<xml_diff>
--- a/inst/extdata/ReadMe_Batch.docx
+++ b/inst/extdata/ReadMe_Batch.docx
@@ -1002,7 +1002,7 @@
                 <w:sz w:val="20"/>
                 <w:szCs w:val="20"/>
               </w:rPr>
-              <w:t>JoinToAU.AssessmentUnitIdentifier</w:t>
+              <w:t>ATTAINS.AssessmentUnitIdentifier</w:t>
             </w:r>
           </w:p>
         </w:tc>
@@ -2881,7 +2881,7 @@
                 <w:sz w:val="22"/>
                 <w:szCs w:val="22"/>
               </w:rPr>
-              <w:t>JoinToAU.AssessmentUnitIdentifier</w:t>
+              <w:t>ATTAINS.AssessmentUnitIdentifier</w:t>
             </w:r>
           </w:p>
         </w:tc>
@@ -4241,13 +4241,37 @@
         <w:rPr>
           <w:rFonts w:hint="eastAsia"/>
         </w:rPr>
-        <w:t>n 2025-11-</w:t>
+        <w:t>n 202</w:t>
       </w:r>
       <w:r>
         <w:rPr>
           <w:rFonts w:hint="eastAsia"/>
         </w:rPr>
-        <w:t>20</w:t>
+        <w:t>6</w:t>
+      </w:r>
+      <w:r>
+        <w:rPr>
+          <w:rFonts w:hint="eastAsia"/>
+        </w:rPr>
+        <w:t>-</w:t>
+      </w:r>
+      <w:r>
+        <w:rPr>
+          <w:rFonts w:hint="eastAsia"/>
+        </w:rPr>
+        <w:t>01</w:t>
+      </w:r>
+      <w:r>
+        <w:rPr>
+          <w:rFonts w:hint="eastAsia"/>
+        </w:rPr>
+        <w:t>-</w:t>
+      </w:r>
+      <w:r>
+        <w:rPr>
+          <w:rFonts w:hint="eastAsia"/>
+        </w:rPr>
+        <w:t>15</w:t>
       </w:r>
       <w:r>
         <w:rPr>

</xml_diff>